<commit_message>
Started work on the Read thread.
</commit_message>
<xml_diff>
--- a/Design & Documents/Design Document.docx
+++ b/Design & Documents/Design Document.docx
@@ -34,8 +34,13 @@
       <w:bookmarkStart w:id="0" w:name="_Toc400292400"/>
       <w:bookmarkStart w:id="1" w:name="_Toc400706064"/>
       <w:bookmarkStart w:id="2" w:name="_Toc402038350"/>
-      <w:r>
-        <w:t>Christofer Klassen – A00879060 – Set 3O</w:t>
+      <w:proofErr w:type="spellStart"/>
+      <w:r>
+        <w:t>Christofer</w:t>
+      </w:r>
+      <w:proofErr w:type="spellEnd"/>
+      <w:r>
+        <w:t xml:space="preserve"> Klassen – A00879060 – Set 3O</w:t>
       </w:r>
       <w:bookmarkEnd w:id="0"/>
       <w:bookmarkEnd w:id="1"/>
@@ -50,11 +55,16 @@
       <w:bookmarkStart w:id="4" w:name="_Toc400706065"/>
       <w:bookmarkStart w:id="5" w:name="_Toc402038351"/>
       <w:r>
-        <w:t>Jeff Bayn</w:t>
+        <w:t xml:space="preserve">Jeff </w:t>
+      </w:r>
+      <w:proofErr w:type="spellStart"/>
+      <w:r>
+        <w:t>Bayn</w:t>
       </w:r>
       <w:r>
         <w:t>tun</w:t>
       </w:r>
+      <w:proofErr w:type="spellEnd"/>
       <w:r>
         <w:t xml:space="preserve"> – </w:t>
       </w:r>
@@ -682,35 +692,85 @@
         <w:rPr>
           <w:rFonts w:ascii="Courier New" w:hAnsi="Courier New" w:cs="Courier New"/>
         </w:rPr>
-        <w:t>Function setupComm() {</w:t>
-      </w:r>
-    </w:p>
-    <w:p>
-      <w:pPr>
-        <w:rPr>
-          <w:rFonts w:ascii="Courier New" w:hAnsi="Courier New" w:cs="Courier New"/>
-        </w:rPr>
-      </w:pPr>
-      <w:r>
-        <w:rPr>
-          <w:rFonts w:ascii="Courier New" w:hAnsi="Courier New" w:cs="Courier New"/>
-        </w:rPr>
-        <w:tab/>
-        <w:t>Open the Comm Port with pre-defined settings</w:t>
-      </w:r>
-    </w:p>
-    <w:p>
-      <w:pPr>
-        <w:rPr>
-          <w:rFonts w:ascii="Courier New" w:hAnsi="Courier New" w:cs="Courier New"/>
-        </w:rPr>
-      </w:pPr>
-      <w:r>
-        <w:rPr>
-          <w:rFonts w:ascii="Courier New" w:hAnsi="Courier New" w:cs="Courier New"/>
-        </w:rPr>
-        <w:tab/>
-        <w:t>If Comm Port is not open</w:t>
+        <w:t xml:space="preserve">Function </w:t>
+      </w:r>
+      <w:proofErr w:type="spellStart"/>
+      <w:proofErr w:type="gramStart"/>
+      <w:r>
+        <w:rPr>
+          <w:rFonts w:ascii="Courier New" w:hAnsi="Courier New" w:cs="Courier New"/>
+        </w:rPr>
+        <w:t>setupComm</w:t>
+      </w:r>
+      <w:proofErr w:type="spellEnd"/>
+      <w:r>
+        <w:rPr>
+          <w:rFonts w:ascii="Courier New" w:hAnsi="Courier New" w:cs="Courier New"/>
+        </w:rPr>
+        <w:t>(</w:t>
+      </w:r>
+      <w:proofErr w:type="gramEnd"/>
+      <w:r>
+        <w:rPr>
+          <w:rFonts w:ascii="Courier New" w:hAnsi="Courier New" w:cs="Courier New"/>
+        </w:rPr>
+        <w:t>) {</w:t>
+      </w:r>
+    </w:p>
+    <w:p>
+      <w:pPr>
+        <w:rPr>
+          <w:rFonts w:ascii="Courier New" w:hAnsi="Courier New" w:cs="Courier New"/>
+        </w:rPr>
+      </w:pPr>
+      <w:r>
+        <w:rPr>
+          <w:rFonts w:ascii="Courier New" w:hAnsi="Courier New" w:cs="Courier New"/>
+        </w:rPr>
+        <w:tab/>
+        <w:t xml:space="preserve">Open the </w:t>
+      </w:r>
+      <w:proofErr w:type="spellStart"/>
+      <w:r>
+        <w:rPr>
+          <w:rFonts w:ascii="Courier New" w:hAnsi="Courier New" w:cs="Courier New"/>
+        </w:rPr>
+        <w:t>Comm</w:t>
+      </w:r>
+      <w:proofErr w:type="spellEnd"/>
+      <w:r>
+        <w:rPr>
+          <w:rFonts w:ascii="Courier New" w:hAnsi="Courier New" w:cs="Courier New"/>
+        </w:rPr>
+        <w:t xml:space="preserve"> Port with pre-defined settings</w:t>
+      </w:r>
+    </w:p>
+    <w:p>
+      <w:pPr>
+        <w:rPr>
+          <w:rFonts w:ascii="Courier New" w:hAnsi="Courier New" w:cs="Courier New"/>
+        </w:rPr>
+      </w:pPr>
+      <w:r>
+        <w:rPr>
+          <w:rFonts w:ascii="Courier New" w:hAnsi="Courier New" w:cs="Courier New"/>
+        </w:rPr>
+        <w:tab/>
+        <w:t xml:space="preserve">If </w:t>
+      </w:r>
+      <w:proofErr w:type="spellStart"/>
+      <w:r>
+        <w:rPr>
+          <w:rFonts w:ascii="Courier New" w:hAnsi="Courier New" w:cs="Courier New"/>
+        </w:rPr>
+        <w:t>Comm</w:t>
+      </w:r>
+      <w:proofErr w:type="spellEnd"/>
+      <w:r>
+        <w:rPr>
+          <w:rFonts w:ascii="Courier New" w:hAnsi="Courier New" w:cs="Courier New"/>
+        </w:rPr>
+        <w:t xml:space="preserve"> Port is not open</w:t>
       </w:r>
     </w:p>
     <w:p>
@@ -818,7 +878,21 @@
         <w:rPr>
           <w:rFonts w:ascii="Courier New" w:hAnsi="Courier New" w:cs="Courier New"/>
         </w:rPr>
-        <w:t>Function idle() {</w:t>
+        <w:t xml:space="preserve">Function </w:t>
+      </w:r>
+      <w:proofErr w:type="gramStart"/>
+      <w:r>
+        <w:rPr>
+          <w:rFonts w:ascii="Courier New" w:hAnsi="Courier New" w:cs="Courier New"/>
+        </w:rPr>
+        <w:t>idle(</w:t>
+      </w:r>
+      <w:proofErr w:type="gramEnd"/>
+      <w:r>
+        <w:rPr>
+          <w:rFonts w:ascii="Courier New" w:hAnsi="Courier New" w:cs="Courier New"/>
+        </w:rPr>
+        <w:t>) {</w:t>
       </w:r>
     </w:p>
     <w:p>
@@ -904,7 +978,21 @@
           <w:rFonts w:ascii="Courier New" w:hAnsi="Courier New" w:cs="Courier New"/>
         </w:rPr>
         <w:tab/>
-        <w:t>If buffer &gt; 0 and resetTimer = 0</w:t>
+        <w:t xml:space="preserve">If buffer &gt; 0 and </w:t>
+      </w:r>
+      <w:proofErr w:type="spellStart"/>
+      <w:r>
+        <w:rPr>
+          <w:rFonts w:ascii="Courier New" w:hAnsi="Courier New" w:cs="Courier New"/>
+        </w:rPr>
+        <w:t>resetTimer</w:t>
+      </w:r>
+      <w:proofErr w:type="spellEnd"/>
+      <w:r>
+        <w:rPr>
+          <w:rFonts w:ascii="Courier New" w:hAnsi="Courier New" w:cs="Courier New"/>
+        </w:rPr>
+        <w:t xml:space="preserve"> = 0</w:t>
       </w:r>
     </w:p>
     <w:p>
@@ -969,44 +1057,75 @@
         </w:rPr>
         <w:tab/>
       </w:r>
-      <w:r>
-        <w:rPr>
-          <w:rFonts w:ascii="Courier New" w:hAnsi="Courier New" w:cs="Courier New"/>
-        </w:rPr>
-        <w:t>sendControlCharacter( ENQ )</w:t>
-      </w:r>
-    </w:p>
-    <w:p>
-      <w:pPr>
-        <w:rPr>
-          <w:rFonts w:ascii="Courier New" w:hAnsi="Courier New" w:cs="Courier New"/>
-        </w:rPr>
-      </w:pPr>
-      <w:r>
-        <w:rPr>
-          <w:rFonts w:ascii="Courier New" w:hAnsi="Courier New" w:cs="Courier New"/>
-        </w:rPr>
-        <w:tab/>
-      </w:r>
-      <w:r>
-        <w:rPr>
-          <w:rFonts w:ascii="Courier New" w:hAnsi="Courier New" w:cs="Courier New"/>
-        </w:rPr>
-        <w:tab/>
-      </w:r>
-      <w:r>
-        <w:rPr>
-          <w:rFonts w:ascii="Courier New" w:hAnsi="Courier New" w:cs="Courier New"/>
-        </w:rPr>
-        <w:tab/>
-      </w:r>
-      <w:r>
-        <w:rPr>
-          <w:rFonts w:ascii="Courier New" w:hAnsi="Courier New" w:cs="Courier New"/>
-        </w:rPr>
-        <w:tab/>
-        <w:t>waitForEnqResponse()</w:t>
-      </w:r>
+      <w:proofErr w:type="spellStart"/>
+      <w:proofErr w:type="gramStart"/>
+      <w:r>
+        <w:rPr>
+          <w:rFonts w:ascii="Courier New" w:hAnsi="Courier New" w:cs="Courier New"/>
+        </w:rPr>
+        <w:t>sendControlCharacter</w:t>
+      </w:r>
+      <w:proofErr w:type="spellEnd"/>
+      <w:r>
+        <w:rPr>
+          <w:rFonts w:ascii="Courier New" w:hAnsi="Courier New" w:cs="Courier New"/>
+        </w:rPr>
+        <w:t>(</w:t>
+      </w:r>
+      <w:proofErr w:type="gramEnd"/>
+      <w:r>
+        <w:rPr>
+          <w:rFonts w:ascii="Courier New" w:hAnsi="Courier New" w:cs="Courier New"/>
+        </w:rPr>
+        <w:t xml:space="preserve"> ENQ )</w:t>
+      </w:r>
+    </w:p>
+    <w:p>
+      <w:pPr>
+        <w:rPr>
+          <w:rFonts w:ascii="Courier New" w:hAnsi="Courier New" w:cs="Courier New"/>
+        </w:rPr>
+      </w:pPr>
+      <w:r>
+        <w:rPr>
+          <w:rFonts w:ascii="Courier New" w:hAnsi="Courier New" w:cs="Courier New"/>
+        </w:rPr>
+        <w:tab/>
+      </w:r>
+      <w:r>
+        <w:rPr>
+          <w:rFonts w:ascii="Courier New" w:hAnsi="Courier New" w:cs="Courier New"/>
+        </w:rPr>
+        <w:tab/>
+      </w:r>
+      <w:r>
+        <w:rPr>
+          <w:rFonts w:ascii="Courier New" w:hAnsi="Courier New" w:cs="Courier New"/>
+        </w:rPr>
+        <w:tab/>
+      </w:r>
+      <w:r>
+        <w:rPr>
+          <w:rFonts w:ascii="Courier New" w:hAnsi="Courier New" w:cs="Courier New"/>
+        </w:rPr>
+        <w:tab/>
+      </w:r>
+      <w:proofErr w:type="spellStart"/>
+      <w:proofErr w:type="gramStart"/>
+      <w:r>
+        <w:rPr>
+          <w:rFonts w:ascii="Courier New" w:hAnsi="Courier New" w:cs="Courier New"/>
+        </w:rPr>
+        <w:t>waitForEnqResponse</w:t>
+      </w:r>
+      <w:proofErr w:type="spellEnd"/>
+      <w:r>
+        <w:rPr>
+          <w:rFonts w:ascii="Courier New" w:hAnsi="Courier New" w:cs="Courier New"/>
+        </w:rPr>
+        <w:t>()</w:t>
+      </w:r>
+      <w:proofErr w:type="gramEnd"/>
     </w:p>
     <w:p>
       <w:pPr>
@@ -1040,372 +1159,790 @@
         <w:pStyle w:val="Heading2"/>
       </w:pPr>
       <w:r>
-        <w:t>Send Start</w:t>
-      </w:r>
-    </w:p>
-    <w:p>
-      <w:pPr>
-        <w:rPr>
-          <w:rFonts w:ascii="Courier New" w:hAnsi="Courier New" w:cs="Courier New"/>
-        </w:rPr>
-      </w:pPr>
-    </w:p>
-    <w:p>
-      <w:pPr>
-        <w:rPr>
-          <w:rFonts w:ascii="Courier New" w:hAnsi="Courier New" w:cs="Courier New"/>
-        </w:rPr>
-      </w:pPr>
-      <w:r>
-        <w:rPr>
-          <w:rFonts w:ascii="Courier New" w:hAnsi="Courier New" w:cs="Courier New"/>
-        </w:rPr>
-        <w:t>Function waitForEnqResponse() {</w:t>
-      </w:r>
-    </w:p>
-    <w:p>
-      <w:pPr>
-        <w:ind w:firstLine="720"/>
-        <w:rPr>
-          <w:rFonts w:ascii="Courier New" w:hAnsi="Courier New" w:cs="Courier New"/>
-        </w:rPr>
-      </w:pPr>
-      <w:r>
-        <w:rPr>
-          <w:rFonts w:ascii="Courier New" w:hAnsi="Courier New" w:cs="Courier New"/>
-        </w:rPr>
-        <w:t>if ( wait for response = timeout )</w:t>
-      </w:r>
-    </w:p>
-    <w:p>
-      <w:pPr>
-        <w:rPr>
-          <w:rFonts w:ascii="Courier New" w:hAnsi="Courier New" w:cs="Courier New"/>
-        </w:rPr>
-      </w:pPr>
-      <w:r>
-        <w:rPr>
-          <w:rFonts w:ascii="Courier New" w:hAnsi="Courier New" w:cs="Courier New"/>
-        </w:rPr>
-        <w:tab/>
-      </w:r>
-      <w:r>
-        <w:rPr>
-          <w:rFonts w:ascii="Courier New" w:hAnsi="Courier New" w:cs="Courier New"/>
-        </w:rPr>
-        <w:tab/>
-      </w:r>
-      <w:r>
-        <w:rPr>
-          <w:rFonts w:ascii="Courier New" w:hAnsi="Courier New" w:cs="Courier New"/>
-        </w:rPr>
-        <w:t>sending &lt;- false</w:t>
-      </w:r>
-    </w:p>
-    <w:p>
-      <w:pPr>
-        <w:ind w:left="-567" w:right="-563" w:firstLine="567"/>
-        <w:rPr>
-          <w:rFonts w:ascii="Courier New" w:hAnsi="Courier New" w:cs="Courier New"/>
-        </w:rPr>
-      </w:pPr>
-      <w:r>
-        <w:rPr>
-          <w:rFonts w:ascii="Courier New" w:hAnsi="Courier New" w:cs="Courier New"/>
-        </w:rPr>
-        <w:tab/>
-      </w:r>
-      <w:r>
-        <w:rPr>
-          <w:rFonts w:ascii="Courier New" w:hAnsi="Courier New" w:cs="Courier New"/>
-        </w:rPr>
-        <w:t>else</w:t>
-      </w:r>
-    </w:p>
-    <w:p>
-      <w:pPr>
-        <w:ind w:left="-567" w:right="-563" w:firstLine="567"/>
-        <w:rPr>
-          <w:rFonts w:ascii="Courier New" w:hAnsi="Courier New" w:cs="Courier New"/>
-        </w:rPr>
-      </w:pPr>
-      <w:r>
-        <w:rPr>
-          <w:rFonts w:ascii="Courier New" w:hAnsi="Courier New" w:cs="Courier New"/>
-        </w:rPr>
-        <w:tab/>
-      </w:r>
-      <w:r>
-        <w:rPr>
-          <w:rFonts w:ascii="Courier New" w:hAnsi="Courier New" w:cs="Courier New"/>
-        </w:rPr>
-        <w:tab/>
-      </w:r>
-      <w:r>
-        <w:rPr>
-          <w:rFonts w:ascii="Courier New" w:hAnsi="Courier New" w:cs="Courier New"/>
-        </w:rPr>
-        <w:t>sendData()</w:t>
-      </w:r>
-    </w:p>
-    <w:p>
-      <w:pPr>
-        <w:rPr>
-          <w:rFonts w:ascii="Courier New" w:hAnsi="Courier New" w:cs="Courier New"/>
-        </w:rPr>
-      </w:pPr>
-      <w:r>
-        <w:rPr>
-          <w:rFonts w:ascii="Courier New" w:hAnsi="Courier New" w:cs="Courier New"/>
-        </w:rPr>
-        <w:lastRenderedPageBreak/>
-        <w:tab/>
-      </w:r>
-    </w:p>
-    <w:p>
-      <w:pPr>
-        <w:ind w:left="-567" w:right="-563" w:firstLine="567"/>
-        <w:rPr>
-          <w:rFonts w:ascii="Courier New" w:hAnsi="Courier New" w:cs="Courier New"/>
-        </w:rPr>
-      </w:pPr>
-      <w:r>
-        <w:rPr>
-          <w:rFonts w:ascii="Courier New" w:hAnsi="Courier New" w:cs="Courier New"/>
-        </w:rPr>
-        <w:tab/>
-      </w:r>
-      <w:r>
-        <w:rPr>
-          <w:rFonts w:ascii="Courier New" w:hAnsi="Courier New" w:cs="Courier New"/>
-        </w:rPr>
-        <w:t>resetTimer &lt;- random( MIN_RESET to MAX_RESET )</w:t>
-      </w:r>
-    </w:p>
-    <w:p>
-      <w:pPr>
-        <w:rPr>
-          <w:rFonts w:ascii="Courier New" w:hAnsi="Courier New" w:cs="Courier New"/>
-        </w:rPr>
-      </w:pPr>
-      <w:r>
-        <w:rPr>
-          <w:rFonts w:ascii="Courier New" w:hAnsi="Courier New" w:cs="Courier New"/>
-        </w:rPr>
-        <w:t>}</w:t>
-      </w:r>
-    </w:p>
-    <w:p>
-      <w:pPr>
-        <w:rPr>
-          <w:rFonts w:ascii="Courier New" w:hAnsi="Courier New" w:cs="Courier New"/>
-        </w:rPr>
-      </w:pPr>
-    </w:p>
-    <w:p>
-      <w:pPr>
-        <w:pStyle w:val="Heading2"/>
-      </w:pPr>
-      <w:r>
-        <w:t>Send Data</w:t>
-      </w:r>
-    </w:p>
-    <w:p>
-      <w:pPr>
-        <w:rPr>
-          <w:rFonts w:ascii="Courier New" w:hAnsi="Courier New" w:cs="Courier New"/>
-        </w:rPr>
-      </w:pPr>
-    </w:p>
-    <w:p>
-      <w:pPr>
-        <w:rPr>
-          <w:rFonts w:ascii="Courier New" w:hAnsi="Courier New" w:cs="Courier New"/>
-        </w:rPr>
-      </w:pPr>
-      <w:r>
-        <w:rPr>
-          <w:rFonts w:ascii="Courier New" w:hAnsi="Courier New" w:cs="Courier New"/>
-        </w:rPr>
-        <w:t>Function sendData() {</w:t>
-      </w:r>
-    </w:p>
-    <w:p>
-      <w:pPr>
-        <w:rPr>
-          <w:rFonts w:ascii="Courier New" w:hAnsi="Courier New" w:cs="Courier New"/>
-        </w:rPr>
-      </w:pPr>
-      <w:r>
-        <w:rPr>
-          <w:rFonts w:ascii="Courier New" w:hAnsi="Courier New" w:cs="Courier New"/>
-        </w:rPr>
-        <w:tab/>
-        <w:t>Misses &lt;- 0</w:t>
-      </w:r>
-    </w:p>
-    <w:p>
-      <w:pPr>
-        <w:rPr>
-          <w:rFonts w:ascii="Courier New" w:hAnsi="Courier New" w:cs="Courier New"/>
-        </w:rPr>
-      </w:pPr>
-      <w:r>
-        <w:rPr>
-          <w:rFonts w:ascii="Courier New" w:hAnsi="Courier New" w:cs="Courier New"/>
-        </w:rPr>
-        <w:tab/>
-        <w:t>Sent &lt;- 0</w:t>
-      </w:r>
-    </w:p>
-    <w:p>
-      <w:pPr>
-        <w:rPr>
-          <w:rFonts w:ascii="Courier New" w:hAnsi="Courier New" w:cs="Courier New"/>
-        </w:rPr>
-      </w:pPr>
-      <w:r>
-        <w:rPr>
-          <w:rFonts w:ascii="Courier New" w:hAnsi="Courier New" w:cs="Courier New"/>
-        </w:rPr>
-        <w:tab/>
-      </w:r>
-    </w:p>
-    <w:p>
-      <w:pPr>
-        <w:rPr>
-          <w:rFonts w:ascii="Courier New" w:hAnsi="Courier New" w:cs="Courier New"/>
-        </w:rPr>
-      </w:pPr>
-      <w:r>
-        <w:rPr>
-          <w:rFonts w:ascii="Courier New" w:hAnsi="Courier New" w:cs="Courier New"/>
-        </w:rPr>
-        <w:tab/>
-        <w:t xml:space="preserve">While ( </w:t>
-      </w:r>
-      <w:r>
-        <w:rPr>
-          <w:rFonts w:ascii="Courier New" w:hAnsi="Courier New" w:cs="Courier New"/>
-        </w:rPr>
-        <w:t xml:space="preserve">buffer &gt; 0 and </w:t>
-      </w:r>
-      <w:r>
-        <w:rPr>
-          <w:rFonts w:ascii="Courier New" w:hAnsi="Courier New" w:cs="Courier New"/>
-        </w:rPr>
-        <w:t>misses &lt; MAX_MISSES and sent &lt; MAX_SENT )</w:t>
-      </w:r>
-    </w:p>
-    <w:p>
-      <w:pPr>
-        <w:rPr>
-          <w:rFonts w:ascii="Courier New" w:hAnsi="Courier New" w:cs="Courier New"/>
-        </w:rPr>
-      </w:pPr>
-      <w:r>
-        <w:rPr>
-          <w:rFonts w:ascii="Courier New" w:hAnsi="Courier New" w:cs="Courier New"/>
-        </w:rPr>
-        <w:tab/>
-        <w:t>{</w:t>
-      </w:r>
-    </w:p>
-    <w:p>
-      <w:pPr>
-        <w:rPr>
-          <w:rFonts w:ascii="Courier New" w:hAnsi="Courier New" w:cs="Courier New"/>
-        </w:rPr>
-      </w:pPr>
-      <w:r>
-        <w:rPr>
-          <w:rFonts w:ascii="Courier New" w:hAnsi="Courier New" w:cs="Courier New"/>
-        </w:rPr>
-        <w:tab/>
-      </w:r>
-      <w:r>
-        <w:rPr>
-          <w:rFonts w:ascii="Courier New" w:hAnsi="Courier New" w:cs="Courier New"/>
-        </w:rPr>
-        <w:tab/>
-      </w:r>
-      <w:r>
-        <w:rPr>
-          <w:rFonts w:ascii="Courier New" w:hAnsi="Courier New" w:cs="Courier New"/>
-        </w:rPr>
-        <w:t>constructPacket(</w:t>
-      </w:r>
-      <w:r>
-        <w:rPr>
-          <w:rFonts w:ascii="Courier New" w:hAnsi="Courier New" w:cs="Courier New"/>
-        </w:rPr>
-        <w:t xml:space="preserve"> packet</w:t>
-      </w:r>
-      <w:r>
-        <w:rPr>
-          <w:rFonts w:ascii="Courier New" w:hAnsi="Courier New" w:cs="Courier New"/>
-        </w:rPr>
-        <w:t xml:space="preserve">, </w:t>
-      </w:r>
-      <w:r>
-        <w:rPr>
-          <w:rFonts w:ascii="Courier New" w:hAnsi="Courier New" w:cs="Courier New"/>
-        </w:rPr>
-        <w:t>maxSends</w:t>
-      </w:r>
+        <w:t>Receive Start</w:t>
+      </w:r>
+    </w:p>
+    <w:p/>
+    <w:p>
+      <w:pPr>
+        <w:rPr>
+          <w:rFonts w:ascii="Courier New" w:hAnsi="Courier New" w:cs="Courier New"/>
+        </w:rPr>
+      </w:pPr>
+      <w:r>
+        <w:rPr>
+          <w:rFonts w:ascii="Courier New" w:hAnsi="Courier New" w:cs="Courier New"/>
+        </w:rPr>
+        <w:t xml:space="preserve">Function </w:t>
+      </w:r>
+      <w:proofErr w:type="spellStart"/>
+      <w:proofErr w:type="gramStart"/>
+      <w:r>
+        <w:rPr>
+          <w:rFonts w:ascii="Courier New" w:hAnsi="Courier New" w:cs="Courier New"/>
+        </w:rPr>
+        <w:t>waitForEnquiry</w:t>
+      </w:r>
+      <w:proofErr w:type="spellEnd"/>
+      <w:r>
+        <w:rPr>
+          <w:rFonts w:ascii="Courier New" w:hAnsi="Courier New" w:cs="Courier New"/>
+        </w:rPr>
+        <w:t>(</w:t>
+      </w:r>
+      <w:proofErr w:type="gramEnd"/>
+      <w:r>
+        <w:rPr>
+          <w:rFonts w:ascii="Courier New" w:hAnsi="Courier New" w:cs="Courier New"/>
+        </w:rPr>
+        <w:t>) {</w:t>
+      </w:r>
+    </w:p>
+    <w:p>
+      <w:pPr>
+        <w:rPr>
+          <w:rFonts w:ascii="Courier New" w:hAnsi="Courier New" w:cs="Courier New"/>
+        </w:rPr>
+      </w:pPr>
+      <w:r>
+        <w:rPr>
+          <w:rFonts w:ascii="Courier New" w:hAnsi="Courier New" w:cs="Courier New"/>
+        </w:rPr>
+        <w:tab/>
+      </w:r>
+      <w:r>
+        <w:rPr>
+          <w:rFonts w:ascii="Courier New" w:hAnsi="Courier New" w:cs="Courier New"/>
+        </w:rPr>
+        <w:t>While true</w:t>
+      </w:r>
+    </w:p>
+    <w:p>
+      <w:pPr>
+        <w:rPr>
+          <w:rFonts w:ascii="Courier New" w:hAnsi="Courier New" w:cs="Courier New"/>
+        </w:rPr>
+      </w:pPr>
+      <w:r>
+        <w:rPr>
+          <w:rFonts w:ascii="Courier New" w:hAnsi="Courier New" w:cs="Courier New"/>
+        </w:rPr>
+        <w:tab/>
+      </w:r>
+      <w:r>
+        <w:rPr>
+          <w:rFonts w:ascii="Courier New" w:hAnsi="Courier New" w:cs="Courier New"/>
+        </w:rPr>
+        <w:tab/>
+      </w:r>
+      <w:r>
+        <w:rPr>
+          <w:rFonts w:ascii="Courier New" w:hAnsi="Courier New" w:cs="Courier New"/>
+        </w:rPr>
+        <w:t>If not sending</w:t>
+      </w:r>
+    </w:p>
+    <w:p>
+      <w:pPr>
+        <w:rPr>
+          <w:rFonts w:ascii="Courier New" w:hAnsi="Courier New" w:cs="Courier New"/>
+        </w:rPr>
+      </w:pPr>
+      <w:r>
+        <w:rPr>
+          <w:rFonts w:ascii="Courier New" w:hAnsi="Courier New" w:cs="Courier New"/>
+        </w:rPr>
+        <w:tab/>
+      </w:r>
+      <w:r>
+        <w:rPr>
+          <w:rFonts w:ascii="Courier New" w:hAnsi="Courier New" w:cs="Courier New"/>
+        </w:rPr>
+        <w:tab/>
+      </w:r>
+      <w:r>
+        <w:rPr>
+          <w:rFonts w:ascii="Courier New" w:hAnsi="Courier New" w:cs="Courier New"/>
+        </w:rPr>
+        <w:tab/>
+      </w:r>
+      <w:proofErr w:type="gramStart"/>
+      <w:r>
+        <w:rPr>
+          <w:rFonts w:ascii="Courier New" w:hAnsi="Courier New" w:cs="Courier New"/>
+        </w:rPr>
+        <w:t>if</w:t>
+      </w:r>
+      <w:proofErr w:type="gramEnd"/>
       <w:r>
         <w:rPr>
           <w:rFonts w:ascii="Courier New" w:hAnsi="Courier New" w:cs="Courier New"/>
         </w:rPr>
         <w:t xml:space="preserve"> </w:t>
       </w:r>
-      <w:r>
-        <w:rPr>
-          <w:rFonts w:ascii="Courier New" w:hAnsi="Courier New" w:cs="Courier New"/>
-        </w:rPr>
-        <w:t>)</w:t>
-      </w:r>
-    </w:p>
-    <w:p>
-      <w:pPr>
-        <w:rPr>
-          <w:rFonts w:ascii="Courier New" w:hAnsi="Courier New" w:cs="Courier New"/>
-        </w:rPr>
-      </w:pPr>
-      <w:r>
-        <w:rPr>
-          <w:rFonts w:ascii="Courier New" w:hAnsi="Courier New" w:cs="Courier New"/>
-        </w:rPr>
-        <w:tab/>
-      </w:r>
-      <w:r>
-        <w:rPr>
-          <w:rFonts w:ascii="Courier New" w:hAnsi="Courier New" w:cs="Courier New"/>
-        </w:rPr>
-        <w:tab/>
-      </w:r>
-    </w:p>
-    <w:p>
-      <w:pPr>
-        <w:rPr>
-          <w:rFonts w:ascii="Courier New" w:hAnsi="Courier New" w:cs="Courier New"/>
-        </w:rPr>
-      </w:pPr>
-      <w:r>
-        <w:rPr>
-          <w:rFonts w:ascii="Courier New" w:hAnsi="Courier New" w:cs="Courier New"/>
-        </w:rPr>
-        <w:tab/>
-      </w:r>
-      <w:r>
-        <w:rPr>
-          <w:rFonts w:ascii="Courier New" w:hAnsi="Courier New" w:cs="Courier New"/>
-        </w:rPr>
-        <w:tab/>
-        <w:t>dataSize &lt;- min( bufferSize, 1019 )</w:t>
+      <w:proofErr w:type="spellStart"/>
+      <w:r>
+        <w:rPr>
+          <w:rFonts w:ascii="Courier New" w:hAnsi="Courier New" w:cs="Courier New"/>
+        </w:rPr>
+        <w:t>inBuffer</w:t>
+      </w:r>
+      <w:proofErr w:type="spellEnd"/>
+      <w:r>
+        <w:rPr>
+          <w:rFonts w:ascii="Courier New" w:hAnsi="Courier New" w:cs="Courier New"/>
+        </w:rPr>
+        <w:t xml:space="preserve"> &gt; 0</w:t>
+      </w:r>
+      <w:r>
+        <w:rPr>
+          <w:rFonts w:ascii="Courier New" w:hAnsi="Courier New" w:cs="Courier New"/>
+        </w:rPr>
+        <w:t xml:space="preserve"> </w:t>
+      </w:r>
+    </w:p>
+    <w:p>
+      <w:pPr>
+        <w:rPr>
+          <w:rFonts w:ascii="Courier New" w:hAnsi="Courier New" w:cs="Courier New"/>
+        </w:rPr>
+      </w:pPr>
+      <w:r>
+        <w:rPr>
+          <w:rFonts w:ascii="Courier New" w:hAnsi="Courier New" w:cs="Courier New"/>
+        </w:rPr>
+        <w:tab/>
+      </w:r>
+      <w:r>
+        <w:rPr>
+          <w:rFonts w:ascii="Courier New" w:hAnsi="Courier New" w:cs="Courier New"/>
+        </w:rPr>
+        <w:tab/>
+      </w:r>
+      <w:r>
+        <w:rPr>
+          <w:rFonts w:ascii="Courier New" w:hAnsi="Courier New" w:cs="Courier New"/>
+        </w:rPr>
+        <w:tab/>
+      </w:r>
+      <w:r>
+        <w:rPr>
+          <w:rFonts w:ascii="Courier New" w:hAnsi="Courier New" w:cs="Courier New"/>
+        </w:rPr>
+        <w:tab/>
+        <w:t>Receiv</w:t>
       </w:r>
       <w:bookmarkStart w:id="8" w:name="_GoBack"/>
       <w:bookmarkEnd w:id="8"/>
+      <w:r>
+        <w:rPr>
+          <w:rFonts w:ascii="Courier New" w:hAnsi="Courier New" w:cs="Courier New"/>
+        </w:rPr>
+        <w:t>ing &lt;- true</w:t>
+      </w:r>
+    </w:p>
+    <w:p>
+      <w:pPr>
+        <w:rPr>
+          <w:rFonts w:ascii="Courier New" w:hAnsi="Courier New" w:cs="Courier New"/>
+        </w:rPr>
+      </w:pPr>
+      <w:r>
+        <w:rPr>
+          <w:rFonts w:ascii="Courier New" w:hAnsi="Courier New" w:cs="Courier New"/>
+        </w:rPr>
+        <w:lastRenderedPageBreak/>
+        <w:tab/>
+      </w:r>
+      <w:r>
+        <w:rPr>
+          <w:rFonts w:ascii="Courier New" w:hAnsi="Courier New" w:cs="Courier New"/>
+        </w:rPr>
+        <w:tab/>
+      </w:r>
+      <w:r>
+        <w:rPr>
+          <w:rFonts w:ascii="Courier New" w:hAnsi="Courier New" w:cs="Courier New"/>
+        </w:rPr>
+        <w:tab/>
+      </w:r>
+      <w:r>
+        <w:rPr>
+          <w:rFonts w:ascii="Courier New" w:hAnsi="Courier New" w:cs="Courier New"/>
+        </w:rPr>
+        <w:tab/>
+      </w:r>
+    </w:p>
+    <w:p>
+      <w:pPr>
+        <w:rPr>
+          <w:rFonts w:ascii="Courier New" w:hAnsi="Courier New" w:cs="Courier New"/>
+        </w:rPr>
+      </w:pPr>
+      <w:r>
+        <w:rPr>
+          <w:rFonts w:ascii="Courier New" w:hAnsi="Courier New" w:cs="Courier New"/>
+        </w:rPr>
+        <w:tab/>
+      </w:r>
+      <w:r>
+        <w:rPr>
+          <w:rFonts w:ascii="Courier New" w:hAnsi="Courier New" w:cs="Courier New"/>
+        </w:rPr>
+        <w:tab/>
+        <w:t>Else</w:t>
+      </w:r>
+    </w:p>
+    <w:p>
+      <w:pPr>
+        <w:rPr>
+          <w:rFonts w:ascii="Courier New" w:hAnsi="Courier New" w:cs="Courier New"/>
+        </w:rPr>
+      </w:pPr>
+      <w:r>
+        <w:rPr>
+          <w:rFonts w:ascii="Courier New" w:hAnsi="Courier New" w:cs="Courier New"/>
+        </w:rPr>
+        <w:tab/>
+      </w:r>
+      <w:r>
+        <w:rPr>
+          <w:rFonts w:ascii="Courier New" w:hAnsi="Courier New" w:cs="Courier New"/>
+        </w:rPr>
+        <w:tab/>
+      </w:r>
+      <w:r>
+        <w:rPr>
+          <w:rFonts w:ascii="Courier New" w:hAnsi="Courier New" w:cs="Courier New"/>
+        </w:rPr>
+        <w:tab/>
+      </w:r>
+    </w:p>
+    <w:p>
+      <w:pPr>
+        <w:rPr>
+          <w:rFonts w:ascii="Courier New" w:hAnsi="Courier New" w:cs="Courier New"/>
+        </w:rPr>
+      </w:pPr>
+      <w:r>
+        <w:rPr>
+          <w:rFonts w:ascii="Courier New" w:hAnsi="Courier New" w:cs="Courier New"/>
+        </w:rPr>
+        <w:t>}</w:t>
+      </w:r>
+    </w:p>
+    <w:p>
+      <w:pPr>
+        <w:rPr>
+          <w:rFonts w:ascii="Courier New" w:hAnsi="Courier New" w:cs="Courier New"/>
+        </w:rPr>
+      </w:pPr>
+    </w:p>
+    <w:p>
+      <w:pPr>
+        <w:pStyle w:val="Heading2"/>
+      </w:pPr>
+      <w:r>
+        <w:t>Send Start</w:t>
+      </w:r>
+    </w:p>
+    <w:p>
+      <w:pPr>
+        <w:rPr>
+          <w:rFonts w:ascii="Courier New" w:hAnsi="Courier New" w:cs="Courier New"/>
+        </w:rPr>
+      </w:pPr>
+    </w:p>
+    <w:p>
+      <w:pPr>
+        <w:rPr>
+          <w:rFonts w:ascii="Courier New" w:hAnsi="Courier New" w:cs="Courier New"/>
+        </w:rPr>
+      </w:pPr>
+      <w:r>
+        <w:rPr>
+          <w:rFonts w:ascii="Courier New" w:hAnsi="Courier New" w:cs="Courier New"/>
+        </w:rPr>
+        <w:t xml:space="preserve">Function </w:t>
+      </w:r>
+      <w:proofErr w:type="spellStart"/>
+      <w:proofErr w:type="gramStart"/>
+      <w:r>
+        <w:rPr>
+          <w:rFonts w:ascii="Courier New" w:hAnsi="Courier New" w:cs="Courier New"/>
+        </w:rPr>
+        <w:t>waitForEnqResponse</w:t>
+      </w:r>
+      <w:proofErr w:type="spellEnd"/>
+      <w:r>
+        <w:rPr>
+          <w:rFonts w:ascii="Courier New" w:hAnsi="Courier New" w:cs="Courier New"/>
+        </w:rPr>
+        <w:t>(</w:t>
+      </w:r>
+      <w:proofErr w:type="gramEnd"/>
+      <w:r>
+        <w:rPr>
+          <w:rFonts w:ascii="Courier New" w:hAnsi="Courier New" w:cs="Courier New"/>
+        </w:rPr>
+        <w:t>) {</w:t>
+      </w:r>
+    </w:p>
+    <w:p>
+      <w:pPr>
+        <w:ind w:firstLine="720"/>
+        <w:rPr>
+          <w:rFonts w:ascii="Courier New" w:hAnsi="Courier New" w:cs="Courier New"/>
+        </w:rPr>
+      </w:pPr>
+      <w:proofErr w:type="gramStart"/>
+      <w:r>
+        <w:rPr>
+          <w:rFonts w:ascii="Courier New" w:hAnsi="Courier New" w:cs="Courier New"/>
+        </w:rPr>
+        <w:t>if</w:t>
+      </w:r>
+      <w:proofErr w:type="gramEnd"/>
+      <w:r>
+        <w:rPr>
+          <w:rFonts w:ascii="Courier New" w:hAnsi="Courier New" w:cs="Courier New"/>
+        </w:rPr>
+        <w:t xml:space="preserve"> ( wait for response = timeout )</w:t>
+      </w:r>
+    </w:p>
+    <w:p>
+      <w:pPr>
+        <w:rPr>
+          <w:rFonts w:ascii="Courier New" w:hAnsi="Courier New" w:cs="Courier New"/>
+        </w:rPr>
+      </w:pPr>
+      <w:r>
+        <w:rPr>
+          <w:rFonts w:ascii="Courier New" w:hAnsi="Courier New" w:cs="Courier New"/>
+        </w:rPr>
+        <w:tab/>
+      </w:r>
+      <w:r>
+        <w:rPr>
+          <w:rFonts w:ascii="Courier New" w:hAnsi="Courier New" w:cs="Courier New"/>
+        </w:rPr>
+        <w:tab/>
+      </w:r>
+      <w:proofErr w:type="gramStart"/>
+      <w:r>
+        <w:rPr>
+          <w:rFonts w:ascii="Courier New" w:hAnsi="Courier New" w:cs="Courier New"/>
+        </w:rPr>
+        <w:t>sending</w:t>
+      </w:r>
+      <w:proofErr w:type="gramEnd"/>
+      <w:r>
+        <w:rPr>
+          <w:rFonts w:ascii="Courier New" w:hAnsi="Courier New" w:cs="Courier New"/>
+        </w:rPr>
+        <w:t xml:space="preserve"> &lt;- false</w:t>
+      </w:r>
+    </w:p>
+    <w:p>
+      <w:pPr>
+        <w:ind w:left="-567" w:right="-563" w:firstLine="567"/>
+        <w:rPr>
+          <w:rFonts w:ascii="Courier New" w:hAnsi="Courier New" w:cs="Courier New"/>
+        </w:rPr>
+      </w:pPr>
+      <w:r>
+        <w:rPr>
+          <w:rFonts w:ascii="Courier New" w:hAnsi="Courier New" w:cs="Courier New"/>
+        </w:rPr>
+        <w:tab/>
+      </w:r>
+      <w:proofErr w:type="gramStart"/>
+      <w:r>
+        <w:rPr>
+          <w:rFonts w:ascii="Courier New" w:hAnsi="Courier New" w:cs="Courier New"/>
+        </w:rPr>
+        <w:t>else</w:t>
+      </w:r>
+      <w:proofErr w:type="gramEnd"/>
+    </w:p>
+    <w:p>
+      <w:pPr>
+        <w:ind w:left="-567" w:right="-563" w:firstLine="567"/>
+        <w:rPr>
+          <w:rFonts w:ascii="Courier New" w:hAnsi="Courier New" w:cs="Courier New"/>
+        </w:rPr>
+      </w:pPr>
+      <w:r>
+        <w:rPr>
+          <w:rFonts w:ascii="Courier New" w:hAnsi="Courier New" w:cs="Courier New"/>
+        </w:rPr>
+        <w:tab/>
+      </w:r>
+      <w:r>
+        <w:rPr>
+          <w:rFonts w:ascii="Courier New" w:hAnsi="Courier New" w:cs="Courier New"/>
+        </w:rPr>
+        <w:tab/>
+      </w:r>
+      <w:proofErr w:type="spellStart"/>
+      <w:proofErr w:type="gramStart"/>
+      <w:r>
+        <w:rPr>
+          <w:rFonts w:ascii="Courier New" w:hAnsi="Courier New" w:cs="Courier New"/>
+        </w:rPr>
+        <w:t>sendData</w:t>
+      </w:r>
+      <w:proofErr w:type="spellEnd"/>
+      <w:r>
+        <w:rPr>
+          <w:rFonts w:ascii="Courier New" w:hAnsi="Courier New" w:cs="Courier New"/>
+        </w:rPr>
+        <w:t>()</w:t>
+      </w:r>
+      <w:proofErr w:type="gramEnd"/>
+    </w:p>
+    <w:p>
+      <w:pPr>
+        <w:rPr>
+          <w:rFonts w:ascii="Courier New" w:hAnsi="Courier New" w:cs="Courier New"/>
+        </w:rPr>
+      </w:pPr>
+      <w:r>
+        <w:rPr>
+          <w:rFonts w:ascii="Courier New" w:hAnsi="Courier New" w:cs="Courier New"/>
+        </w:rPr>
+        <w:tab/>
+      </w:r>
+    </w:p>
+    <w:p>
+      <w:pPr>
+        <w:ind w:left="-567" w:right="-563" w:firstLine="567"/>
+        <w:rPr>
+          <w:rFonts w:ascii="Courier New" w:hAnsi="Courier New" w:cs="Courier New"/>
+        </w:rPr>
+      </w:pPr>
+      <w:r>
+        <w:rPr>
+          <w:rFonts w:ascii="Courier New" w:hAnsi="Courier New" w:cs="Courier New"/>
+        </w:rPr>
+        <w:tab/>
+      </w:r>
+      <w:proofErr w:type="spellStart"/>
+      <w:proofErr w:type="gramStart"/>
+      <w:r>
+        <w:rPr>
+          <w:rFonts w:ascii="Courier New" w:hAnsi="Courier New" w:cs="Courier New"/>
+        </w:rPr>
+        <w:t>resetTimer</w:t>
+      </w:r>
+      <w:proofErr w:type="spellEnd"/>
+      <w:proofErr w:type="gramEnd"/>
+      <w:r>
+        <w:rPr>
+          <w:rFonts w:ascii="Courier New" w:hAnsi="Courier New" w:cs="Courier New"/>
+        </w:rPr>
+        <w:t xml:space="preserve"> &lt;- random( MIN_RESET to MAX_RESET )</w:t>
+      </w:r>
+    </w:p>
+    <w:p>
+      <w:pPr>
+        <w:rPr>
+          <w:rFonts w:ascii="Courier New" w:hAnsi="Courier New" w:cs="Courier New"/>
+        </w:rPr>
+      </w:pPr>
+      <w:r>
+        <w:rPr>
+          <w:rFonts w:ascii="Courier New" w:hAnsi="Courier New" w:cs="Courier New"/>
+        </w:rPr>
+        <w:t>}</w:t>
+      </w:r>
+    </w:p>
+    <w:p>
+      <w:pPr>
+        <w:rPr>
+          <w:rFonts w:ascii="Courier New" w:hAnsi="Courier New" w:cs="Courier New"/>
+        </w:rPr>
+      </w:pPr>
+    </w:p>
+    <w:p>
+      <w:pPr>
+        <w:pStyle w:val="Heading2"/>
+      </w:pPr>
+      <w:r>
+        <w:t>Send Data</w:t>
+      </w:r>
+    </w:p>
+    <w:p>
+      <w:pPr>
+        <w:rPr>
+          <w:rFonts w:ascii="Courier New" w:hAnsi="Courier New" w:cs="Courier New"/>
+        </w:rPr>
+      </w:pPr>
+    </w:p>
+    <w:p>
+      <w:pPr>
+        <w:rPr>
+          <w:rFonts w:ascii="Courier New" w:hAnsi="Courier New" w:cs="Courier New"/>
+        </w:rPr>
+      </w:pPr>
+      <w:r>
+        <w:rPr>
+          <w:rFonts w:ascii="Courier New" w:hAnsi="Courier New" w:cs="Courier New"/>
+        </w:rPr>
+        <w:t xml:space="preserve">Function </w:t>
+      </w:r>
+      <w:proofErr w:type="spellStart"/>
+      <w:proofErr w:type="gramStart"/>
+      <w:r>
+        <w:rPr>
+          <w:rFonts w:ascii="Courier New" w:hAnsi="Courier New" w:cs="Courier New"/>
+        </w:rPr>
+        <w:t>sendData</w:t>
+      </w:r>
+      <w:proofErr w:type="spellEnd"/>
+      <w:r>
+        <w:rPr>
+          <w:rFonts w:ascii="Courier New" w:hAnsi="Courier New" w:cs="Courier New"/>
+        </w:rPr>
+        <w:t>(</w:t>
+      </w:r>
+      <w:proofErr w:type="gramEnd"/>
+      <w:r>
+        <w:rPr>
+          <w:rFonts w:ascii="Courier New" w:hAnsi="Courier New" w:cs="Courier New"/>
+        </w:rPr>
+        <w:t>) {</w:t>
+      </w:r>
+    </w:p>
+    <w:p>
+      <w:pPr>
+        <w:rPr>
+          <w:rFonts w:ascii="Courier New" w:hAnsi="Courier New" w:cs="Courier New"/>
+        </w:rPr>
+      </w:pPr>
+      <w:r>
+        <w:rPr>
+          <w:rFonts w:ascii="Courier New" w:hAnsi="Courier New" w:cs="Courier New"/>
+        </w:rPr>
+        <w:tab/>
+        <w:t>Misses &lt;- 0</w:t>
+      </w:r>
+    </w:p>
+    <w:p>
+      <w:pPr>
+        <w:rPr>
+          <w:rFonts w:ascii="Courier New" w:hAnsi="Courier New" w:cs="Courier New"/>
+        </w:rPr>
+      </w:pPr>
+      <w:r>
+        <w:rPr>
+          <w:rFonts w:ascii="Courier New" w:hAnsi="Courier New" w:cs="Courier New"/>
+        </w:rPr>
+        <w:tab/>
+        <w:t>Sent &lt;- 0</w:t>
+      </w:r>
+    </w:p>
+    <w:p>
+      <w:pPr>
+        <w:rPr>
+          <w:rFonts w:ascii="Courier New" w:hAnsi="Courier New" w:cs="Courier New"/>
+        </w:rPr>
+      </w:pPr>
+      <w:r>
+        <w:rPr>
+          <w:rFonts w:ascii="Courier New" w:hAnsi="Courier New" w:cs="Courier New"/>
+        </w:rPr>
+        <w:tab/>
+      </w:r>
+    </w:p>
+    <w:p>
+      <w:pPr>
+        <w:rPr>
+          <w:rFonts w:ascii="Courier New" w:hAnsi="Courier New" w:cs="Courier New"/>
+        </w:rPr>
+      </w:pPr>
+      <w:r>
+        <w:rPr>
+          <w:rFonts w:ascii="Courier New" w:hAnsi="Courier New" w:cs="Courier New"/>
+        </w:rPr>
+        <w:tab/>
+        <w:t xml:space="preserve">While </w:t>
+      </w:r>
+      <w:proofErr w:type="gramStart"/>
+      <w:r>
+        <w:rPr>
+          <w:rFonts w:ascii="Courier New" w:hAnsi="Courier New" w:cs="Courier New"/>
+        </w:rPr>
+        <w:t xml:space="preserve">( </w:t>
+      </w:r>
+      <w:r>
+        <w:rPr>
+          <w:rFonts w:ascii="Courier New" w:hAnsi="Courier New" w:cs="Courier New"/>
+        </w:rPr>
+        <w:t>buffer</w:t>
+      </w:r>
+      <w:proofErr w:type="gramEnd"/>
+      <w:r>
+        <w:rPr>
+          <w:rFonts w:ascii="Courier New" w:hAnsi="Courier New" w:cs="Courier New"/>
+        </w:rPr>
+        <w:t xml:space="preserve"> &gt; 0 and </w:t>
+      </w:r>
+      <w:r>
+        <w:rPr>
+          <w:rFonts w:ascii="Courier New" w:hAnsi="Courier New" w:cs="Courier New"/>
+        </w:rPr>
+        <w:t>misses &lt; MAX_MISSES and sent &lt; MAX_SENT )</w:t>
+      </w:r>
+    </w:p>
+    <w:p>
+      <w:pPr>
+        <w:rPr>
+          <w:rFonts w:ascii="Courier New" w:hAnsi="Courier New" w:cs="Courier New"/>
+        </w:rPr>
+      </w:pPr>
+      <w:r>
+        <w:rPr>
+          <w:rFonts w:ascii="Courier New" w:hAnsi="Courier New" w:cs="Courier New"/>
+        </w:rPr>
+        <w:tab/>
+        <w:t>{</w:t>
+      </w:r>
+    </w:p>
+    <w:p>
+      <w:pPr>
+        <w:rPr>
+          <w:rFonts w:ascii="Courier New" w:hAnsi="Courier New" w:cs="Courier New"/>
+        </w:rPr>
+      </w:pPr>
+      <w:r>
+        <w:rPr>
+          <w:rFonts w:ascii="Courier New" w:hAnsi="Courier New" w:cs="Courier New"/>
+        </w:rPr>
+        <w:tab/>
+      </w:r>
+      <w:r>
+        <w:rPr>
+          <w:rFonts w:ascii="Courier New" w:hAnsi="Courier New" w:cs="Courier New"/>
+        </w:rPr>
+        <w:tab/>
+      </w:r>
+      <w:proofErr w:type="spellStart"/>
+      <w:proofErr w:type="gramStart"/>
+      <w:r>
+        <w:rPr>
+          <w:rFonts w:ascii="Courier New" w:hAnsi="Courier New" w:cs="Courier New"/>
+        </w:rPr>
+        <w:t>constructPacket</w:t>
+      </w:r>
+      <w:proofErr w:type="spellEnd"/>
+      <w:r>
+        <w:rPr>
+          <w:rFonts w:ascii="Courier New" w:hAnsi="Courier New" w:cs="Courier New"/>
+        </w:rPr>
+        <w:t>(</w:t>
+      </w:r>
+      <w:proofErr w:type="gramEnd"/>
+      <w:r>
+        <w:rPr>
+          <w:rFonts w:ascii="Courier New" w:hAnsi="Courier New" w:cs="Courier New"/>
+        </w:rPr>
+        <w:t xml:space="preserve"> packet</w:t>
+      </w:r>
+      <w:r>
+        <w:rPr>
+          <w:rFonts w:ascii="Courier New" w:hAnsi="Courier New" w:cs="Courier New"/>
+        </w:rPr>
+        <w:t xml:space="preserve">, </w:t>
+      </w:r>
+      <w:proofErr w:type="spellStart"/>
+      <w:r>
+        <w:rPr>
+          <w:rFonts w:ascii="Courier New" w:hAnsi="Courier New" w:cs="Courier New"/>
+        </w:rPr>
+        <w:t>maxSends</w:t>
+      </w:r>
+      <w:proofErr w:type="spellEnd"/>
+      <w:r>
+        <w:rPr>
+          <w:rFonts w:ascii="Courier New" w:hAnsi="Courier New" w:cs="Courier New"/>
+        </w:rPr>
+        <w:t xml:space="preserve"> </w:t>
+      </w:r>
+      <w:r>
+        <w:rPr>
+          <w:rFonts w:ascii="Courier New" w:hAnsi="Courier New" w:cs="Courier New"/>
+        </w:rPr>
+        <w:t>)</w:t>
+      </w:r>
+    </w:p>
+    <w:p>
+      <w:pPr>
+        <w:rPr>
+          <w:rFonts w:ascii="Courier New" w:hAnsi="Courier New" w:cs="Courier New"/>
+        </w:rPr>
+      </w:pPr>
+      <w:r>
+        <w:rPr>
+          <w:rFonts w:ascii="Courier New" w:hAnsi="Courier New" w:cs="Courier New"/>
+        </w:rPr>
+        <w:tab/>
+      </w:r>
+      <w:r>
+        <w:rPr>
+          <w:rFonts w:ascii="Courier New" w:hAnsi="Courier New" w:cs="Courier New"/>
+        </w:rPr>
+        <w:tab/>
+      </w:r>
+    </w:p>
+    <w:p>
+      <w:pPr>
+        <w:rPr>
+          <w:rFonts w:ascii="Courier New" w:hAnsi="Courier New" w:cs="Courier New"/>
+        </w:rPr>
+      </w:pPr>
+      <w:r>
+        <w:rPr>
+          <w:rFonts w:ascii="Courier New" w:hAnsi="Courier New" w:cs="Courier New"/>
+        </w:rPr>
+        <w:tab/>
+      </w:r>
+      <w:r>
+        <w:rPr>
+          <w:rFonts w:ascii="Courier New" w:hAnsi="Courier New" w:cs="Courier New"/>
+        </w:rPr>
+        <w:tab/>
+      </w:r>
+      <w:proofErr w:type="spellStart"/>
+      <w:proofErr w:type="gramStart"/>
+      <w:r>
+        <w:rPr>
+          <w:rFonts w:ascii="Courier New" w:hAnsi="Courier New" w:cs="Courier New"/>
+        </w:rPr>
+        <w:t>dataSize</w:t>
+      </w:r>
+      <w:proofErr w:type="spellEnd"/>
+      <w:proofErr w:type="gramEnd"/>
+      <w:r>
+        <w:rPr>
+          <w:rFonts w:ascii="Courier New" w:hAnsi="Courier New" w:cs="Courier New"/>
+        </w:rPr>
+        <w:t xml:space="preserve"> &lt;- min( </w:t>
+      </w:r>
+      <w:proofErr w:type="spellStart"/>
+      <w:r>
+        <w:rPr>
+          <w:rFonts w:ascii="Courier New" w:hAnsi="Courier New" w:cs="Courier New"/>
+        </w:rPr>
+        <w:t>bufferSize</w:t>
+      </w:r>
+      <w:proofErr w:type="spellEnd"/>
+      <w:r>
+        <w:rPr>
+          <w:rFonts w:ascii="Courier New" w:hAnsi="Courier New" w:cs="Courier New"/>
+        </w:rPr>
+        <w:t>, 1019 )</w:t>
+      </w:r>
     </w:p>
     <w:p>
       <w:pPr>
@@ -1462,8 +1999,24 @@
         <w:rPr>
           <w:rFonts w:ascii="Courier New" w:hAnsi="Courier New" w:cs="Courier New"/>
         </w:rPr>
-        <w:t>Response &lt;- waitForSendResponse()</w:t>
-      </w:r>
+        <w:t xml:space="preserve">Response &lt;- </w:t>
+      </w:r>
+      <w:proofErr w:type="spellStart"/>
+      <w:proofErr w:type="gramStart"/>
+      <w:r>
+        <w:rPr>
+          <w:rFonts w:ascii="Courier New" w:hAnsi="Courier New" w:cs="Courier New"/>
+        </w:rPr>
+        <w:t>waitForSendResponse</w:t>
+      </w:r>
+      <w:proofErr w:type="spellEnd"/>
+      <w:r>
+        <w:rPr>
+          <w:rFonts w:ascii="Courier New" w:hAnsi="Courier New" w:cs="Courier New"/>
+        </w:rPr>
+        <w:t>()</w:t>
+      </w:r>
+      <w:proofErr w:type="gramEnd"/>
     </w:p>
     <w:p>
       <w:pPr>
@@ -1498,7 +2051,21 @@
           <w:rFonts w:ascii="Courier New" w:hAnsi="Courier New" w:cs="Courier New"/>
         </w:rPr>
         <w:tab/>
-        <w:t xml:space="preserve">If ( response = </w:t>
+        <w:t xml:space="preserve">If </w:t>
+      </w:r>
+      <w:proofErr w:type="gramStart"/>
+      <w:r>
+        <w:rPr>
+          <w:rFonts w:ascii="Courier New" w:hAnsi="Courier New" w:cs="Courier New"/>
+        </w:rPr>
+        <w:t>( response</w:t>
+      </w:r>
+      <w:proofErr w:type="gramEnd"/>
+      <w:r>
+        <w:rPr>
+          <w:rFonts w:ascii="Courier New" w:hAnsi="Courier New" w:cs="Courier New"/>
+        </w:rPr>
+        <w:t xml:space="preserve"> = </w:t>
       </w:r>
       <w:r>
         <w:rPr>
@@ -1569,6 +2136,7 @@
         <w:tab/>
         <w:t xml:space="preserve">Remove </w:t>
       </w:r>
+      <w:proofErr w:type="spellStart"/>
       <w:r>
         <w:rPr>
           <w:rFonts w:ascii="Courier New" w:hAnsi="Courier New" w:cs="Courier New"/>
@@ -1579,19 +2147,27 @@
         <w:rPr>
           <w:rFonts w:ascii="Courier New" w:hAnsi="Courier New" w:cs="Courier New"/>
         </w:rPr>
-        <w:t>Size bits from buffer</w:t>
-      </w:r>
-    </w:p>
-    <w:p>
-      <w:pPr>
-        <w:rPr>
-          <w:rFonts w:ascii="Courier New" w:hAnsi="Courier New" w:cs="Courier New"/>
-        </w:rPr>
-      </w:pPr>
-      <w:r>
-        <w:rPr>
-          <w:rFonts w:ascii="Courier New" w:hAnsi="Courier New" w:cs="Courier New"/>
-        </w:rPr>
+        <w:t>Size</w:t>
+      </w:r>
+      <w:proofErr w:type="spellEnd"/>
+      <w:r>
+        <w:rPr>
+          <w:rFonts w:ascii="Courier New" w:hAnsi="Courier New" w:cs="Courier New"/>
+        </w:rPr>
+        <w:t xml:space="preserve"> bits from buffer</w:t>
+      </w:r>
+    </w:p>
+    <w:p>
+      <w:pPr>
+        <w:rPr>
+          <w:rFonts w:ascii="Courier New" w:hAnsi="Courier New" w:cs="Courier New"/>
+        </w:rPr>
+      </w:pPr>
+      <w:r>
+        <w:rPr>
+          <w:rFonts w:ascii="Courier New" w:hAnsi="Courier New" w:cs="Courier New"/>
+        </w:rPr>
+        <w:lastRenderedPageBreak/>
         <w:tab/>
       </w:r>
       <w:r>
@@ -1636,11 +2212,6 @@
           <w:rFonts w:ascii="Courier New" w:hAnsi="Courier New" w:cs="Courier New"/>
         </w:rPr>
         <w:tab/>
-      </w:r>
-      <w:r>
-        <w:rPr>
-          <w:rFonts w:ascii="Courier New" w:hAnsi="Courier New" w:cs="Courier New"/>
-        </w:rPr>
         <w:t>Misses &lt;- misses + 1</w:t>
       </w:r>
     </w:p>
@@ -1713,7 +2284,29 @@
         <w:rPr>
           <w:rFonts w:ascii="Courier New" w:hAnsi="Courier New" w:cs="Courier New"/>
         </w:rPr>
-        <w:t>Function constructPacket( packet</w:t>
+        <w:t xml:space="preserve">Function </w:t>
+      </w:r>
+      <w:proofErr w:type="spellStart"/>
+      <w:proofErr w:type="gramStart"/>
+      <w:r>
+        <w:rPr>
+          <w:rFonts w:ascii="Courier New" w:hAnsi="Courier New" w:cs="Courier New"/>
+        </w:rPr>
+        <w:t>constructPacket</w:t>
+      </w:r>
+      <w:proofErr w:type="spellEnd"/>
+      <w:r>
+        <w:rPr>
+          <w:rFonts w:ascii="Courier New" w:hAnsi="Courier New" w:cs="Courier New"/>
+        </w:rPr>
+        <w:t>(</w:t>
+      </w:r>
+      <w:proofErr w:type="gramEnd"/>
+      <w:r>
+        <w:rPr>
+          <w:rFonts w:ascii="Courier New" w:hAnsi="Courier New" w:cs="Courier New"/>
+        </w:rPr>
+        <w:t xml:space="preserve"> packet</w:t>
       </w:r>
       <w:r>
         <w:rPr>
@@ -1721,12 +2314,14 @@
         </w:rPr>
         <w:t xml:space="preserve">, </w:t>
       </w:r>
+      <w:proofErr w:type="spellStart"/>
       <w:r>
         <w:rPr>
           <w:rFonts w:ascii="Courier New" w:hAnsi="Courier New" w:cs="Courier New"/>
         </w:rPr>
         <w:t>maxSends</w:t>
       </w:r>
+      <w:proofErr w:type="spellEnd"/>
       <w:r>
         <w:rPr>
           <w:rFonts w:ascii="Courier New" w:hAnsi="Courier New" w:cs="Courier New"/>
@@ -1750,7 +2345,21 @@
         <w:rPr>
           <w:rFonts w:ascii="Courier New" w:hAnsi="Courier New" w:cs="Courier New"/>
         </w:rPr>
-        <w:t>If ( buffer &gt; 1019</w:t>
+        <w:t xml:space="preserve">If </w:t>
+      </w:r>
+      <w:proofErr w:type="gramStart"/>
+      <w:r>
+        <w:rPr>
+          <w:rFonts w:ascii="Courier New" w:hAnsi="Courier New" w:cs="Courier New"/>
+        </w:rPr>
+        <w:t>( buffer</w:t>
+      </w:r>
+      <w:proofErr w:type="gramEnd"/>
+      <w:r>
+        <w:rPr>
+          <w:rFonts w:ascii="Courier New" w:hAnsi="Courier New" w:cs="Courier New"/>
+        </w:rPr>
+        <w:t xml:space="preserve"> &gt; 1019</w:t>
       </w:r>
       <w:r>
         <w:rPr>
@@ -1768,8 +2377,16 @@
         <w:rPr>
           <w:rFonts w:ascii="Courier New" w:hAnsi="Courier New" w:cs="Courier New"/>
         </w:rPr>
-        <w:t>not maxSends</w:t>
-      </w:r>
+        <w:t xml:space="preserve">not </w:t>
+      </w:r>
+      <w:proofErr w:type="spellStart"/>
+      <w:r>
+        <w:rPr>
+          <w:rFonts w:ascii="Courier New" w:hAnsi="Courier New" w:cs="Courier New"/>
+        </w:rPr>
+        <w:t>maxSends</w:t>
+      </w:r>
+      <w:proofErr w:type="spellEnd"/>
       <w:r>
         <w:rPr>
           <w:rFonts w:ascii="Courier New" w:hAnsi="Courier New" w:cs="Courier New"/>
@@ -1839,7 +2456,21 @@
         <w:rPr>
           <w:rFonts w:ascii="Courier New" w:hAnsi="Courier New" w:cs="Courier New"/>
         </w:rPr>
-        <w:t xml:space="preserve"> buffer[i]</w:t>
+        <w:t xml:space="preserve"> buffer[</w:t>
+      </w:r>
+      <w:proofErr w:type="spellStart"/>
+      <w:r>
+        <w:rPr>
+          <w:rFonts w:ascii="Courier New" w:hAnsi="Courier New" w:cs="Courier New"/>
+        </w:rPr>
+        <w:t>i</w:t>
+      </w:r>
+      <w:proofErr w:type="spellEnd"/>
+      <w:r>
+        <w:rPr>
+          <w:rFonts w:ascii="Courier New" w:hAnsi="Courier New" w:cs="Courier New"/>
+        </w:rPr>
+        <w:t>]</w:t>
       </w:r>
       <w:r>
         <w:rPr>
@@ -1872,7 +2503,6 @@
         <w:rPr>
           <w:rFonts w:ascii="Courier New" w:hAnsi="Courier New" w:cs="Courier New"/>
         </w:rPr>
-        <w:lastRenderedPageBreak/>
         <w:tab/>
       </w:r>
       <w:r>
@@ -1926,7 +2556,21 @@
           <w:rFonts w:ascii="Courier New" w:hAnsi="Courier New" w:cs="Courier New"/>
         </w:rPr>
         <w:tab/>
-        <w:t>Packet &lt;- packet + buffer[i]</w:t>
+        <w:t>Packet &lt;- packet + buffer[</w:t>
+      </w:r>
+      <w:proofErr w:type="spellStart"/>
+      <w:r>
+        <w:rPr>
+          <w:rFonts w:ascii="Courier New" w:hAnsi="Courier New" w:cs="Courier New"/>
+        </w:rPr>
+        <w:t>i</w:t>
+      </w:r>
+      <w:proofErr w:type="spellEnd"/>
+      <w:r>
+        <w:rPr>
+          <w:rFonts w:ascii="Courier New" w:hAnsi="Courier New" w:cs="Courier New"/>
+        </w:rPr>
+        <w:t>]</w:t>
       </w:r>
     </w:p>
     <w:p>
@@ -2021,11 +2665,27 @@
         </w:rPr>
         <w:tab/>
       </w:r>
-      <w:r>
-        <w:rPr>
-          <w:rFonts w:ascii="Courier New" w:hAnsi="Courier New" w:cs="Courier New"/>
-        </w:rPr>
-        <w:t>setCRC( packet )</w:t>
+      <w:proofErr w:type="spellStart"/>
+      <w:proofErr w:type="gramStart"/>
+      <w:r>
+        <w:rPr>
+          <w:rFonts w:ascii="Courier New" w:hAnsi="Courier New" w:cs="Courier New"/>
+        </w:rPr>
+        <w:t>setCRC</w:t>
+      </w:r>
+      <w:proofErr w:type="spellEnd"/>
+      <w:r>
+        <w:rPr>
+          <w:rFonts w:ascii="Courier New" w:hAnsi="Courier New" w:cs="Courier New"/>
+        </w:rPr>
+        <w:t>(</w:t>
+      </w:r>
+      <w:proofErr w:type="gramEnd"/>
+      <w:r>
+        <w:rPr>
+          <w:rFonts w:ascii="Courier New" w:hAnsi="Courier New" w:cs="Courier New"/>
+        </w:rPr>
+        <w:t xml:space="preserve"> packet )</w:t>
       </w:r>
     </w:p>
     <w:p>
@@ -2058,26 +2718,56 @@
         <w:rPr>
           <w:rFonts w:ascii="Courier New" w:hAnsi="Courier New" w:cs="Courier New"/>
         </w:rPr>
-        <w:t>Function setCRC( packet ) {</w:t>
-      </w:r>
-    </w:p>
-    <w:p>
-      <w:pPr>
-        <w:rPr>
-          <w:rFonts w:ascii="Courier New" w:hAnsi="Courier New" w:cs="Courier New"/>
-        </w:rPr>
-      </w:pPr>
-      <w:r>
-        <w:rPr>
-          <w:rFonts w:ascii="Courier New" w:hAnsi="Courier New" w:cs="Courier New"/>
-        </w:rPr>
-        <w:tab/>
-      </w:r>
-      <w:r>
-        <w:rPr>
-          <w:rFonts w:ascii="Courier New" w:hAnsi="Courier New" w:cs="Courier New"/>
-        </w:rPr>
-        <w:t xml:space="preserve">Crc &lt;- Create CRC with dividend </w:t>
+        <w:t xml:space="preserve">Function </w:t>
+      </w:r>
+      <w:proofErr w:type="spellStart"/>
+      <w:proofErr w:type="gramStart"/>
+      <w:r>
+        <w:rPr>
+          <w:rFonts w:ascii="Courier New" w:hAnsi="Courier New" w:cs="Courier New"/>
+        </w:rPr>
+        <w:t>setCRC</w:t>
+      </w:r>
+      <w:proofErr w:type="spellEnd"/>
+      <w:r>
+        <w:rPr>
+          <w:rFonts w:ascii="Courier New" w:hAnsi="Courier New" w:cs="Courier New"/>
+        </w:rPr>
+        <w:t>(</w:t>
+      </w:r>
+      <w:proofErr w:type="gramEnd"/>
+      <w:r>
+        <w:rPr>
+          <w:rFonts w:ascii="Courier New" w:hAnsi="Courier New" w:cs="Courier New"/>
+        </w:rPr>
+        <w:t xml:space="preserve"> packet ) {</w:t>
+      </w:r>
+    </w:p>
+    <w:p>
+      <w:pPr>
+        <w:rPr>
+          <w:rFonts w:ascii="Courier New" w:hAnsi="Courier New" w:cs="Courier New"/>
+        </w:rPr>
+      </w:pPr>
+      <w:r>
+        <w:rPr>
+          <w:rFonts w:ascii="Courier New" w:hAnsi="Courier New" w:cs="Courier New"/>
+        </w:rPr>
+        <w:tab/>
+      </w:r>
+      <w:proofErr w:type="spellStart"/>
+      <w:r>
+        <w:rPr>
+          <w:rFonts w:ascii="Courier New" w:hAnsi="Courier New" w:cs="Courier New"/>
+        </w:rPr>
+        <w:t>Crc</w:t>
+      </w:r>
+      <w:proofErr w:type="spellEnd"/>
+      <w:r>
+        <w:rPr>
+          <w:rFonts w:ascii="Courier New" w:hAnsi="Courier New" w:cs="Courier New"/>
+        </w:rPr>
+        <w:t xml:space="preserve"> &lt;- Create CRC with dividend </w:t>
       </w:r>
       <w:r>
         <w:rPr>
@@ -2097,8 +2787,16 @@
           <w:rFonts w:ascii="Courier New" w:hAnsi="Courier New" w:cs="Courier New"/>
         </w:rPr>
         <w:tab/>
-        <w:t>Packet &lt;- packet + crc</w:t>
-      </w:r>
+        <w:t xml:space="preserve">Packet &lt;- packet + </w:t>
+      </w:r>
+      <w:proofErr w:type="spellStart"/>
+      <w:r>
+        <w:rPr>
+          <w:rFonts w:ascii="Courier New" w:hAnsi="Courier New" w:cs="Courier New"/>
+        </w:rPr>
+        <w:t>crc</w:t>
+      </w:r>
+      <w:proofErr w:type="spellEnd"/>
     </w:p>
     <w:p>
       <w:pPr>
@@ -3578,7 +4276,7 @@
 </file>
 
 <file path=customXml/itemProps1.xml><?xml version="1.0" encoding="utf-8"?>
-<ds:datastoreItem xmlns:ds="http://schemas.openxmlformats.org/officeDocument/2006/customXml" ds:itemID="{9EA5DCE3-F2DD-49F2-A678-1B37E35E0ADB}">
+<ds:datastoreItem xmlns:ds="http://schemas.openxmlformats.org/officeDocument/2006/customXml" ds:itemID="{4DE02054-2233-476E-BBF6-41FA85C82F06}">
   <ds:schemaRefs>
     <ds:schemaRef ds:uri="http://schemas.openxmlformats.org/officeDocument/2006/bibliography"/>
   </ds:schemaRefs>

</xml_diff>

<commit_message>
Added all people to the design doc headers. Added work breakdown document.
</commit_message>
<xml_diff>
--- a/Design & Documents/Design Document.docx
+++ b/Design & Documents/Design Document.docx
@@ -23,7 +23,13 @@
         <w:t>4</w:t>
       </w:r>
       <w:r>
-        <w:t xml:space="preserve"> - Design</w:t>
+        <w:t xml:space="preserve"> </w:t>
+      </w:r>
+      <w:r>
+        <w:t>–</w:t>
+      </w:r>
+      <w:r>
+        <w:t xml:space="preserve"> Design</w:t>
       </w:r>
     </w:p>
     <w:p>
@@ -31,42 +37,93 @@
         <w:pStyle w:val="Heading1"/>
         <w:jc w:val="center"/>
       </w:pPr>
-      <w:bookmarkStart w:id="0" w:name="_Toc400292400"/>
-      <w:bookmarkStart w:id="1" w:name="_Toc400706064"/>
-      <w:bookmarkStart w:id="2" w:name="_Toc402038350"/>
-      <w:r>
-        <w:t>Christofer Klassen – A00879060 – Set 3O</w:t>
+      <w:bookmarkStart w:id="0" w:name="_Toc403716930"/>
+      <w:r>
+        <w:t>Lewis Scott – A0</w:t>
+      </w:r>
+      <w:r>
+        <w:t>0855385</w:t>
+      </w:r>
+      <w:r>
+        <w:t xml:space="preserve"> – Set 3O</w:t>
       </w:r>
       <w:bookmarkEnd w:id="0"/>
+    </w:p>
+    <w:p>
+      <w:pPr>
+        <w:pStyle w:val="Heading1"/>
+        <w:jc w:val="center"/>
+      </w:pPr>
+      <w:bookmarkStart w:id="1" w:name="_Toc400292400"/>
+      <w:bookmarkStart w:id="2" w:name="_Toc400706064"/>
+      <w:bookmarkStart w:id="3" w:name="_Toc403716931"/>
+      <w:proofErr w:type="spellStart"/>
+      <w:r>
+        <w:t>Christofer</w:t>
+      </w:r>
+      <w:proofErr w:type="spellEnd"/>
+      <w:r>
+        <w:t xml:space="preserve"> Klassen – A00879060 – Set 3O</w:t>
+      </w:r>
       <w:bookmarkEnd w:id="1"/>
       <w:bookmarkEnd w:id="2"/>
+      <w:bookmarkEnd w:id="3"/>
     </w:p>
     <w:p>
       <w:pPr>
         <w:pStyle w:val="Heading1"/>
         <w:jc w:val="center"/>
       </w:pPr>
-      <w:bookmarkStart w:id="3" w:name="_Toc400292401"/>
-      <w:bookmarkStart w:id="4" w:name="_Toc400706065"/>
-      <w:bookmarkStart w:id="5" w:name="_Toc402038351"/>
-      <w:r>
-        <w:t>Jeff Bayn</w:t>
+      <w:bookmarkStart w:id="4" w:name="_Toc400292401"/>
+      <w:bookmarkStart w:id="5" w:name="_Toc400706065"/>
+      <w:bookmarkStart w:id="6" w:name="_Toc403716932"/>
+      <w:r>
+        <w:t xml:space="preserve">Jeff </w:t>
+      </w:r>
+      <w:proofErr w:type="spellStart"/>
+      <w:r>
+        <w:t>Bayn</w:t>
       </w:r>
       <w:r>
         <w:t>tun</w:t>
       </w:r>
+      <w:proofErr w:type="spellEnd"/>
       <w:r>
         <w:t xml:space="preserve"> – </w:t>
       </w:r>
       <w:r>
-        <w:t xml:space="preserve">A00860994 </w:t>
+        <w:t>A0086099</w:t>
+      </w:r>
+      <w:bookmarkStart w:id="7" w:name="_GoBack"/>
+      <w:bookmarkEnd w:id="7"/>
+      <w:r>
+        <w:t xml:space="preserve">4 </w:t>
       </w:r>
       <w:r>
         <w:t>– Set 3O</w:t>
       </w:r>
-      <w:bookmarkEnd w:id="3"/>
       <w:bookmarkEnd w:id="4"/>
       <w:bookmarkEnd w:id="5"/>
+      <w:bookmarkEnd w:id="6"/>
+    </w:p>
+    <w:p>
+      <w:pPr>
+        <w:pStyle w:val="Heading1"/>
+        <w:jc w:val="center"/>
+      </w:pPr>
+      <w:bookmarkStart w:id="8" w:name="_Toc403716933"/>
+      <w:r>
+        <w:t xml:space="preserve">Thomas </w:t>
+      </w:r>
+      <w:proofErr w:type="spellStart"/>
+      <w:r>
+        <w:t>Tallentire</w:t>
+      </w:r>
+      <w:proofErr w:type="spellEnd"/>
+      <w:r>
+        <w:t xml:space="preserve"> – A00000000 – Set 3O</w:t>
+      </w:r>
+      <w:bookmarkEnd w:id="8"/>
     </w:p>
     <w:sdt>
       <w:sdtPr>
@@ -111,7 +168,7 @@
               <w:noProof/>
               <w:sz w:val="22"/>
               <w:szCs w:val="22"/>
-              <w:lang w:val="en-US"/>
+              <w:lang w:eastAsia="en-CA"/>
             </w:rPr>
           </w:pPr>
           <w:r>
@@ -123,13 +180,13 @@
           <w:r>
             <w:fldChar w:fldCharType="separate"/>
           </w:r>
-          <w:hyperlink w:anchor="_Toc402038350" w:history="1">
+          <w:hyperlink w:anchor="_Toc403716934" w:history="1">
             <w:r>
               <w:rPr>
                 <w:rStyle w:val="Hyperlink"/>
                 <w:noProof/>
               </w:rPr>
-              <w:t>Christofer Klassen – A00879060 – Set 3O</w:t>
+              <w:t>State Flow Diagram</w:t>
             </w:r>
             <w:r>
               <w:rPr>
@@ -150,7 +207,7 @@
                 <w:noProof/>
                 <w:webHidden/>
               </w:rPr>
-              <w:instrText xml:space="preserve"> PAGEREF _Toc402038350 \h </w:instrText>
+              <w:instrText xml:space="preserve"> PAGEREF _Toc403716934 \h </w:instrText>
             </w:r>
             <w:r>
               <w:rPr>
@@ -170,7 +227,7 @@
                 <w:noProof/>
                 <w:webHidden/>
               </w:rPr>
-              <w:t>1</w:t>
+              <w:t>2</w:t>
             </w:r>
             <w:r>
               <w:rPr>
@@ -191,16 +248,16 @@
               <w:noProof/>
               <w:sz w:val="22"/>
               <w:szCs w:val="22"/>
-              <w:lang w:val="en-US"/>
+              <w:lang w:eastAsia="en-CA"/>
             </w:rPr>
           </w:pPr>
-          <w:hyperlink w:anchor="_Toc402038351" w:history="1">
+          <w:hyperlink w:anchor="_Toc403716935" w:history="1">
             <w:r>
               <w:rPr>
                 <w:rStyle w:val="Hyperlink"/>
                 <w:noProof/>
               </w:rPr>
-              <w:t>Jeff Bayntun – A00860994 – Set 3O</w:t>
+              <w:t>Pseudo Code</w:t>
             </w:r>
             <w:r>
               <w:rPr>
@@ -221,149 +278,7 @@
                 <w:noProof/>
                 <w:webHidden/>
               </w:rPr>
-              <w:instrText xml:space="preserve"> PAGEREF _Toc402038351 \h </w:instrText>
-            </w:r>
-            <w:r>
-              <w:rPr>
-                <w:noProof/>
-                <w:webHidden/>
-              </w:rPr>
-            </w:r>
-            <w:r>
-              <w:rPr>
-                <w:noProof/>
-                <w:webHidden/>
-              </w:rPr>
-              <w:fldChar w:fldCharType="separate"/>
-            </w:r>
-            <w:r>
-              <w:rPr>
-                <w:noProof/>
-                <w:webHidden/>
-              </w:rPr>
-              <w:t>1</w:t>
-            </w:r>
-            <w:r>
-              <w:rPr>
-                <w:noProof/>
-                <w:webHidden/>
-              </w:rPr>
-              <w:fldChar w:fldCharType="end"/>
-            </w:r>
-          </w:hyperlink>
-        </w:p>
-        <w:p>
-          <w:pPr>
-            <w:pStyle w:val="TOC1"/>
-            <w:tabs>
-              <w:tab w:val="right" w:leader="dot" w:pos="9350"/>
-            </w:tabs>
-            <w:rPr>
-              <w:noProof/>
-              <w:sz w:val="22"/>
-              <w:szCs w:val="22"/>
-              <w:lang w:val="en-US"/>
-            </w:rPr>
-          </w:pPr>
-          <w:hyperlink w:anchor="_Toc402038352" w:history="1">
-            <w:r>
-              <w:rPr>
-                <w:rStyle w:val="Hyperlink"/>
-                <w:noProof/>
-              </w:rPr>
-              <w:t>State Flow Diagram</w:t>
-            </w:r>
-            <w:r>
-              <w:rPr>
-                <w:noProof/>
-                <w:webHidden/>
-              </w:rPr>
-              <w:tab/>
-            </w:r>
-            <w:r>
-              <w:rPr>
-                <w:noProof/>
-                <w:webHidden/>
-              </w:rPr>
-              <w:fldChar w:fldCharType="begin"/>
-            </w:r>
-            <w:r>
-              <w:rPr>
-                <w:noProof/>
-                <w:webHidden/>
-              </w:rPr>
-              <w:instrText xml:space="preserve"> PAGEREF _Toc402038352 \h </w:instrText>
-            </w:r>
-            <w:r>
-              <w:rPr>
-                <w:noProof/>
-                <w:webHidden/>
-              </w:rPr>
-            </w:r>
-            <w:r>
-              <w:rPr>
-                <w:noProof/>
-                <w:webHidden/>
-              </w:rPr>
-              <w:fldChar w:fldCharType="separate"/>
-            </w:r>
-            <w:r>
-              <w:rPr>
-                <w:noProof/>
-                <w:webHidden/>
-              </w:rPr>
-              <w:t>2</w:t>
-            </w:r>
-            <w:r>
-              <w:rPr>
-                <w:noProof/>
-                <w:webHidden/>
-              </w:rPr>
-              <w:fldChar w:fldCharType="end"/>
-            </w:r>
-          </w:hyperlink>
-        </w:p>
-        <w:p>
-          <w:pPr>
-            <w:pStyle w:val="TOC1"/>
-            <w:tabs>
-              <w:tab w:val="right" w:leader="dot" w:pos="9350"/>
-            </w:tabs>
-            <w:rPr>
-              <w:noProof/>
-              <w:sz w:val="22"/>
-              <w:szCs w:val="22"/>
-              <w:lang w:val="en-US"/>
-            </w:rPr>
-          </w:pPr>
-          <w:hyperlink w:anchor="_Toc402038353" w:history="1">
-            <w:r>
-              <w:rPr>
-                <w:rStyle w:val="Hyperlink"/>
-                <w:noProof/>
-              </w:rPr>
-              <w:t>Pseudo Code</w:t>
-            </w:r>
-            <w:r>
-              <w:rPr>
-                <w:noProof/>
-                <w:webHidden/>
-              </w:rPr>
-              <w:tab/>
-            </w:r>
-            <w:r>
-              <w:rPr>
-                <w:noProof/>
-                <w:webHidden/>
-              </w:rPr>
-              <w:fldChar w:fldCharType="begin"/>
-            </w:r>
-            <w:r>
-              <w:rPr>
-                <w:noProof/>
-                <w:webHidden/>
-              </w:rPr>
-              <w:instrText xml:space="preserve"> PAGEREF _Toc402038353 \h </w:instrText>
+              <w:instrText xml:space="preserve"> PAGEREF _Toc403716935 \h </w:instrText>
             </w:r>
             <w:r>
               <w:rPr>
@@ -404,16 +319,16 @@
               <w:noProof/>
               <w:sz w:val="22"/>
               <w:szCs w:val="22"/>
-              <w:lang w:val="en-US"/>
+              <w:lang w:eastAsia="en-CA"/>
             </w:rPr>
           </w:pPr>
-          <w:hyperlink w:anchor="_Toc402038354" w:history="1">
+          <w:hyperlink w:anchor="_Toc403716936" w:history="1">
             <w:r>
               <w:rPr>
                 <w:rStyle w:val="Hyperlink"/>
                 <w:noProof/>
               </w:rPr>
-              <w:t>dcgps.c</w:t>
+              <w:t>Setup</w:t>
             </w:r>
             <w:r>
               <w:rPr>
@@ -434,7 +349,7 @@
                 <w:noProof/>
                 <w:webHidden/>
               </w:rPr>
-              <w:instrText xml:space="preserve"> PAGEREF _Toc402038354 \h </w:instrText>
+              <w:instrText xml:space="preserve"> PAGEREF _Toc403716936 \h </w:instrText>
             </w:r>
             <w:r>
               <w:rPr>
@@ -475,16 +390,16 @@
               <w:noProof/>
               <w:sz w:val="22"/>
               <w:szCs w:val="22"/>
-              <w:lang w:val="en-US"/>
+              <w:lang w:eastAsia="en-CA"/>
             </w:rPr>
           </w:pPr>
-          <w:hyperlink w:anchor="_Toc402038355" w:history="1">
+          <w:hyperlink w:anchor="_Toc403716937" w:history="1">
             <w:r>
               <w:rPr>
                 <w:rStyle w:val="Hyperlink"/>
                 <w:noProof/>
               </w:rPr>
-              <w:t>gps-util.c</w:t>
+              <w:t>Idle</w:t>
             </w:r>
             <w:r>
               <w:rPr>
@@ -505,7 +420,7 @@
                 <w:noProof/>
                 <w:webHidden/>
               </w:rPr>
-              <w:instrText xml:space="preserve"> PAGEREF _Toc402038355 \h </w:instrText>
+              <w:instrText xml:space="preserve"> PAGEREF _Toc403716937 \h </w:instrText>
             </w:r>
             <w:r>
               <w:rPr>
@@ -546,16 +461,16 @@
               <w:noProof/>
               <w:sz w:val="22"/>
               <w:szCs w:val="22"/>
-              <w:lang w:val="en-US"/>
+              <w:lang w:eastAsia="en-CA"/>
             </w:rPr>
           </w:pPr>
-          <w:hyperlink w:anchor="_Toc402038356" w:history="1">
+          <w:hyperlink w:anchor="_Toc403716938" w:history="1">
             <w:r>
               <w:rPr>
                 <w:rStyle w:val="Hyperlink"/>
                 <w:noProof/>
               </w:rPr>
-              <w:t>gpsprint.c</w:t>
+              <w:t>Receive Start</w:t>
             </w:r>
             <w:r>
               <w:rPr>
@@ -576,7 +491,7 @@
                 <w:noProof/>
                 <w:webHidden/>
               </w:rPr>
-              <w:instrText xml:space="preserve"> PAGEREF _Toc402038356 \h </w:instrText>
+              <w:instrText xml:space="preserve"> PAGEREF _Toc403716938 \h </w:instrText>
             </w:r>
             <w:r>
               <w:rPr>
@@ -597,6 +512,219 @@
                 <w:webHidden/>
               </w:rPr>
               <w:t>3</w:t>
+            </w:r>
+            <w:r>
+              <w:rPr>
+                <w:noProof/>
+                <w:webHidden/>
+              </w:rPr>
+              <w:fldChar w:fldCharType="end"/>
+            </w:r>
+          </w:hyperlink>
+        </w:p>
+        <w:p>
+          <w:pPr>
+            <w:pStyle w:val="TOC2"/>
+            <w:tabs>
+              <w:tab w:val="right" w:leader="dot" w:pos="9350"/>
+            </w:tabs>
+            <w:rPr>
+              <w:noProof/>
+              <w:sz w:val="22"/>
+              <w:szCs w:val="22"/>
+              <w:lang w:eastAsia="en-CA"/>
+            </w:rPr>
+          </w:pPr>
+          <w:hyperlink w:anchor="_Toc403716939" w:history="1">
+            <w:r>
+              <w:rPr>
+                <w:rStyle w:val="Hyperlink"/>
+                <w:noProof/>
+              </w:rPr>
+              <w:t>Receive Start</w:t>
+            </w:r>
+            <w:r>
+              <w:rPr>
+                <w:noProof/>
+                <w:webHidden/>
+              </w:rPr>
+              <w:tab/>
+            </w:r>
+            <w:r>
+              <w:rPr>
+                <w:noProof/>
+                <w:webHidden/>
+              </w:rPr>
+              <w:fldChar w:fldCharType="begin"/>
+            </w:r>
+            <w:r>
+              <w:rPr>
+                <w:noProof/>
+                <w:webHidden/>
+              </w:rPr>
+              <w:instrText xml:space="preserve"> PAGEREF _Toc403716939 \h </w:instrText>
+            </w:r>
+            <w:r>
+              <w:rPr>
+                <w:noProof/>
+                <w:webHidden/>
+              </w:rPr>
+            </w:r>
+            <w:r>
+              <w:rPr>
+                <w:noProof/>
+                <w:webHidden/>
+              </w:rPr>
+              <w:fldChar w:fldCharType="separate"/>
+            </w:r>
+            <w:r>
+              <w:rPr>
+                <w:noProof/>
+                <w:webHidden/>
+              </w:rPr>
+              <w:t>4</w:t>
+            </w:r>
+            <w:r>
+              <w:rPr>
+                <w:noProof/>
+                <w:webHidden/>
+              </w:rPr>
+              <w:fldChar w:fldCharType="end"/>
+            </w:r>
+          </w:hyperlink>
+        </w:p>
+        <w:p>
+          <w:pPr>
+            <w:pStyle w:val="TOC2"/>
+            <w:tabs>
+              <w:tab w:val="right" w:leader="dot" w:pos="9350"/>
+            </w:tabs>
+            <w:rPr>
+              <w:noProof/>
+              <w:sz w:val="22"/>
+              <w:szCs w:val="22"/>
+              <w:lang w:eastAsia="en-CA"/>
+            </w:rPr>
+          </w:pPr>
+          <w:hyperlink w:anchor="_Toc403716940" w:history="1">
+            <w:r>
+              <w:rPr>
+                <w:rStyle w:val="Hyperlink"/>
+                <w:noProof/>
+              </w:rPr>
+              <w:t>Send Start</w:t>
+            </w:r>
+            <w:r>
+              <w:rPr>
+                <w:noProof/>
+                <w:webHidden/>
+              </w:rPr>
+              <w:tab/>
+            </w:r>
+            <w:r>
+              <w:rPr>
+                <w:noProof/>
+                <w:webHidden/>
+              </w:rPr>
+              <w:fldChar w:fldCharType="begin"/>
+            </w:r>
+            <w:r>
+              <w:rPr>
+                <w:noProof/>
+                <w:webHidden/>
+              </w:rPr>
+              <w:instrText xml:space="preserve"> PAGEREF _Toc403716940 \h </w:instrText>
+            </w:r>
+            <w:r>
+              <w:rPr>
+                <w:noProof/>
+                <w:webHidden/>
+              </w:rPr>
+            </w:r>
+            <w:r>
+              <w:rPr>
+                <w:noProof/>
+                <w:webHidden/>
+              </w:rPr>
+              <w:fldChar w:fldCharType="separate"/>
+            </w:r>
+            <w:r>
+              <w:rPr>
+                <w:noProof/>
+                <w:webHidden/>
+              </w:rPr>
+              <w:t>5</w:t>
+            </w:r>
+            <w:r>
+              <w:rPr>
+                <w:noProof/>
+                <w:webHidden/>
+              </w:rPr>
+              <w:fldChar w:fldCharType="end"/>
+            </w:r>
+          </w:hyperlink>
+        </w:p>
+        <w:p>
+          <w:pPr>
+            <w:pStyle w:val="TOC2"/>
+            <w:tabs>
+              <w:tab w:val="right" w:leader="dot" w:pos="9350"/>
+            </w:tabs>
+            <w:rPr>
+              <w:noProof/>
+              <w:sz w:val="22"/>
+              <w:szCs w:val="22"/>
+              <w:lang w:eastAsia="en-CA"/>
+            </w:rPr>
+          </w:pPr>
+          <w:hyperlink w:anchor="_Toc403716941" w:history="1">
+            <w:r>
+              <w:rPr>
+                <w:rStyle w:val="Hyperlink"/>
+                <w:noProof/>
+              </w:rPr>
+              <w:t>Send Data</w:t>
+            </w:r>
+            <w:r>
+              <w:rPr>
+                <w:noProof/>
+                <w:webHidden/>
+              </w:rPr>
+              <w:tab/>
+            </w:r>
+            <w:r>
+              <w:rPr>
+                <w:noProof/>
+                <w:webHidden/>
+              </w:rPr>
+              <w:fldChar w:fldCharType="begin"/>
+            </w:r>
+            <w:r>
+              <w:rPr>
+                <w:noProof/>
+                <w:webHidden/>
+              </w:rPr>
+              <w:instrText xml:space="preserve"> PAGEREF _Toc403716941 \h </w:instrText>
+            </w:r>
+            <w:r>
+              <w:rPr>
+                <w:noProof/>
+                <w:webHidden/>
+              </w:rPr>
+            </w:r>
+            <w:r>
+              <w:rPr>
+                <w:noProof/>
+                <w:webHidden/>
+              </w:rPr>
+              <w:fldChar w:fldCharType="separate"/>
+            </w:r>
+            <w:r>
+              <w:rPr>
+                <w:noProof/>
+                <w:webHidden/>
+              </w:rPr>
+              <w:t>5</w:t>
             </w:r>
             <w:r>
               <w:rPr>
@@ -636,12 +764,12 @@
       <w:pPr>
         <w:pStyle w:val="Heading1"/>
       </w:pPr>
-      <w:bookmarkStart w:id="6" w:name="_Toc402038352"/>
+      <w:bookmarkStart w:id="9" w:name="_Toc403716934"/>
       <w:r>
         <w:lastRenderedPageBreak/>
         <w:t>State Flow Diagram</w:t>
       </w:r>
-      <w:bookmarkEnd w:id="6"/>
+      <w:bookmarkEnd w:id="9"/>
     </w:p>
     <w:p>
       <w:pPr>
@@ -655,21 +783,23 @@
       <w:r>
         <w:br w:type="page"/>
       </w:r>
-      <w:bookmarkStart w:id="7" w:name="_Toc402038353"/>
+      <w:bookmarkStart w:id="10" w:name="_Toc403716935"/>
       <w:r>
         <w:lastRenderedPageBreak/>
         <w:t>Pseudo Code</w:t>
       </w:r>
-      <w:bookmarkEnd w:id="7"/>
+      <w:bookmarkEnd w:id="10"/>
     </w:p>
     <w:p/>
     <w:p>
       <w:pPr>
         <w:pStyle w:val="Heading2"/>
       </w:pPr>
+      <w:bookmarkStart w:id="11" w:name="_Toc403716936"/>
       <w:r>
         <w:t>Setup</w:t>
       </w:r>
+      <w:bookmarkEnd w:id="11"/>
     </w:p>
     <w:p/>
     <w:p>
@@ -682,35 +812,85 @@
         <w:rPr>
           <w:rFonts w:ascii="Courier New" w:hAnsi="Courier New" w:cs="Courier New"/>
         </w:rPr>
-        <w:t>Function setupComm() {</w:t>
-      </w:r>
-    </w:p>
-    <w:p>
-      <w:pPr>
-        <w:rPr>
-          <w:rFonts w:ascii="Courier New" w:hAnsi="Courier New" w:cs="Courier New"/>
-        </w:rPr>
-      </w:pPr>
-      <w:r>
-        <w:rPr>
-          <w:rFonts w:ascii="Courier New" w:hAnsi="Courier New" w:cs="Courier New"/>
-        </w:rPr>
-        <w:tab/>
-        <w:t>Open the Comm Port with pre-defined settings</w:t>
-      </w:r>
-    </w:p>
-    <w:p>
-      <w:pPr>
-        <w:rPr>
-          <w:rFonts w:ascii="Courier New" w:hAnsi="Courier New" w:cs="Courier New"/>
-        </w:rPr>
-      </w:pPr>
-      <w:r>
-        <w:rPr>
-          <w:rFonts w:ascii="Courier New" w:hAnsi="Courier New" w:cs="Courier New"/>
-        </w:rPr>
-        <w:tab/>
-        <w:t>If Comm Port is not open</w:t>
+        <w:t xml:space="preserve">Function </w:t>
+      </w:r>
+      <w:proofErr w:type="spellStart"/>
+      <w:proofErr w:type="gramStart"/>
+      <w:r>
+        <w:rPr>
+          <w:rFonts w:ascii="Courier New" w:hAnsi="Courier New" w:cs="Courier New"/>
+        </w:rPr>
+        <w:t>setupComm</w:t>
+      </w:r>
+      <w:proofErr w:type="spellEnd"/>
+      <w:r>
+        <w:rPr>
+          <w:rFonts w:ascii="Courier New" w:hAnsi="Courier New" w:cs="Courier New"/>
+        </w:rPr>
+        <w:t>(</w:t>
+      </w:r>
+      <w:proofErr w:type="gramEnd"/>
+      <w:r>
+        <w:rPr>
+          <w:rFonts w:ascii="Courier New" w:hAnsi="Courier New" w:cs="Courier New"/>
+        </w:rPr>
+        <w:t>) {</w:t>
+      </w:r>
+    </w:p>
+    <w:p>
+      <w:pPr>
+        <w:rPr>
+          <w:rFonts w:ascii="Courier New" w:hAnsi="Courier New" w:cs="Courier New"/>
+        </w:rPr>
+      </w:pPr>
+      <w:r>
+        <w:rPr>
+          <w:rFonts w:ascii="Courier New" w:hAnsi="Courier New" w:cs="Courier New"/>
+        </w:rPr>
+        <w:tab/>
+        <w:t xml:space="preserve">Open the </w:t>
+      </w:r>
+      <w:proofErr w:type="spellStart"/>
+      <w:r>
+        <w:rPr>
+          <w:rFonts w:ascii="Courier New" w:hAnsi="Courier New" w:cs="Courier New"/>
+        </w:rPr>
+        <w:t>Comm</w:t>
+      </w:r>
+      <w:proofErr w:type="spellEnd"/>
+      <w:r>
+        <w:rPr>
+          <w:rFonts w:ascii="Courier New" w:hAnsi="Courier New" w:cs="Courier New"/>
+        </w:rPr>
+        <w:t xml:space="preserve"> Port with pre-defined settings</w:t>
+      </w:r>
+    </w:p>
+    <w:p>
+      <w:pPr>
+        <w:rPr>
+          <w:rFonts w:ascii="Courier New" w:hAnsi="Courier New" w:cs="Courier New"/>
+        </w:rPr>
+      </w:pPr>
+      <w:r>
+        <w:rPr>
+          <w:rFonts w:ascii="Courier New" w:hAnsi="Courier New" w:cs="Courier New"/>
+        </w:rPr>
+        <w:tab/>
+        <w:t xml:space="preserve">If </w:t>
+      </w:r>
+      <w:proofErr w:type="spellStart"/>
+      <w:r>
+        <w:rPr>
+          <w:rFonts w:ascii="Courier New" w:hAnsi="Courier New" w:cs="Courier New"/>
+        </w:rPr>
+        <w:t>Comm</w:t>
+      </w:r>
+      <w:proofErr w:type="spellEnd"/>
+      <w:r>
+        <w:rPr>
+          <w:rFonts w:ascii="Courier New" w:hAnsi="Courier New" w:cs="Courier New"/>
+        </w:rPr>
+        <w:t xml:space="preserve"> Port is not open</w:t>
       </w:r>
     </w:p>
     <w:p>
@@ -803,9 +983,11 @@
       <w:pPr>
         <w:pStyle w:val="Heading2"/>
       </w:pPr>
+      <w:bookmarkStart w:id="12" w:name="_Toc403716937"/>
       <w:r>
         <w:t>Idle</w:t>
       </w:r>
+      <w:bookmarkEnd w:id="12"/>
     </w:p>
     <w:p/>
     <w:p>
@@ -818,7 +1000,21 @@
         <w:rPr>
           <w:rFonts w:ascii="Courier New" w:hAnsi="Courier New" w:cs="Courier New"/>
         </w:rPr>
-        <w:t>Function idle() {</w:t>
+        <w:t xml:space="preserve">Function </w:t>
+      </w:r>
+      <w:proofErr w:type="gramStart"/>
+      <w:r>
+        <w:rPr>
+          <w:rFonts w:ascii="Courier New" w:hAnsi="Courier New" w:cs="Courier New"/>
+        </w:rPr>
+        <w:t>idle(</w:t>
+      </w:r>
+      <w:proofErr w:type="gramEnd"/>
+      <w:r>
+        <w:rPr>
+          <w:rFonts w:ascii="Courier New" w:hAnsi="Courier New" w:cs="Courier New"/>
+        </w:rPr>
+        <w:t>) {</w:t>
       </w:r>
     </w:p>
     <w:p>
@@ -904,7 +1100,21 @@
           <w:rFonts w:ascii="Courier New" w:hAnsi="Courier New" w:cs="Courier New"/>
         </w:rPr>
         <w:tab/>
-        <w:t>If buffer &gt; 0 and resetTimer = 0</w:t>
+        <w:t xml:space="preserve">If buffer &gt; 0 and </w:t>
+      </w:r>
+      <w:proofErr w:type="spellStart"/>
+      <w:r>
+        <w:rPr>
+          <w:rFonts w:ascii="Courier New" w:hAnsi="Courier New" w:cs="Courier New"/>
+        </w:rPr>
+        <w:t>resetTimer</w:t>
+      </w:r>
+      <w:proofErr w:type="spellEnd"/>
+      <w:r>
+        <w:rPr>
+          <w:rFonts w:ascii="Courier New" w:hAnsi="Courier New" w:cs="Courier New"/>
+        </w:rPr>
+        <w:t xml:space="preserve"> = 0</w:t>
       </w:r>
     </w:p>
     <w:p>
@@ -968,84 +1178,130 @@
           <w:rFonts w:ascii="Courier New" w:hAnsi="Courier New" w:cs="Courier New"/>
         </w:rPr>
         <w:tab/>
-        <w:t>sendSync &lt;- 0</w:t>
-      </w:r>
-    </w:p>
-    <w:p>
-      <w:pPr>
-        <w:rPr>
-          <w:rFonts w:ascii="Courier New" w:hAnsi="Courier New" w:cs="Courier New"/>
-        </w:rPr>
-      </w:pPr>
-    </w:p>
-    <w:p>
-      <w:pPr>
-        <w:rPr>
-          <w:rFonts w:ascii="Courier New" w:hAnsi="Courier New" w:cs="Courier New"/>
-        </w:rPr>
-      </w:pPr>
-      <w:r>
-        <w:rPr>
-          <w:rFonts w:ascii="Courier New" w:hAnsi="Courier New" w:cs="Courier New"/>
-        </w:rPr>
-        <w:tab/>
-      </w:r>
-      <w:r>
-        <w:rPr>
-          <w:rFonts w:ascii="Courier New" w:hAnsi="Courier New" w:cs="Courier New"/>
-        </w:rPr>
-        <w:tab/>
-      </w:r>
-      <w:r>
-        <w:rPr>
-          <w:rFonts w:ascii="Courier New" w:hAnsi="Courier New" w:cs="Courier New"/>
-        </w:rPr>
-        <w:tab/>
-      </w:r>
-      <w:r>
-        <w:rPr>
-          <w:rFonts w:ascii="Courier New" w:hAnsi="Courier New" w:cs="Courier New"/>
-        </w:rPr>
-        <w:tab/>
-      </w:r>
-      <w:r>
-        <w:rPr>
-          <w:rFonts w:ascii="Courier New" w:hAnsi="Courier New" w:cs="Courier New"/>
-        </w:rPr>
-        <w:t>sendControlCharacter( ENQ )</w:t>
-      </w:r>
-    </w:p>
-    <w:p>
-      <w:pPr>
-        <w:rPr>
-          <w:rFonts w:ascii="Courier New" w:hAnsi="Courier New" w:cs="Courier New"/>
-        </w:rPr>
-      </w:pPr>
-      <w:r>
-        <w:rPr>
-          <w:rFonts w:ascii="Courier New" w:hAnsi="Courier New" w:cs="Courier New"/>
-        </w:rPr>
-        <w:tab/>
-      </w:r>
-      <w:r>
-        <w:rPr>
-          <w:rFonts w:ascii="Courier New" w:hAnsi="Courier New" w:cs="Courier New"/>
-        </w:rPr>
-        <w:tab/>
-      </w:r>
-      <w:r>
-        <w:rPr>
-          <w:rFonts w:ascii="Courier New" w:hAnsi="Courier New" w:cs="Courier New"/>
-        </w:rPr>
-        <w:tab/>
-      </w:r>
-      <w:r>
-        <w:rPr>
-          <w:rFonts w:ascii="Courier New" w:hAnsi="Courier New" w:cs="Courier New"/>
-        </w:rPr>
-        <w:tab/>
-        <w:t>waitForEnqResponse()</w:t>
-      </w:r>
+      </w:r>
+      <w:proofErr w:type="spellStart"/>
+      <w:proofErr w:type="gramStart"/>
+      <w:r>
+        <w:rPr>
+          <w:rFonts w:ascii="Courier New" w:hAnsi="Courier New" w:cs="Courier New"/>
+        </w:rPr>
+        <w:t>sendSync</w:t>
+      </w:r>
+      <w:proofErr w:type="spellEnd"/>
+      <w:proofErr w:type="gramEnd"/>
+      <w:r>
+        <w:rPr>
+          <w:rFonts w:ascii="Courier New" w:hAnsi="Courier New" w:cs="Courier New"/>
+        </w:rPr>
+        <w:t xml:space="preserve"> &lt;- 0</w:t>
+      </w:r>
+    </w:p>
+    <w:p>
+      <w:pPr>
+        <w:rPr>
+          <w:rFonts w:ascii="Courier New" w:hAnsi="Courier New" w:cs="Courier New"/>
+        </w:rPr>
+      </w:pPr>
+    </w:p>
+    <w:p>
+      <w:pPr>
+        <w:rPr>
+          <w:rFonts w:ascii="Courier New" w:hAnsi="Courier New" w:cs="Courier New"/>
+        </w:rPr>
+      </w:pPr>
+      <w:r>
+        <w:rPr>
+          <w:rFonts w:ascii="Courier New" w:hAnsi="Courier New" w:cs="Courier New"/>
+        </w:rPr>
+        <w:tab/>
+      </w:r>
+      <w:r>
+        <w:rPr>
+          <w:rFonts w:ascii="Courier New" w:hAnsi="Courier New" w:cs="Courier New"/>
+        </w:rPr>
+        <w:tab/>
+      </w:r>
+      <w:r>
+        <w:rPr>
+          <w:rFonts w:ascii="Courier New" w:hAnsi="Courier New" w:cs="Courier New"/>
+        </w:rPr>
+        <w:tab/>
+      </w:r>
+      <w:r>
+        <w:rPr>
+          <w:rFonts w:ascii="Courier New" w:hAnsi="Courier New" w:cs="Courier New"/>
+        </w:rPr>
+        <w:tab/>
+      </w:r>
+      <w:proofErr w:type="spellStart"/>
+      <w:proofErr w:type="gramStart"/>
+      <w:r>
+        <w:rPr>
+          <w:rFonts w:ascii="Courier New" w:hAnsi="Courier New" w:cs="Courier New"/>
+        </w:rPr>
+        <w:t>sendControlCharacter</w:t>
+      </w:r>
+      <w:proofErr w:type="spellEnd"/>
+      <w:r>
+        <w:rPr>
+          <w:rFonts w:ascii="Courier New" w:hAnsi="Courier New" w:cs="Courier New"/>
+        </w:rPr>
+        <w:t>(</w:t>
+      </w:r>
+      <w:proofErr w:type="gramEnd"/>
+      <w:r>
+        <w:rPr>
+          <w:rFonts w:ascii="Courier New" w:hAnsi="Courier New" w:cs="Courier New"/>
+        </w:rPr>
+        <w:t xml:space="preserve"> ENQ )</w:t>
+      </w:r>
+    </w:p>
+    <w:p>
+      <w:pPr>
+        <w:rPr>
+          <w:rFonts w:ascii="Courier New" w:hAnsi="Courier New" w:cs="Courier New"/>
+        </w:rPr>
+      </w:pPr>
+      <w:r>
+        <w:rPr>
+          <w:rFonts w:ascii="Courier New" w:hAnsi="Courier New" w:cs="Courier New"/>
+        </w:rPr>
+        <w:tab/>
+      </w:r>
+      <w:r>
+        <w:rPr>
+          <w:rFonts w:ascii="Courier New" w:hAnsi="Courier New" w:cs="Courier New"/>
+        </w:rPr>
+        <w:tab/>
+      </w:r>
+      <w:r>
+        <w:rPr>
+          <w:rFonts w:ascii="Courier New" w:hAnsi="Courier New" w:cs="Courier New"/>
+        </w:rPr>
+        <w:tab/>
+      </w:r>
+      <w:r>
+        <w:rPr>
+          <w:rFonts w:ascii="Courier New" w:hAnsi="Courier New" w:cs="Courier New"/>
+        </w:rPr>
+        <w:tab/>
+      </w:r>
+      <w:proofErr w:type="spellStart"/>
+      <w:proofErr w:type="gramStart"/>
+      <w:r>
+        <w:rPr>
+          <w:rFonts w:ascii="Courier New" w:hAnsi="Courier New" w:cs="Courier New"/>
+        </w:rPr>
+        <w:t>waitForEnqResponse</w:t>
+      </w:r>
+      <w:proofErr w:type="spellEnd"/>
+      <w:r>
+        <w:rPr>
+          <w:rFonts w:ascii="Courier New" w:hAnsi="Courier New" w:cs="Courier New"/>
+        </w:rPr>
+        <w:t>()</w:t>
+      </w:r>
+      <w:proofErr w:type="gramEnd"/>
     </w:p>
     <w:p>
       <w:pPr>
@@ -1078,9 +1334,11 @@
       <w:pPr>
         <w:pStyle w:val="Heading2"/>
       </w:pPr>
+      <w:bookmarkStart w:id="13" w:name="_Toc403716938"/>
       <w:r>
         <w:t>Receive Start</w:t>
       </w:r>
+      <w:bookmarkEnd w:id="13"/>
     </w:p>
     <w:p/>
     <w:p>
@@ -1093,7 +1351,29 @@
         <w:rPr>
           <w:rFonts w:ascii="Courier New" w:hAnsi="Courier New" w:cs="Courier New"/>
         </w:rPr>
-        <w:t>Function waitForEnquiry() {</w:t>
+        <w:t xml:space="preserve">Function </w:t>
+      </w:r>
+      <w:proofErr w:type="spellStart"/>
+      <w:proofErr w:type="gramStart"/>
+      <w:r>
+        <w:rPr>
+          <w:rFonts w:ascii="Courier New" w:hAnsi="Courier New" w:cs="Courier New"/>
+        </w:rPr>
+        <w:t>waitForEnquiry</w:t>
+      </w:r>
+      <w:proofErr w:type="spellEnd"/>
+      <w:r>
+        <w:rPr>
+          <w:rFonts w:ascii="Courier New" w:hAnsi="Courier New" w:cs="Courier New"/>
+        </w:rPr>
+        <w:t>(</w:t>
+      </w:r>
+      <w:proofErr w:type="gramEnd"/>
+      <w:r>
+        <w:rPr>
+          <w:rFonts w:ascii="Courier New" w:hAnsi="Courier New" w:cs="Courier New"/>
+        </w:rPr>
+        <w:t>) {</w:t>
       </w:r>
     </w:p>
     <w:p>
@@ -1195,7 +1475,21 @@
           <w:rFonts w:ascii="Courier New" w:hAnsi="Courier New" w:cs="Courier New"/>
         </w:rPr>
         <w:tab/>
-        <w:t>If ( ENQ received )</w:t>
+        <w:t xml:space="preserve">If </w:t>
+      </w:r>
+      <w:proofErr w:type="gramStart"/>
+      <w:r>
+        <w:rPr>
+          <w:rFonts w:ascii="Courier New" w:hAnsi="Courier New" w:cs="Courier New"/>
+        </w:rPr>
+        <w:t>( ENQ</w:t>
+      </w:r>
+      <w:proofErr w:type="gramEnd"/>
+      <w:r>
+        <w:rPr>
+          <w:rFonts w:ascii="Courier New" w:hAnsi="Courier New" w:cs="Courier New"/>
+        </w:rPr>
+        <w:t xml:space="preserve"> received )</w:t>
       </w:r>
     </w:p>
     <w:p>
@@ -1259,78 +1553,135 @@
           <w:rFonts w:ascii="Courier New" w:hAnsi="Courier New" w:cs="Courier New"/>
         </w:rPr>
         <w:tab/>
-        <w:t>receiveSync &lt;- 0</w:t>
-      </w:r>
-    </w:p>
-    <w:p>
-      <w:pPr>
-        <w:rPr>
-          <w:rFonts w:ascii="Courier New" w:hAnsi="Courier New" w:cs="Courier New"/>
-        </w:rPr>
-      </w:pPr>
-    </w:p>
-    <w:p>
-      <w:pPr>
-        <w:rPr>
-          <w:rFonts w:ascii="Courier New" w:hAnsi="Courier New" w:cs="Courier New"/>
-        </w:rPr>
-      </w:pPr>
-      <w:r>
-        <w:rPr>
-          <w:rFonts w:ascii="Courier New" w:hAnsi="Courier New" w:cs="Courier New"/>
-        </w:rPr>
-        <w:tab/>
-      </w:r>
-      <w:r>
-        <w:rPr>
-          <w:rFonts w:ascii="Courier New" w:hAnsi="Courier New" w:cs="Courier New"/>
-        </w:rPr>
-        <w:tab/>
-      </w:r>
-      <w:r>
-        <w:rPr>
-          <w:rFonts w:ascii="Courier New" w:hAnsi="Courier New" w:cs="Courier New"/>
-        </w:rPr>
-        <w:tab/>
-      </w:r>
-      <w:r>
-        <w:rPr>
-          <w:rFonts w:ascii="Courier New" w:hAnsi="Courier New" w:cs="Courier New"/>
-        </w:rPr>
-        <w:tab/>
-        <w:t>sendControlCharacter( ACK )</w:t>
-      </w:r>
-    </w:p>
-    <w:p>
-      <w:pPr>
-        <w:rPr>
-          <w:rFonts w:ascii="Courier New" w:hAnsi="Courier New" w:cs="Courier New"/>
-        </w:rPr>
-      </w:pPr>
-      <w:r>
-        <w:rPr>
-          <w:rFonts w:ascii="Courier New" w:hAnsi="Courier New" w:cs="Courier New"/>
-        </w:rPr>
-        <w:tab/>
-      </w:r>
-      <w:r>
-        <w:rPr>
-          <w:rFonts w:ascii="Courier New" w:hAnsi="Courier New" w:cs="Courier New"/>
-        </w:rPr>
-        <w:tab/>
-      </w:r>
-      <w:r>
-        <w:rPr>
-          <w:rFonts w:ascii="Courier New" w:hAnsi="Courier New" w:cs="Courier New"/>
-        </w:rPr>
-        <w:tab/>
-      </w:r>
-      <w:r>
-        <w:rPr>
-          <w:rFonts w:ascii="Courier New" w:hAnsi="Courier New" w:cs="Courier New"/>
-        </w:rPr>
-        <w:tab/>
-        <w:t>waitForAckResponse()</w:t>
+      </w:r>
+      <w:proofErr w:type="spellStart"/>
+      <w:proofErr w:type="gramStart"/>
+      <w:r>
+        <w:rPr>
+          <w:rFonts w:ascii="Courier New" w:hAnsi="Courier New" w:cs="Courier New"/>
+        </w:rPr>
+        <w:t>receiveSync</w:t>
+      </w:r>
+      <w:proofErr w:type="spellEnd"/>
+      <w:proofErr w:type="gramEnd"/>
+      <w:r>
+        <w:rPr>
+          <w:rFonts w:ascii="Courier New" w:hAnsi="Courier New" w:cs="Courier New"/>
+        </w:rPr>
+        <w:t xml:space="preserve"> &lt;- 0</w:t>
+      </w:r>
+    </w:p>
+    <w:p>
+      <w:pPr>
+        <w:rPr>
+          <w:rFonts w:ascii="Courier New" w:hAnsi="Courier New" w:cs="Courier New"/>
+        </w:rPr>
+      </w:pPr>
+    </w:p>
+    <w:p>
+      <w:pPr>
+        <w:rPr>
+          <w:rFonts w:ascii="Courier New" w:hAnsi="Courier New" w:cs="Courier New"/>
+        </w:rPr>
+      </w:pPr>
+      <w:r>
+        <w:rPr>
+          <w:rFonts w:ascii="Courier New" w:hAnsi="Courier New" w:cs="Courier New"/>
+        </w:rPr>
+        <w:tab/>
+      </w:r>
+      <w:r>
+        <w:rPr>
+          <w:rFonts w:ascii="Courier New" w:hAnsi="Courier New" w:cs="Courier New"/>
+        </w:rPr>
+        <w:tab/>
+      </w:r>
+      <w:r>
+        <w:rPr>
+          <w:rFonts w:ascii="Courier New" w:hAnsi="Courier New" w:cs="Courier New"/>
+        </w:rPr>
+        <w:tab/>
+      </w:r>
+      <w:r>
+        <w:rPr>
+          <w:rFonts w:ascii="Courier New" w:hAnsi="Courier New" w:cs="Courier New"/>
+        </w:rPr>
+        <w:tab/>
+      </w:r>
+      <w:proofErr w:type="spellStart"/>
+      <w:proofErr w:type="gramStart"/>
+      <w:r>
+        <w:rPr>
+          <w:rFonts w:ascii="Courier New" w:hAnsi="Courier New" w:cs="Courier New"/>
+        </w:rPr>
+        <w:t>sendControlCharacter</w:t>
+      </w:r>
+      <w:proofErr w:type="spellEnd"/>
+      <w:r>
+        <w:rPr>
+          <w:rFonts w:ascii="Courier New" w:hAnsi="Courier New" w:cs="Courier New"/>
+        </w:rPr>
+        <w:t>(</w:t>
+      </w:r>
+      <w:proofErr w:type="gramEnd"/>
+      <w:r>
+        <w:rPr>
+          <w:rFonts w:ascii="Courier New" w:hAnsi="Courier New" w:cs="Courier New"/>
+        </w:rPr>
+        <w:t xml:space="preserve"> ACK )</w:t>
+      </w:r>
+    </w:p>
+    <w:p>
+      <w:pPr>
+        <w:rPr>
+          <w:rFonts w:ascii="Courier New" w:hAnsi="Courier New" w:cs="Courier New"/>
+        </w:rPr>
+      </w:pPr>
+      <w:r>
+        <w:rPr>
+          <w:rFonts w:ascii="Courier New" w:hAnsi="Courier New" w:cs="Courier New"/>
+        </w:rPr>
+        <w:tab/>
+      </w:r>
+      <w:r>
+        <w:rPr>
+          <w:rFonts w:ascii="Courier New" w:hAnsi="Courier New" w:cs="Courier New"/>
+        </w:rPr>
+        <w:tab/>
+      </w:r>
+      <w:r>
+        <w:rPr>
+          <w:rFonts w:ascii="Courier New" w:hAnsi="Courier New" w:cs="Courier New"/>
+        </w:rPr>
+        <w:tab/>
+      </w:r>
+      <w:r>
+        <w:rPr>
+          <w:rFonts w:ascii="Courier New" w:hAnsi="Courier New" w:cs="Courier New"/>
+        </w:rPr>
+        <w:tab/>
+      </w:r>
+      <w:proofErr w:type="spellStart"/>
+      <w:proofErr w:type="gramStart"/>
+      <w:r>
+        <w:rPr>
+          <w:rFonts w:ascii="Courier New" w:hAnsi="Courier New" w:cs="Courier New"/>
+        </w:rPr>
+        <w:t>waitForAckResponse</w:t>
+      </w:r>
+      <w:proofErr w:type="spellEnd"/>
+      <w:r>
+        <w:rPr>
+          <w:rFonts w:ascii="Courier New" w:hAnsi="Courier New" w:cs="Courier New"/>
+        </w:rPr>
+        <w:t>(</w:t>
+      </w:r>
+      <w:proofErr w:type="gramEnd"/>
+      <w:r>
+        <w:rPr>
+          <w:rFonts w:ascii="Courier New" w:hAnsi="Courier New" w:cs="Courier New"/>
+        </w:rPr>
+        <w:t>)</w:t>
       </w:r>
       <w:r>
         <w:rPr>
@@ -1363,9 +1714,11 @@
       <w:pPr>
         <w:pStyle w:val="Heading2"/>
       </w:pPr>
+      <w:bookmarkStart w:id="14" w:name="_Toc403716939"/>
       <w:r>
         <w:t>Receive Start</w:t>
       </w:r>
+      <w:bookmarkEnd w:id="14"/>
     </w:p>
     <w:p/>
     <w:p>
@@ -1378,46 +1731,96 @@
         <w:rPr>
           <w:rFonts w:ascii="Courier New" w:hAnsi="Courier New" w:cs="Courier New"/>
         </w:rPr>
-        <w:t>Function waitForAckResponse() {</w:t>
-      </w:r>
-    </w:p>
-    <w:p>
-      <w:pPr>
-        <w:rPr>
-          <w:rFonts w:ascii="Courier New" w:hAnsi="Courier New" w:cs="Courier New"/>
-        </w:rPr>
-      </w:pPr>
-      <w:r>
-        <w:rPr>
-          <w:rFonts w:ascii="Courier New" w:hAnsi="Courier New" w:cs="Courier New"/>
-        </w:rPr>
-        <w:tab/>
-        <w:t>While ( receiving )</w:t>
-      </w:r>
-    </w:p>
-    <w:p>
-      <w:pPr>
-        <w:rPr>
-          <w:rFonts w:ascii="Courier New" w:hAnsi="Courier New" w:cs="Courier New"/>
-        </w:rPr>
-      </w:pPr>
-      <w:r>
-        <w:rPr>
-          <w:rFonts w:ascii="Courier New" w:hAnsi="Courier New" w:cs="Courier New"/>
-        </w:rPr>
-        <w:tab/>
-      </w:r>
-      <w:r>
-        <w:rPr>
-          <w:rFonts w:ascii="Courier New" w:hAnsi="Courier New" w:cs="Courier New"/>
-        </w:rPr>
-        <w:tab/>
-      </w:r>
-      <w:r>
-        <w:rPr>
-          <w:rFonts w:ascii="Courier New" w:hAnsi="Courier New" w:cs="Courier New"/>
-        </w:rPr>
-        <w:t>If ( wait for response = timeout )</w:t>
+        <w:t xml:space="preserve">Function </w:t>
+      </w:r>
+      <w:proofErr w:type="spellStart"/>
+      <w:proofErr w:type="gramStart"/>
+      <w:r>
+        <w:rPr>
+          <w:rFonts w:ascii="Courier New" w:hAnsi="Courier New" w:cs="Courier New"/>
+        </w:rPr>
+        <w:t>waitForAckResponse</w:t>
+      </w:r>
+      <w:proofErr w:type="spellEnd"/>
+      <w:r>
+        <w:rPr>
+          <w:rFonts w:ascii="Courier New" w:hAnsi="Courier New" w:cs="Courier New"/>
+        </w:rPr>
+        <w:t>(</w:t>
+      </w:r>
+      <w:proofErr w:type="gramEnd"/>
+      <w:r>
+        <w:rPr>
+          <w:rFonts w:ascii="Courier New" w:hAnsi="Courier New" w:cs="Courier New"/>
+        </w:rPr>
+        <w:t>) {</w:t>
+      </w:r>
+    </w:p>
+    <w:p>
+      <w:pPr>
+        <w:rPr>
+          <w:rFonts w:ascii="Courier New" w:hAnsi="Courier New" w:cs="Courier New"/>
+        </w:rPr>
+      </w:pPr>
+      <w:r>
+        <w:rPr>
+          <w:rFonts w:ascii="Courier New" w:hAnsi="Courier New" w:cs="Courier New"/>
+        </w:rPr>
+        <w:tab/>
+        <w:t xml:space="preserve">While </w:t>
+      </w:r>
+      <w:proofErr w:type="gramStart"/>
+      <w:r>
+        <w:rPr>
+          <w:rFonts w:ascii="Courier New" w:hAnsi="Courier New" w:cs="Courier New"/>
+        </w:rPr>
+        <w:t>( receiving</w:t>
+      </w:r>
+      <w:proofErr w:type="gramEnd"/>
+      <w:r>
+        <w:rPr>
+          <w:rFonts w:ascii="Courier New" w:hAnsi="Courier New" w:cs="Courier New"/>
+        </w:rPr>
+        <w:t xml:space="preserve"> )</w:t>
+      </w:r>
+    </w:p>
+    <w:p>
+      <w:pPr>
+        <w:rPr>
+          <w:rFonts w:ascii="Courier New" w:hAnsi="Courier New" w:cs="Courier New"/>
+        </w:rPr>
+      </w:pPr>
+      <w:r>
+        <w:rPr>
+          <w:rFonts w:ascii="Courier New" w:hAnsi="Courier New" w:cs="Courier New"/>
+        </w:rPr>
+        <w:tab/>
+      </w:r>
+      <w:r>
+        <w:rPr>
+          <w:rFonts w:ascii="Courier New" w:hAnsi="Courier New" w:cs="Courier New"/>
+        </w:rPr>
+        <w:tab/>
+      </w:r>
+      <w:r>
+        <w:rPr>
+          <w:rFonts w:ascii="Courier New" w:hAnsi="Courier New" w:cs="Courier New"/>
+        </w:rPr>
+        <w:t xml:space="preserve">If </w:t>
+      </w:r>
+      <w:proofErr w:type="gramStart"/>
+      <w:r>
+        <w:rPr>
+          <w:rFonts w:ascii="Courier New" w:hAnsi="Courier New" w:cs="Courier New"/>
+        </w:rPr>
+        <w:t>( wait</w:t>
+      </w:r>
+      <w:proofErr w:type="gramEnd"/>
+      <w:r>
+        <w:rPr>
+          <w:rFonts w:ascii="Courier New" w:hAnsi="Courier New" w:cs="Courier New"/>
+        </w:rPr>
+        <w:t xml:space="preserve"> for response = timeout )</w:t>
       </w:r>
     </w:p>
     <w:p>
@@ -1500,11 +1903,27 @@
         </w:rPr>
         <w:tab/>
       </w:r>
-      <w:r>
-        <w:rPr>
-          <w:rFonts w:ascii="Courier New" w:hAnsi="Courier New" w:cs="Courier New"/>
-        </w:rPr>
-        <w:t>validatePacket( response )</w:t>
+      <w:proofErr w:type="spellStart"/>
+      <w:proofErr w:type="gramStart"/>
+      <w:r>
+        <w:rPr>
+          <w:rFonts w:ascii="Courier New" w:hAnsi="Courier New" w:cs="Courier New"/>
+        </w:rPr>
+        <w:t>validatePacket</w:t>
+      </w:r>
+      <w:proofErr w:type="spellEnd"/>
+      <w:r>
+        <w:rPr>
+          <w:rFonts w:ascii="Courier New" w:hAnsi="Courier New" w:cs="Courier New"/>
+        </w:rPr>
+        <w:t>(</w:t>
+      </w:r>
+      <w:proofErr w:type="gramEnd"/>
+      <w:r>
+        <w:rPr>
+          <w:rFonts w:ascii="Courier New" w:hAnsi="Courier New" w:cs="Courier New"/>
+        </w:rPr>
+        <w:t xml:space="preserve"> response )</w:t>
       </w:r>
     </w:p>
     <w:p>
@@ -1537,200 +1956,422 @@
         <w:rPr>
           <w:rFonts w:ascii="Courier New" w:hAnsi="Courier New" w:cs="Courier New"/>
         </w:rPr>
-        <w:t>Function validatePacket( response ) {</w:t>
-      </w:r>
-    </w:p>
-    <w:p>
-      <w:pPr>
-        <w:rPr>
-          <w:rFonts w:ascii="Courier New" w:hAnsi="Courier New" w:cs="Courier New"/>
-        </w:rPr>
-      </w:pPr>
-      <w:r>
-        <w:rPr>
-          <w:rFonts w:ascii="Courier New" w:hAnsi="Courier New" w:cs="Courier New"/>
-        </w:rPr>
-        <w:tab/>
-        <w:t>crcValid &lt;- checkCRC( response )</w:t>
-      </w:r>
-    </w:p>
-    <w:p>
-      <w:pPr>
-        <w:rPr>
-          <w:rFonts w:ascii="Courier New" w:hAnsi="Courier New" w:cs="Courier New"/>
-        </w:rPr>
-      </w:pPr>
-    </w:p>
-    <w:p>
-      <w:pPr>
-        <w:rPr>
-          <w:rFonts w:ascii="Courier New" w:hAnsi="Courier New" w:cs="Courier New"/>
-        </w:rPr>
-      </w:pPr>
-      <w:r>
-        <w:rPr>
-          <w:rFonts w:ascii="Courier New" w:hAnsi="Courier New" w:cs="Courier New"/>
-        </w:rPr>
-        <w:tab/>
-        <w:t>if ( crcValid and receiveSync = response sync )</w:t>
-      </w:r>
-    </w:p>
-    <w:p>
-      <w:pPr>
-        <w:rPr>
-          <w:rFonts w:ascii="Courier New" w:hAnsi="Courier New" w:cs="Courier New"/>
-        </w:rPr>
-      </w:pPr>
-      <w:r>
-        <w:rPr>
-          <w:rFonts w:ascii="Courier New" w:hAnsi="Courier New" w:cs="Courier New"/>
-        </w:rPr>
-        <w:tab/>
-      </w:r>
-      <w:r>
-        <w:rPr>
-          <w:rFonts w:ascii="Courier New" w:hAnsi="Courier New" w:cs="Courier New"/>
-        </w:rPr>
-        <w:tab/>
-        <w:t>if ( response header = EOT )</w:t>
-      </w:r>
-    </w:p>
-    <w:p>
-      <w:pPr>
-        <w:rPr>
-          <w:rFonts w:ascii="Courier New" w:hAnsi="Courier New" w:cs="Courier New"/>
-        </w:rPr>
-      </w:pPr>
-      <w:r>
-        <w:rPr>
-          <w:rFonts w:ascii="Courier New" w:hAnsi="Courier New" w:cs="Courier New"/>
-        </w:rPr>
-        <w:tab/>
-      </w:r>
-      <w:r>
-        <w:rPr>
-          <w:rFonts w:ascii="Courier New" w:hAnsi="Courier New" w:cs="Courier New"/>
-        </w:rPr>
-        <w:tab/>
-      </w:r>
-      <w:r>
-        <w:rPr>
-          <w:rFonts w:ascii="Courier New" w:hAnsi="Courier New" w:cs="Courier New"/>
-        </w:rPr>
-        <w:tab/>
-        <w:t>receiving &lt;- false</w:t>
-      </w:r>
-    </w:p>
-    <w:p>
-      <w:pPr>
-        <w:rPr>
-          <w:rFonts w:ascii="Courier New" w:hAnsi="Courier New" w:cs="Courier New"/>
-        </w:rPr>
-      </w:pPr>
-    </w:p>
-    <w:p>
-      <w:pPr>
-        <w:rPr>
-          <w:rFonts w:ascii="Courier New" w:hAnsi="Courier New" w:cs="Courier New"/>
-        </w:rPr>
-      </w:pPr>
-      <w:r>
-        <w:rPr>
-          <w:rFonts w:ascii="Courier New" w:hAnsi="Courier New" w:cs="Courier New"/>
-        </w:rPr>
-        <w:tab/>
-      </w:r>
-      <w:r>
-        <w:rPr>
-          <w:rFonts w:ascii="Courier New" w:hAnsi="Courier New" w:cs="Courier New"/>
-        </w:rPr>
-        <w:tab/>
-        <w:t>receiveSync &lt;- not receiveSync</w:t>
-      </w:r>
-    </w:p>
-    <w:p>
-      <w:pPr>
-        <w:rPr>
-          <w:rFonts w:ascii="Courier New" w:hAnsi="Courier New" w:cs="Courier New"/>
-        </w:rPr>
-      </w:pPr>
-      <w:r>
-        <w:rPr>
-          <w:rFonts w:ascii="Courier New" w:hAnsi="Courier New" w:cs="Courier New"/>
-        </w:rPr>
-        <w:tab/>
-      </w:r>
-      <w:r>
-        <w:rPr>
-          <w:rFonts w:ascii="Courier New" w:hAnsi="Courier New" w:cs="Courier New"/>
-        </w:rPr>
-        <w:tab/>
-        <w:t>receiveBuffer &lt;- receiveBuffer + trimResponse( response )</w:t>
-      </w:r>
-      <w:r>
-        <w:rPr>
-          <w:rFonts w:ascii="Courier New" w:hAnsi="Courier New" w:cs="Courier New"/>
-        </w:rPr>
-        <w:tab/>
-      </w:r>
-    </w:p>
-    <w:p>
-      <w:pPr>
-        <w:rPr>
-          <w:rFonts w:ascii="Courier New" w:hAnsi="Courier New" w:cs="Courier New"/>
-        </w:rPr>
-      </w:pPr>
-      <w:r>
-        <w:rPr>
-          <w:rFonts w:ascii="Courier New" w:hAnsi="Courier New" w:cs="Courier New"/>
-        </w:rPr>
-        <w:tab/>
-      </w:r>
-      <w:r>
-        <w:rPr>
-          <w:rFonts w:ascii="Courier New" w:hAnsi="Courier New" w:cs="Courier New"/>
-        </w:rPr>
-        <w:tab/>
-        <w:t>displayBuffer()</w:t>
-      </w:r>
-    </w:p>
-    <w:p>
-      <w:pPr>
-        <w:rPr>
-          <w:rFonts w:ascii="Courier New" w:hAnsi="Courier New" w:cs="Courier New"/>
-        </w:rPr>
-      </w:pPr>
-      <w:r>
-        <w:rPr>
-          <w:rFonts w:ascii="Courier New" w:hAnsi="Courier New" w:cs="Courier New"/>
-        </w:rPr>
-        <w:tab/>
+        <w:t xml:space="preserve">Function </w:t>
+      </w:r>
+      <w:proofErr w:type="spellStart"/>
+      <w:proofErr w:type="gramStart"/>
+      <w:r>
+        <w:rPr>
+          <w:rFonts w:ascii="Courier New" w:hAnsi="Courier New" w:cs="Courier New"/>
+        </w:rPr>
+        <w:t>validatePacket</w:t>
+      </w:r>
+      <w:proofErr w:type="spellEnd"/>
+      <w:r>
+        <w:rPr>
+          <w:rFonts w:ascii="Courier New" w:hAnsi="Courier New" w:cs="Courier New"/>
+        </w:rPr>
+        <w:t>(</w:t>
+      </w:r>
+      <w:proofErr w:type="gramEnd"/>
+      <w:r>
+        <w:rPr>
+          <w:rFonts w:ascii="Courier New" w:hAnsi="Courier New" w:cs="Courier New"/>
+        </w:rPr>
+        <w:t xml:space="preserve"> response ) {</w:t>
+      </w:r>
+    </w:p>
+    <w:p>
+      <w:pPr>
+        <w:rPr>
+          <w:rFonts w:ascii="Courier New" w:hAnsi="Courier New" w:cs="Courier New"/>
+        </w:rPr>
+      </w:pPr>
+      <w:r>
+        <w:rPr>
+          <w:rFonts w:ascii="Courier New" w:hAnsi="Courier New" w:cs="Courier New"/>
+        </w:rPr>
+        <w:tab/>
+      </w:r>
+      <w:proofErr w:type="spellStart"/>
+      <w:proofErr w:type="gramStart"/>
+      <w:r>
+        <w:rPr>
+          <w:rFonts w:ascii="Courier New" w:hAnsi="Courier New" w:cs="Courier New"/>
+        </w:rPr>
+        <w:t>crcValid</w:t>
+      </w:r>
+      <w:proofErr w:type="spellEnd"/>
+      <w:proofErr w:type="gramEnd"/>
+      <w:r>
+        <w:rPr>
+          <w:rFonts w:ascii="Courier New" w:hAnsi="Courier New" w:cs="Courier New"/>
+        </w:rPr>
+        <w:t xml:space="preserve"> &lt;- </w:t>
+      </w:r>
+      <w:proofErr w:type="spellStart"/>
+      <w:r>
+        <w:rPr>
+          <w:rFonts w:ascii="Courier New" w:hAnsi="Courier New" w:cs="Courier New"/>
+        </w:rPr>
+        <w:t>checkCRC</w:t>
+      </w:r>
+      <w:proofErr w:type="spellEnd"/>
+      <w:r>
+        <w:rPr>
+          <w:rFonts w:ascii="Courier New" w:hAnsi="Courier New" w:cs="Courier New"/>
+        </w:rPr>
+        <w:t>( response )</w:t>
+      </w:r>
+    </w:p>
+    <w:p>
+      <w:pPr>
+        <w:rPr>
+          <w:rFonts w:ascii="Courier New" w:hAnsi="Courier New" w:cs="Courier New"/>
+        </w:rPr>
+      </w:pPr>
+    </w:p>
+    <w:p>
+      <w:pPr>
+        <w:rPr>
+          <w:rFonts w:ascii="Courier New" w:hAnsi="Courier New" w:cs="Courier New"/>
+        </w:rPr>
+      </w:pPr>
+      <w:r>
+        <w:rPr>
+          <w:rFonts w:ascii="Courier New" w:hAnsi="Courier New" w:cs="Courier New"/>
+        </w:rPr>
+        <w:tab/>
+      </w:r>
+      <w:proofErr w:type="gramStart"/>
+      <w:r>
+        <w:rPr>
+          <w:rFonts w:ascii="Courier New" w:hAnsi="Courier New" w:cs="Courier New"/>
+        </w:rPr>
+        <w:t>if</w:t>
+      </w:r>
+      <w:proofErr w:type="gramEnd"/>
+      <w:r>
+        <w:rPr>
+          <w:rFonts w:ascii="Courier New" w:hAnsi="Courier New" w:cs="Courier New"/>
+        </w:rPr>
+        <w:t xml:space="preserve"> ( </w:t>
+      </w:r>
+      <w:proofErr w:type="spellStart"/>
+      <w:r>
+        <w:rPr>
+          <w:rFonts w:ascii="Courier New" w:hAnsi="Courier New" w:cs="Courier New"/>
+        </w:rPr>
+        <w:t>crcValid</w:t>
+      </w:r>
+      <w:proofErr w:type="spellEnd"/>
+      <w:r>
+        <w:rPr>
+          <w:rFonts w:ascii="Courier New" w:hAnsi="Courier New" w:cs="Courier New"/>
+        </w:rPr>
+        <w:t xml:space="preserve"> and </w:t>
+      </w:r>
+      <w:proofErr w:type="spellStart"/>
+      <w:r>
+        <w:rPr>
+          <w:rFonts w:ascii="Courier New" w:hAnsi="Courier New" w:cs="Courier New"/>
+        </w:rPr>
+        <w:t>receiveSync</w:t>
+      </w:r>
+      <w:proofErr w:type="spellEnd"/>
+      <w:r>
+        <w:rPr>
+          <w:rFonts w:ascii="Courier New" w:hAnsi="Courier New" w:cs="Courier New"/>
+        </w:rPr>
+        <w:t xml:space="preserve"> = response sync )</w:t>
+      </w:r>
+    </w:p>
+    <w:p>
+      <w:pPr>
+        <w:rPr>
+          <w:rFonts w:ascii="Courier New" w:hAnsi="Courier New" w:cs="Courier New"/>
+        </w:rPr>
+      </w:pPr>
+      <w:r>
+        <w:rPr>
+          <w:rFonts w:ascii="Courier New" w:hAnsi="Courier New" w:cs="Courier New"/>
+        </w:rPr>
+        <w:tab/>
+      </w:r>
+      <w:r>
+        <w:rPr>
+          <w:rFonts w:ascii="Courier New" w:hAnsi="Courier New" w:cs="Courier New"/>
+        </w:rPr>
+        <w:tab/>
+      </w:r>
+      <w:proofErr w:type="gramStart"/>
+      <w:r>
+        <w:rPr>
+          <w:rFonts w:ascii="Courier New" w:hAnsi="Courier New" w:cs="Courier New"/>
+        </w:rPr>
+        <w:t>if</w:t>
+      </w:r>
+      <w:proofErr w:type="gramEnd"/>
+      <w:r>
+        <w:rPr>
+          <w:rFonts w:ascii="Courier New" w:hAnsi="Courier New" w:cs="Courier New"/>
+        </w:rPr>
+        <w:t xml:space="preserve"> ( response header = EOT )</w:t>
+      </w:r>
+    </w:p>
+    <w:p>
+      <w:pPr>
+        <w:rPr>
+          <w:rFonts w:ascii="Courier New" w:hAnsi="Courier New" w:cs="Courier New"/>
+        </w:rPr>
+      </w:pPr>
+      <w:r>
+        <w:rPr>
+          <w:rFonts w:ascii="Courier New" w:hAnsi="Courier New" w:cs="Courier New"/>
+        </w:rPr>
+        <w:tab/>
+      </w:r>
+      <w:r>
+        <w:rPr>
+          <w:rFonts w:ascii="Courier New" w:hAnsi="Courier New" w:cs="Courier New"/>
+        </w:rPr>
+        <w:tab/>
+      </w:r>
+      <w:r>
+        <w:rPr>
+          <w:rFonts w:ascii="Courier New" w:hAnsi="Courier New" w:cs="Courier New"/>
+        </w:rPr>
+        <w:tab/>
+      </w:r>
+      <w:proofErr w:type="gramStart"/>
+      <w:r>
+        <w:rPr>
+          <w:rFonts w:ascii="Courier New" w:hAnsi="Courier New" w:cs="Courier New"/>
+        </w:rPr>
+        <w:t>receiving</w:t>
+      </w:r>
+      <w:proofErr w:type="gramEnd"/>
+      <w:r>
+        <w:rPr>
+          <w:rFonts w:ascii="Courier New" w:hAnsi="Courier New" w:cs="Courier New"/>
+        </w:rPr>
+        <w:t xml:space="preserve"> &lt;- false</w:t>
+      </w:r>
+    </w:p>
+    <w:p>
+      <w:pPr>
+        <w:rPr>
+          <w:rFonts w:ascii="Courier New" w:hAnsi="Courier New" w:cs="Courier New"/>
+        </w:rPr>
+      </w:pPr>
+    </w:p>
+    <w:p>
+      <w:pPr>
+        <w:rPr>
+          <w:rFonts w:ascii="Courier New" w:hAnsi="Courier New" w:cs="Courier New"/>
+        </w:rPr>
+      </w:pPr>
+      <w:r>
+        <w:rPr>
+          <w:rFonts w:ascii="Courier New" w:hAnsi="Courier New" w:cs="Courier New"/>
+        </w:rPr>
+        <w:tab/>
+      </w:r>
+      <w:r>
+        <w:rPr>
+          <w:rFonts w:ascii="Courier New" w:hAnsi="Courier New" w:cs="Courier New"/>
+        </w:rPr>
+        <w:tab/>
+      </w:r>
+      <w:proofErr w:type="spellStart"/>
+      <w:proofErr w:type="gramStart"/>
+      <w:r>
+        <w:rPr>
+          <w:rFonts w:ascii="Courier New" w:hAnsi="Courier New" w:cs="Courier New"/>
+        </w:rPr>
+        <w:t>receiveSync</w:t>
+      </w:r>
+      <w:proofErr w:type="spellEnd"/>
+      <w:proofErr w:type="gramEnd"/>
+      <w:r>
+        <w:rPr>
+          <w:rFonts w:ascii="Courier New" w:hAnsi="Courier New" w:cs="Courier New"/>
+        </w:rPr>
+        <w:t xml:space="preserve"> &lt;- not </w:t>
+      </w:r>
+      <w:proofErr w:type="spellStart"/>
+      <w:r>
+        <w:rPr>
+          <w:rFonts w:ascii="Courier New" w:hAnsi="Courier New" w:cs="Courier New"/>
+        </w:rPr>
+        <w:t>receiveSync</w:t>
+      </w:r>
+      <w:proofErr w:type="spellEnd"/>
+    </w:p>
+    <w:p>
+      <w:pPr>
+        <w:rPr>
+          <w:rFonts w:ascii="Courier New" w:hAnsi="Courier New" w:cs="Courier New"/>
+        </w:rPr>
+      </w:pPr>
+      <w:r>
+        <w:rPr>
+          <w:rFonts w:ascii="Courier New" w:hAnsi="Courier New" w:cs="Courier New"/>
+        </w:rPr>
+        <w:tab/>
+      </w:r>
+      <w:r>
+        <w:rPr>
+          <w:rFonts w:ascii="Courier New" w:hAnsi="Courier New" w:cs="Courier New"/>
+        </w:rPr>
+        <w:tab/>
+      </w:r>
+      <w:proofErr w:type="spellStart"/>
+      <w:proofErr w:type="gramStart"/>
+      <w:r>
+        <w:rPr>
+          <w:rFonts w:ascii="Courier New" w:hAnsi="Courier New" w:cs="Courier New"/>
+        </w:rPr>
+        <w:t>receiveBuffer</w:t>
+      </w:r>
+      <w:proofErr w:type="spellEnd"/>
+      <w:proofErr w:type="gramEnd"/>
+      <w:r>
+        <w:rPr>
+          <w:rFonts w:ascii="Courier New" w:hAnsi="Courier New" w:cs="Courier New"/>
+        </w:rPr>
+        <w:t xml:space="preserve"> &lt;- </w:t>
+      </w:r>
+      <w:proofErr w:type="spellStart"/>
+      <w:r>
+        <w:rPr>
+          <w:rFonts w:ascii="Courier New" w:hAnsi="Courier New" w:cs="Courier New"/>
+        </w:rPr>
+        <w:t>receiveBuffer</w:t>
+      </w:r>
+      <w:proofErr w:type="spellEnd"/>
+      <w:r>
+        <w:rPr>
+          <w:rFonts w:ascii="Courier New" w:hAnsi="Courier New" w:cs="Courier New"/>
+        </w:rPr>
+        <w:t xml:space="preserve"> + </w:t>
+      </w:r>
+      <w:proofErr w:type="spellStart"/>
+      <w:r>
+        <w:rPr>
+          <w:rFonts w:ascii="Courier New" w:hAnsi="Courier New" w:cs="Courier New"/>
+        </w:rPr>
+        <w:t>trimResponse</w:t>
+      </w:r>
+      <w:proofErr w:type="spellEnd"/>
+      <w:r>
+        <w:rPr>
+          <w:rFonts w:ascii="Courier New" w:hAnsi="Courier New" w:cs="Courier New"/>
+        </w:rPr>
+        <w:t>( response )</w:t>
+      </w:r>
+      <w:r>
+        <w:rPr>
+          <w:rFonts w:ascii="Courier New" w:hAnsi="Courier New" w:cs="Courier New"/>
+        </w:rPr>
+        <w:tab/>
+      </w:r>
+    </w:p>
+    <w:p>
+      <w:pPr>
+        <w:rPr>
+          <w:rFonts w:ascii="Courier New" w:hAnsi="Courier New" w:cs="Courier New"/>
+        </w:rPr>
+      </w:pPr>
+      <w:r>
+        <w:rPr>
+          <w:rFonts w:ascii="Courier New" w:hAnsi="Courier New" w:cs="Courier New"/>
+        </w:rPr>
+        <w:tab/>
+      </w:r>
+      <w:r>
+        <w:rPr>
+          <w:rFonts w:ascii="Courier New" w:hAnsi="Courier New" w:cs="Courier New"/>
+        </w:rPr>
+        <w:tab/>
+      </w:r>
+      <w:proofErr w:type="spellStart"/>
+      <w:proofErr w:type="gramStart"/>
+      <w:r>
+        <w:rPr>
+          <w:rFonts w:ascii="Courier New" w:hAnsi="Courier New" w:cs="Courier New"/>
+        </w:rPr>
+        <w:t>displayBuffer</w:t>
+      </w:r>
+      <w:proofErr w:type="spellEnd"/>
+      <w:r>
+        <w:rPr>
+          <w:rFonts w:ascii="Courier New" w:hAnsi="Courier New" w:cs="Courier New"/>
+        </w:rPr>
+        <w:t>()</w:t>
+      </w:r>
+      <w:proofErr w:type="gramEnd"/>
+    </w:p>
+    <w:p>
+      <w:pPr>
+        <w:rPr>
+          <w:rFonts w:ascii="Courier New" w:hAnsi="Courier New" w:cs="Courier New"/>
+        </w:rPr>
+      </w:pPr>
+      <w:r>
+        <w:rPr>
+          <w:rFonts w:ascii="Courier New" w:hAnsi="Courier New" w:cs="Courier New"/>
+        </w:rPr>
+        <w:tab/>
+      </w:r>
+      <w:proofErr w:type="gramStart"/>
+      <w:r>
+        <w:rPr>
+          <w:rFonts w:ascii="Courier New" w:hAnsi="Courier New" w:cs="Courier New"/>
+        </w:rPr>
         <w:t>else</w:t>
       </w:r>
-    </w:p>
-    <w:p>
-      <w:pPr>
-        <w:rPr>
-          <w:rFonts w:ascii="Courier New" w:hAnsi="Courier New" w:cs="Courier New"/>
-        </w:rPr>
-      </w:pPr>
-      <w:r>
-        <w:rPr>
-          <w:rFonts w:ascii="Courier New" w:hAnsi="Courier New" w:cs="Courier New"/>
-        </w:rPr>
-        <w:tab/>
-      </w:r>
-      <w:r>
-        <w:rPr>
-          <w:rFonts w:ascii="Courier New" w:hAnsi="Courier New" w:cs="Courier New"/>
-        </w:rPr>
-        <w:tab/>
-      </w:r>
-      <w:r>
-        <w:rPr>
-          <w:rFonts w:ascii="Courier New" w:hAnsi="Courier New" w:cs="Courier New"/>
-        </w:rPr>
-        <w:t>sendControlCharacter( NAK )</w:t>
+      <w:proofErr w:type="gramEnd"/>
+    </w:p>
+    <w:p>
+      <w:pPr>
+        <w:rPr>
+          <w:rFonts w:ascii="Courier New" w:hAnsi="Courier New" w:cs="Courier New"/>
+        </w:rPr>
+      </w:pPr>
+      <w:r>
+        <w:rPr>
+          <w:rFonts w:ascii="Courier New" w:hAnsi="Courier New" w:cs="Courier New"/>
+        </w:rPr>
+        <w:tab/>
+      </w:r>
+      <w:r>
+        <w:rPr>
+          <w:rFonts w:ascii="Courier New" w:hAnsi="Courier New" w:cs="Courier New"/>
+        </w:rPr>
+        <w:tab/>
+      </w:r>
+      <w:proofErr w:type="spellStart"/>
+      <w:proofErr w:type="gramStart"/>
+      <w:r>
+        <w:rPr>
+          <w:rFonts w:ascii="Courier New" w:hAnsi="Courier New" w:cs="Courier New"/>
+        </w:rPr>
+        <w:t>sendControlCharacter</w:t>
+      </w:r>
+      <w:proofErr w:type="spellEnd"/>
+      <w:r>
+        <w:rPr>
+          <w:rFonts w:ascii="Courier New" w:hAnsi="Courier New" w:cs="Courier New"/>
+        </w:rPr>
+        <w:t>(</w:t>
+      </w:r>
+      <w:proofErr w:type="gramEnd"/>
+      <w:r>
+        <w:rPr>
+          <w:rFonts w:ascii="Courier New" w:hAnsi="Courier New" w:cs="Courier New"/>
+        </w:rPr>
+        <w:t xml:space="preserve"> NAK )</w:t>
       </w:r>
     </w:p>
     <w:p>
@@ -1763,7 +2404,29 @@
         <w:rPr>
           <w:rFonts w:ascii="Courier New" w:hAnsi="Courier New" w:cs="Courier New"/>
         </w:rPr>
-        <w:t>Function trimResponse( response ) {</w:t>
+        <w:t xml:space="preserve">Function </w:t>
+      </w:r>
+      <w:proofErr w:type="spellStart"/>
+      <w:proofErr w:type="gramStart"/>
+      <w:r>
+        <w:rPr>
+          <w:rFonts w:ascii="Courier New" w:hAnsi="Courier New" w:cs="Courier New"/>
+        </w:rPr>
+        <w:t>trimResponse</w:t>
+      </w:r>
+      <w:proofErr w:type="spellEnd"/>
+      <w:r>
+        <w:rPr>
+          <w:rFonts w:ascii="Courier New" w:hAnsi="Courier New" w:cs="Courier New"/>
+        </w:rPr>
+        <w:t>(</w:t>
+      </w:r>
+      <w:proofErr w:type="gramEnd"/>
+      <w:r>
+        <w:rPr>
+          <w:rFonts w:ascii="Courier New" w:hAnsi="Courier New" w:cs="Courier New"/>
+        </w:rPr>
+        <w:t xml:space="preserve"> response ) {</w:t>
       </w:r>
     </w:p>
     <w:p>
@@ -1807,11 +2470,19 @@
         <w:tab/>
         <w:t xml:space="preserve">If </w:t>
       </w:r>
-      <w:r>
-        <w:rPr>
-          <w:rFonts w:ascii="Courier New" w:hAnsi="Courier New" w:cs="Courier New"/>
-        </w:rPr>
-        <w:t>( response header = EOT</w:t>
+      <w:proofErr w:type="gramStart"/>
+      <w:r>
+        <w:rPr>
+          <w:rFonts w:ascii="Courier New" w:hAnsi="Courier New" w:cs="Courier New"/>
+        </w:rPr>
+        <w:t>( response</w:t>
+      </w:r>
+      <w:proofErr w:type="gramEnd"/>
+      <w:r>
+        <w:rPr>
+          <w:rFonts w:ascii="Courier New" w:hAnsi="Courier New" w:cs="Courier New"/>
+        </w:rPr>
+        <w:t xml:space="preserve"> header = EOT</w:t>
       </w:r>
       <w:r>
         <w:rPr>
@@ -1842,7 +2513,35 @@
         <w:rPr>
           <w:rFonts w:ascii="Courier New" w:hAnsi="Courier New" w:cs="Courier New"/>
         </w:rPr>
-        <w:t>While ( response[i] is not ETX</w:t>
+        <w:t xml:space="preserve">While </w:t>
+      </w:r>
+      <w:proofErr w:type="gramStart"/>
+      <w:r>
+        <w:rPr>
+          <w:rFonts w:ascii="Courier New" w:hAnsi="Courier New" w:cs="Courier New"/>
+        </w:rPr>
+        <w:t>( response</w:t>
+      </w:r>
+      <w:proofErr w:type="gramEnd"/>
+      <w:r>
+        <w:rPr>
+          <w:rFonts w:ascii="Courier New" w:hAnsi="Courier New" w:cs="Courier New"/>
+        </w:rPr>
+        <w:t>[</w:t>
+      </w:r>
+      <w:proofErr w:type="spellStart"/>
+      <w:r>
+        <w:rPr>
+          <w:rFonts w:ascii="Courier New" w:hAnsi="Courier New" w:cs="Courier New"/>
+        </w:rPr>
+        <w:t>i</w:t>
+      </w:r>
+      <w:proofErr w:type="spellEnd"/>
+      <w:r>
+        <w:rPr>
+          <w:rFonts w:ascii="Courier New" w:hAnsi="Courier New" w:cs="Courier New"/>
+        </w:rPr>
+        <w:t>] is not ETX</w:t>
       </w:r>
       <w:r>
         <w:rPr>
@@ -1850,12 +2549,14 @@
         </w:rPr>
         <w:t xml:space="preserve"> and </w:t>
       </w:r>
+      <w:proofErr w:type="spellStart"/>
       <w:r>
         <w:rPr>
           <w:rFonts w:ascii="Courier New" w:hAnsi="Courier New" w:cs="Courier New"/>
         </w:rPr>
         <w:t>i</w:t>
       </w:r>
+      <w:proofErr w:type="spellEnd"/>
       <w:r>
         <w:rPr>
           <w:rFonts w:ascii="Courier New" w:hAnsi="Courier New" w:cs="Courier New"/>
@@ -1941,8 +2642,16 @@
         <w:rPr>
           <w:rFonts w:ascii="Courier New" w:hAnsi="Courier New" w:cs="Courier New"/>
         </w:rPr>
-        <w:t xml:space="preserve"> to i</w:t>
-      </w:r>
+        <w:t xml:space="preserve"> to </w:t>
+      </w:r>
+      <w:proofErr w:type="spellStart"/>
+      <w:r>
+        <w:rPr>
+          <w:rFonts w:ascii="Courier New" w:hAnsi="Courier New" w:cs="Courier New"/>
+        </w:rPr>
+        <w:t>i</w:t>
+      </w:r>
+      <w:proofErr w:type="spellEnd"/>
     </w:p>
     <w:p>
       <w:pPr>
@@ -1994,8 +2703,6 @@
         </w:rPr>
         <w:t>1018</w:t>
       </w:r>
-      <w:bookmarkStart w:id="8" w:name="_GoBack"/>
-      <w:bookmarkEnd w:id="8"/>
     </w:p>
     <w:p>
       <w:pPr>
@@ -2021,28 +2728,52 @@
       <w:pPr>
         <w:pStyle w:val="Heading2"/>
       </w:pPr>
+      <w:bookmarkStart w:id="15" w:name="_Toc403716940"/>
       <w:r>
         <w:t>Send Start</w:t>
       </w:r>
-    </w:p>
-    <w:p>
-      <w:pPr>
-        <w:rPr>
-          <w:rFonts w:ascii="Courier New" w:hAnsi="Courier New" w:cs="Courier New"/>
-        </w:rPr>
-      </w:pPr>
-    </w:p>
-    <w:p>
-      <w:pPr>
-        <w:rPr>
-          <w:rFonts w:ascii="Courier New" w:hAnsi="Courier New" w:cs="Courier New"/>
-        </w:rPr>
-      </w:pPr>
-      <w:r>
-        <w:rPr>
-          <w:rFonts w:ascii="Courier New" w:hAnsi="Courier New" w:cs="Courier New"/>
-        </w:rPr>
-        <w:t>Function waitForEnqResponse() {</w:t>
+      <w:bookmarkEnd w:id="15"/>
+    </w:p>
+    <w:p>
+      <w:pPr>
+        <w:rPr>
+          <w:rFonts w:ascii="Courier New" w:hAnsi="Courier New" w:cs="Courier New"/>
+        </w:rPr>
+      </w:pPr>
+    </w:p>
+    <w:p>
+      <w:pPr>
+        <w:rPr>
+          <w:rFonts w:ascii="Courier New" w:hAnsi="Courier New" w:cs="Courier New"/>
+        </w:rPr>
+      </w:pPr>
+      <w:r>
+        <w:rPr>
+          <w:rFonts w:ascii="Courier New" w:hAnsi="Courier New" w:cs="Courier New"/>
+        </w:rPr>
+        <w:t xml:space="preserve">Function </w:t>
+      </w:r>
+      <w:proofErr w:type="spellStart"/>
+      <w:proofErr w:type="gramStart"/>
+      <w:r>
+        <w:rPr>
+          <w:rFonts w:ascii="Courier New" w:hAnsi="Courier New" w:cs="Courier New"/>
+        </w:rPr>
+        <w:t>waitForEnqResponse</w:t>
+      </w:r>
+      <w:proofErr w:type="spellEnd"/>
+      <w:r>
+        <w:rPr>
+          <w:rFonts w:ascii="Courier New" w:hAnsi="Courier New" w:cs="Courier New"/>
+        </w:rPr>
+        <w:t>(</w:t>
+      </w:r>
+      <w:proofErr w:type="gramEnd"/>
+      <w:r>
+        <w:rPr>
+          <w:rFonts w:ascii="Courier New" w:hAnsi="Courier New" w:cs="Courier New"/>
+        </w:rPr>
+        <w:t>) {</w:t>
       </w:r>
     </w:p>
     <w:p>
@@ -2052,31 +2783,52 @@
           <w:rFonts w:ascii="Courier New" w:hAnsi="Courier New" w:cs="Courier New"/>
         </w:rPr>
       </w:pPr>
-      <w:r>
-        <w:rPr>
-          <w:rFonts w:ascii="Courier New" w:hAnsi="Courier New" w:cs="Courier New"/>
-        </w:rPr>
-        <w:t>if ( wait for response = timeout )</w:t>
-      </w:r>
-    </w:p>
-    <w:p>
-      <w:pPr>
-        <w:rPr>
-          <w:rFonts w:ascii="Courier New" w:hAnsi="Courier New" w:cs="Courier New"/>
-        </w:rPr>
-      </w:pPr>
-      <w:r>
-        <w:rPr>
-          <w:rFonts w:ascii="Courier New" w:hAnsi="Courier New" w:cs="Courier New"/>
-        </w:rPr>
-        <w:tab/>
-      </w:r>
-      <w:r>
-        <w:rPr>
-          <w:rFonts w:ascii="Courier New" w:hAnsi="Courier New" w:cs="Courier New"/>
-        </w:rPr>
-        <w:tab/>
-        <w:t>sending &lt;- false</w:t>
+      <w:proofErr w:type="gramStart"/>
+      <w:r>
+        <w:rPr>
+          <w:rFonts w:ascii="Courier New" w:hAnsi="Courier New" w:cs="Courier New"/>
+        </w:rPr>
+        <w:t>if</w:t>
+      </w:r>
+      <w:proofErr w:type="gramEnd"/>
+      <w:r>
+        <w:rPr>
+          <w:rFonts w:ascii="Courier New" w:hAnsi="Courier New" w:cs="Courier New"/>
+        </w:rPr>
+        <w:t xml:space="preserve"> ( wait for response = timeout )</w:t>
+      </w:r>
+    </w:p>
+    <w:p>
+      <w:pPr>
+        <w:rPr>
+          <w:rFonts w:ascii="Courier New" w:hAnsi="Courier New" w:cs="Courier New"/>
+        </w:rPr>
+      </w:pPr>
+      <w:r>
+        <w:rPr>
+          <w:rFonts w:ascii="Courier New" w:hAnsi="Courier New" w:cs="Courier New"/>
+        </w:rPr>
+        <w:tab/>
+      </w:r>
+      <w:r>
+        <w:rPr>
+          <w:rFonts w:ascii="Courier New" w:hAnsi="Courier New" w:cs="Courier New"/>
+        </w:rPr>
+        <w:tab/>
+      </w:r>
+      <w:proofErr w:type="gramStart"/>
+      <w:r>
+        <w:rPr>
+          <w:rFonts w:ascii="Courier New" w:hAnsi="Courier New" w:cs="Courier New"/>
+        </w:rPr>
+        <w:t>sending</w:t>
+      </w:r>
+      <w:proofErr w:type="gramEnd"/>
+      <w:r>
+        <w:rPr>
+          <w:rFonts w:ascii="Courier New" w:hAnsi="Courier New" w:cs="Courier New"/>
+        </w:rPr>
+        <w:t xml:space="preserve"> &lt;- false</w:t>
       </w:r>
     </w:p>
     <w:p>
@@ -2091,8 +2843,15 @@
           <w:rFonts w:ascii="Courier New" w:hAnsi="Courier New" w:cs="Courier New"/>
         </w:rPr>
         <w:tab/>
+      </w:r>
+      <w:proofErr w:type="gramStart"/>
+      <w:r>
+        <w:rPr>
+          <w:rFonts w:ascii="Courier New" w:hAnsi="Courier New" w:cs="Courier New"/>
+        </w:rPr>
         <w:t>else</w:t>
       </w:r>
+      <w:proofErr w:type="gramEnd"/>
     </w:p>
     <w:p>
       <w:pPr>
@@ -2112,8 +2871,23 @@
           <w:rFonts w:ascii="Courier New" w:hAnsi="Courier New" w:cs="Courier New"/>
         </w:rPr>
         <w:tab/>
-        <w:t>sendData()</w:t>
-      </w:r>
+      </w:r>
+      <w:proofErr w:type="spellStart"/>
+      <w:proofErr w:type="gramStart"/>
+      <w:r>
+        <w:rPr>
+          <w:rFonts w:ascii="Courier New" w:hAnsi="Courier New" w:cs="Courier New"/>
+        </w:rPr>
+        <w:t>sendData</w:t>
+      </w:r>
+      <w:proofErr w:type="spellEnd"/>
+      <w:r>
+        <w:rPr>
+          <w:rFonts w:ascii="Courier New" w:hAnsi="Courier New" w:cs="Courier New"/>
+        </w:rPr>
+        <w:t>()</w:t>
+      </w:r>
+      <w:proofErr w:type="gramEnd"/>
     </w:p>
     <w:p>
       <w:pPr>
@@ -2141,11 +2915,21 @@
         </w:rPr>
         <w:tab/>
       </w:r>
-      <w:r>
-        <w:rPr>
-          <w:rFonts w:ascii="Courier New" w:hAnsi="Courier New" w:cs="Courier New"/>
-        </w:rPr>
-        <w:t>resetTimer &lt;- random( MIN_RESET to MAX_RESET )</w:t>
+      <w:proofErr w:type="spellStart"/>
+      <w:proofErr w:type="gramStart"/>
+      <w:r>
+        <w:rPr>
+          <w:rFonts w:ascii="Courier New" w:hAnsi="Courier New" w:cs="Courier New"/>
+        </w:rPr>
+        <w:t>resetTimer</w:t>
+      </w:r>
+      <w:proofErr w:type="spellEnd"/>
+      <w:proofErr w:type="gramEnd"/>
+      <w:r>
+        <w:rPr>
+          <w:rFonts w:ascii="Courier New" w:hAnsi="Courier New" w:cs="Courier New"/>
+        </w:rPr>
+        <w:t xml:space="preserve"> &lt;- random( MIN_RESET to MAX_RESET )</w:t>
       </w:r>
     </w:p>
     <w:p>
@@ -2172,28 +2956,52 @@
       <w:pPr>
         <w:pStyle w:val="Heading2"/>
       </w:pPr>
+      <w:bookmarkStart w:id="16" w:name="_Toc403716941"/>
       <w:r>
         <w:t>Send Data</w:t>
       </w:r>
-    </w:p>
-    <w:p>
-      <w:pPr>
-        <w:rPr>
-          <w:rFonts w:ascii="Courier New" w:hAnsi="Courier New" w:cs="Courier New"/>
-        </w:rPr>
-      </w:pPr>
-    </w:p>
-    <w:p>
-      <w:pPr>
-        <w:rPr>
-          <w:rFonts w:ascii="Courier New" w:hAnsi="Courier New" w:cs="Courier New"/>
-        </w:rPr>
-      </w:pPr>
-      <w:r>
-        <w:rPr>
-          <w:rFonts w:ascii="Courier New" w:hAnsi="Courier New" w:cs="Courier New"/>
-        </w:rPr>
-        <w:t>Function sendData() {</w:t>
+      <w:bookmarkEnd w:id="16"/>
+    </w:p>
+    <w:p>
+      <w:pPr>
+        <w:rPr>
+          <w:rFonts w:ascii="Courier New" w:hAnsi="Courier New" w:cs="Courier New"/>
+        </w:rPr>
+      </w:pPr>
+    </w:p>
+    <w:p>
+      <w:pPr>
+        <w:rPr>
+          <w:rFonts w:ascii="Courier New" w:hAnsi="Courier New" w:cs="Courier New"/>
+        </w:rPr>
+      </w:pPr>
+      <w:r>
+        <w:rPr>
+          <w:rFonts w:ascii="Courier New" w:hAnsi="Courier New" w:cs="Courier New"/>
+        </w:rPr>
+        <w:t xml:space="preserve">Function </w:t>
+      </w:r>
+      <w:proofErr w:type="spellStart"/>
+      <w:proofErr w:type="gramStart"/>
+      <w:r>
+        <w:rPr>
+          <w:rFonts w:ascii="Courier New" w:hAnsi="Courier New" w:cs="Courier New"/>
+        </w:rPr>
+        <w:t>sendData</w:t>
+      </w:r>
+      <w:proofErr w:type="spellEnd"/>
+      <w:r>
+        <w:rPr>
+          <w:rFonts w:ascii="Courier New" w:hAnsi="Courier New" w:cs="Courier New"/>
+        </w:rPr>
+        <w:t>(</w:t>
+      </w:r>
+      <w:proofErr w:type="gramEnd"/>
+      <w:r>
+        <w:rPr>
+          <w:rFonts w:ascii="Courier New" w:hAnsi="Courier New" w:cs="Courier New"/>
+        </w:rPr>
+        <w:t>) {</w:t>
       </w:r>
     </w:p>
     <w:p>
@@ -2248,13 +3056,27 @@
           <w:rFonts w:ascii="Courier New" w:hAnsi="Courier New" w:cs="Courier New"/>
         </w:rPr>
         <w:tab/>
-        <w:t xml:space="preserve">While ( </w:t>
-      </w:r>
-      <w:r>
-        <w:rPr>
-          <w:rFonts w:ascii="Courier New" w:hAnsi="Courier New" w:cs="Courier New"/>
-        </w:rPr>
-        <w:t xml:space="preserve">buffer &gt; 0 and </w:t>
+        <w:t xml:space="preserve">While </w:t>
+      </w:r>
+      <w:proofErr w:type="gramStart"/>
+      <w:r>
+        <w:rPr>
+          <w:rFonts w:ascii="Courier New" w:hAnsi="Courier New" w:cs="Courier New"/>
+        </w:rPr>
+        <w:t xml:space="preserve">( </w:t>
+      </w:r>
+      <w:r>
+        <w:rPr>
+          <w:rFonts w:ascii="Courier New" w:hAnsi="Courier New" w:cs="Courier New"/>
+        </w:rPr>
+        <w:t>buffer</w:t>
+      </w:r>
+      <w:proofErr w:type="gramEnd"/>
+      <w:r>
+        <w:rPr>
+          <w:rFonts w:ascii="Courier New" w:hAnsi="Courier New" w:cs="Courier New"/>
+        </w:rPr>
+        <w:t xml:space="preserve"> &gt; 0 and </w:t>
       </w:r>
       <w:r>
         <w:rPr>
@@ -2295,12 +3117,22 @@
         </w:rPr>
         <w:tab/>
       </w:r>
-      <w:r>
-        <w:rPr>
-          <w:rFonts w:ascii="Courier New" w:hAnsi="Courier New" w:cs="Courier New"/>
-        </w:rPr>
-        <w:t>constructPacket(</w:t>
-      </w:r>
+      <w:proofErr w:type="spellStart"/>
+      <w:proofErr w:type="gramStart"/>
+      <w:r>
+        <w:rPr>
+          <w:rFonts w:ascii="Courier New" w:hAnsi="Courier New" w:cs="Courier New"/>
+        </w:rPr>
+        <w:t>constructPacket</w:t>
+      </w:r>
+      <w:proofErr w:type="spellEnd"/>
+      <w:r>
+        <w:rPr>
+          <w:rFonts w:ascii="Courier New" w:hAnsi="Courier New" w:cs="Courier New"/>
+        </w:rPr>
+        <w:t>(</w:t>
+      </w:r>
+      <w:proofErr w:type="gramEnd"/>
       <w:r>
         <w:rPr>
           <w:rFonts w:ascii="Courier New" w:hAnsi="Courier New" w:cs="Courier New"/>
@@ -2313,12 +3145,14 @@
         </w:rPr>
         <w:t xml:space="preserve">, </w:t>
       </w:r>
+      <w:proofErr w:type="spellStart"/>
       <w:r>
         <w:rPr>
           <w:rFonts w:ascii="Courier New" w:hAnsi="Courier New" w:cs="Courier New"/>
         </w:rPr>
         <w:t>maxSends</w:t>
       </w:r>
+      <w:proofErr w:type="spellEnd"/>
       <w:r>
         <w:rPr>
           <w:rFonts w:ascii="Courier New" w:hAnsi="Courier New" w:cs="Courier New"/>
@@ -2368,7 +3202,36 @@
           <w:rFonts w:ascii="Courier New" w:hAnsi="Courier New" w:cs="Courier New"/>
         </w:rPr>
         <w:tab/>
-        <w:t>dataSize &lt;- min( bufferSize, 1019 )</w:t>
+      </w:r>
+      <w:proofErr w:type="spellStart"/>
+      <w:proofErr w:type="gramStart"/>
+      <w:r>
+        <w:rPr>
+          <w:rFonts w:ascii="Courier New" w:hAnsi="Courier New" w:cs="Courier New"/>
+        </w:rPr>
+        <w:t>dataSize</w:t>
+      </w:r>
+      <w:proofErr w:type="spellEnd"/>
+      <w:proofErr w:type="gramEnd"/>
+      <w:r>
+        <w:rPr>
+          <w:rFonts w:ascii="Courier New" w:hAnsi="Courier New" w:cs="Courier New"/>
+        </w:rPr>
+        <w:t xml:space="preserve"> &lt;- min( </w:t>
+      </w:r>
+      <w:proofErr w:type="spellStart"/>
+      <w:r>
+        <w:rPr>
+          <w:rFonts w:ascii="Courier New" w:hAnsi="Courier New" w:cs="Courier New"/>
+        </w:rPr>
+        <w:t>bufferSize</w:t>
+      </w:r>
+      <w:proofErr w:type="spellEnd"/>
+      <w:r>
+        <w:rPr>
+          <w:rFonts w:ascii="Courier New" w:hAnsi="Courier New" w:cs="Courier New"/>
+        </w:rPr>
+        <w:t>, 1019 )</w:t>
       </w:r>
     </w:p>
     <w:p>
@@ -2427,8 +3290,24 @@
         <w:rPr>
           <w:rFonts w:ascii="Courier New" w:hAnsi="Courier New" w:cs="Courier New"/>
         </w:rPr>
-        <w:t>Response &lt;- waitForSendResponse()</w:t>
-      </w:r>
+        <w:t xml:space="preserve">Response &lt;- </w:t>
+      </w:r>
+      <w:proofErr w:type="spellStart"/>
+      <w:proofErr w:type="gramStart"/>
+      <w:r>
+        <w:rPr>
+          <w:rFonts w:ascii="Courier New" w:hAnsi="Courier New" w:cs="Courier New"/>
+        </w:rPr>
+        <w:t>waitForSendResponse</w:t>
+      </w:r>
+      <w:proofErr w:type="spellEnd"/>
+      <w:r>
+        <w:rPr>
+          <w:rFonts w:ascii="Courier New" w:hAnsi="Courier New" w:cs="Courier New"/>
+        </w:rPr>
+        <w:t>()</w:t>
+      </w:r>
+      <w:proofErr w:type="gramEnd"/>
     </w:p>
     <w:p>
       <w:pPr>
@@ -2463,7 +3342,21 @@
           <w:rFonts w:ascii="Courier New" w:hAnsi="Courier New" w:cs="Courier New"/>
         </w:rPr>
         <w:tab/>
-        <w:t xml:space="preserve">If ( response = </w:t>
+        <w:t xml:space="preserve">If </w:t>
+      </w:r>
+      <w:proofErr w:type="gramStart"/>
+      <w:r>
+        <w:rPr>
+          <w:rFonts w:ascii="Courier New" w:hAnsi="Courier New" w:cs="Courier New"/>
+        </w:rPr>
+        <w:t>( response</w:t>
+      </w:r>
+      <w:proofErr w:type="gramEnd"/>
+      <w:r>
+        <w:rPr>
+          <w:rFonts w:ascii="Courier New" w:hAnsi="Courier New" w:cs="Courier New"/>
+        </w:rPr>
+        <w:t xml:space="preserve"> = </w:t>
       </w:r>
       <w:r>
         <w:rPr>
@@ -2532,8 +3425,31 @@
           <w:rFonts w:ascii="Courier New" w:hAnsi="Courier New" w:cs="Courier New"/>
         </w:rPr>
         <w:tab/>
-        <w:t>sendSync &lt;- not sendSync</w:t>
-      </w:r>
+      </w:r>
+      <w:proofErr w:type="spellStart"/>
+      <w:proofErr w:type="gramStart"/>
+      <w:r>
+        <w:rPr>
+          <w:rFonts w:ascii="Courier New" w:hAnsi="Courier New" w:cs="Courier New"/>
+        </w:rPr>
+        <w:t>sendSync</w:t>
+      </w:r>
+      <w:proofErr w:type="spellEnd"/>
+      <w:proofErr w:type="gramEnd"/>
+      <w:r>
+        <w:rPr>
+          <w:rFonts w:ascii="Courier New" w:hAnsi="Courier New" w:cs="Courier New"/>
+        </w:rPr>
+        <w:t xml:space="preserve"> &lt;- not </w:t>
+      </w:r>
+      <w:proofErr w:type="spellStart"/>
+      <w:r>
+        <w:rPr>
+          <w:rFonts w:ascii="Courier New" w:hAnsi="Courier New" w:cs="Courier New"/>
+        </w:rPr>
+        <w:t>sendSync</w:t>
+      </w:r>
+      <w:proofErr w:type="spellEnd"/>
     </w:p>
     <w:p>
       <w:pPr>
@@ -2560,6 +3476,7 @@
         <w:tab/>
         <w:t xml:space="preserve">Remove </w:t>
       </w:r>
+      <w:proofErr w:type="spellStart"/>
       <w:r>
         <w:rPr>
           <w:rFonts w:ascii="Courier New" w:hAnsi="Courier New" w:cs="Courier New"/>
@@ -2570,7 +3487,14 @@
         <w:rPr>
           <w:rFonts w:ascii="Courier New" w:hAnsi="Courier New" w:cs="Courier New"/>
         </w:rPr>
-        <w:t>Size bits from buffer</w:t>
+        <w:t>Size</w:t>
+      </w:r>
+      <w:proofErr w:type="spellEnd"/>
+      <w:r>
+        <w:rPr>
+          <w:rFonts w:ascii="Courier New" w:hAnsi="Courier New" w:cs="Courier New"/>
+        </w:rPr>
+        <w:t xml:space="preserve"> bits from buffer</w:t>
       </w:r>
     </w:p>
     <w:p>
@@ -2699,7 +3623,29 @@
         <w:rPr>
           <w:rFonts w:ascii="Courier New" w:hAnsi="Courier New" w:cs="Courier New"/>
         </w:rPr>
-        <w:t>Function constructPacket( packet</w:t>
+        <w:t xml:space="preserve">Function </w:t>
+      </w:r>
+      <w:proofErr w:type="spellStart"/>
+      <w:proofErr w:type="gramStart"/>
+      <w:r>
+        <w:rPr>
+          <w:rFonts w:ascii="Courier New" w:hAnsi="Courier New" w:cs="Courier New"/>
+        </w:rPr>
+        <w:t>constructPacket</w:t>
+      </w:r>
+      <w:proofErr w:type="spellEnd"/>
+      <w:r>
+        <w:rPr>
+          <w:rFonts w:ascii="Courier New" w:hAnsi="Courier New" w:cs="Courier New"/>
+        </w:rPr>
+        <w:t>(</w:t>
+      </w:r>
+      <w:proofErr w:type="gramEnd"/>
+      <w:r>
+        <w:rPr>
+          <w:rFonts w:ascii="Courier New" w:hAnsi="Courier New" w:cs="Courier New"/>
+        </w:rPr>
+        <w:t xml:space="preserve"> packet</w:t>
       </w:r>
       <w:r>
         <w:rPr>
@@ -2707,12 +3653,14 @@
         </w:rPr>
         <w:t xml:space="preserve">, </w:t>
       </w:r>
+      <w:proofErr w:type="spellStart"/>
       <w:r>
         <w:rPr>
           <w:rFonts w:ascii="Courier New" w:hAnsi="Courier New" w:cs="Courier New"/>
         </w:rPr>
         <w:t>maxSends</w:t>
       </w:r>
+      <w:proofErr w:type="spellEnd"/>
       <w:r>
         <w:rPr>
           <w:rFonts w:ascii="Courier New" w:hAnsi="Courier New" w:cs="Courier New"/>
@@ -2736,7 +3684,21 @@
         <w:rPr>
           <w:rFonts w:ascii="Courier New" w:hAnsi="Courier New" w:cs="Courier New"/>
         </w:rPr>
-        <w:t>If ( buffer &gt; 1018</w:t>
+        <w:t xml:space="preserve">If </w:t>
+      </w:r>
+      <w:proofErr w:type="gramStart"/>
+      <w:r>
+        <w:rPr>
+          <w:rFonts w:ascii="Courier New" w:hAnsi="Courier New" w:cs="Courier New"/>
+        </w:rPr>
+        <w:t>( buffer</w:t>
+      </w:r>
+      <w:proofErr w:type="gramEnd"/>
+      <w:r>
+        <w:rPr>
+          <w:rFonts w:ascii="Courier New" w:hAnsi="Courier New" w:cs="Courier New"/>
+        </w:rPr>
+        <w:t xml:space="preserve"> &gt; 1018</w:t>
       </w:r>
       <w:r>
         <w:rPr>
@@ -2754,8 +3716,16 @@
         <w:rPr>
           <w:rFonts w:ascii="Courier New" w:hAnsi="Courier New" w:cs="Courier New"/>
         </w:rPr>
-        <w:t>not maxSends</w:t>
-      </w:r>
+        <w:t xml:space="preserve">not </w:t>
+      </w:r>
+      <w:proofErr w:type="spellStart"/>
+      <w:r>
+        <w:rPr>
+          <w:rFonts w:ascii="Courier New" w:hAnsi="Courier New" w:cs="Courier New"/>
+        </w:rPr>
+        <w:t>maxSends</w:t>
+      </w:r>
+      <w:proofErr w:type="spellEnd"/>
       <w:r>
         <w:rPr>
           <w:rFonts w:ascii="Courier New" w:hAnsi="Courier New" w:cs="Courier New"/>
@@ -2790,12 +3760,30 @@
           <w:rFonts w:ascii="Courier New" w:hAnsi="Courier New" w:cs="Courier New"/>
         </w:rPr>
       </w:pPr>
-      <w:r>
-        <w:rPr>
-          <w:rFonts w:ascii="Courier New" w:hAnsi="Courier New" w:cs="Courier New"/>
-        </w:rPr>
-        <w:t>syncSend &lt;- not syncSend</w:t>
-      </w:r>
+      <w:proofErr w:type="spellStart"/>
+      <w:proofErr w:type="gramStart"/>
+      <w:r>
+        <w:rPr>
+          <w:rFonts w:ascii="Courier New" w:hAnsi="Courier New" w:cs="Courier New"/>
+        </w:rPr>
+        <w:t>syncSend</w:t>
+      </w:r>
+      <w:proofErr w:type="spellEnd"/>
+      <w:proofErr w:type="gramEnd"/>
+      <w:r>
+        <w:rPr>
+          <w:rFonts w:ascii="Courier New" w:hAnsi="Courier New" w:cs="Courier New"/>
+        </w:rPr>
+        <w:t xml:space="preserve"> &lt;- not </w:t>
+      </w:r>
+      <w:proofErr w:type="spellStart"/>
+      <w:r>
+        <w:rPr>
+          <w:rFonts w:ascii="Courier New" w:hAnsi="Courier New" w:cs="Courier New"/>
+        </w:rPr>
+        <w:t>syncSend</w:t>
+      </w:r>
+      <w:proofErr w:type="spellEnd"/>
     </w:p>
     <w:p>
       <w:pPr>
@@ -2808,8 +3796,16 @@
         <w:rPr>
           <w:rFonts w:ascii="Courier New" w:hAnsi="Courier New" w:cs="Courier New"/>
         </w:rPr>
-        <w:t>Packet &lt;- packet + syncSend</w:t>
-      </w:r>
+        <w:t xml:space="preserve">Packet &lt;- packet + </w:t>
+      </w:r>
+      <w:proofErr w:type="spellStart"/>
+      <w:r>
+        <w:rPr>
+          <w:rFonts w:ascii="Courier New" w:hAnsi="Courier New" w:cs="Courier New"/>
+        </w:rPr>
+        <w:t>syncSend</w:t>
+      </w:r>
+      <w:proofErr w:type="spellEnd"/>
     </w:p>
     <w:p>
       <w:pPr>
@@ -2867,7 +3863,21 @@
         <w:rPr>
           <w:rFonts w:ascii="Courier New" w:hAnsi="Courier New" w:cs="Courier New"/>
         </w:rPr>
-        <w:t xml:space="preserve"> buffer[i]</w:t>
+        <w:t xml:space="preserve"> buffer[</w:t>
+      </w:r>
+      <w:proofErr w:type="spellStart"/>
+      <w:r>
+        <w:rPr>
+          <w:rFonts w:ascii="Courier New" w:hAnsi="Courier New" w:cs="Courier New"/>
+        </w:rPr>
+        <w:t>i</w:t>
+      </w:r>
+      <w:proofErr w:type="spellEnd"/>
+      <w:r>
+        <w:rPr>
+          <w:rFonts w:ascii="Courier New" w:hAnsi="Courier New" w:cs="Courier New"/>
+        </w:rPr>
+        <w:t>]</w:t>
       </w:r>
       <w:r>
         <w:rPr>
@@ -2917,32 +3927,58 @@
           <w:rFonts w:ascii="Courier New" w:hAnsi="Courier New" w:cs="Courier New"/>
         </w:rPr>
       </w:pPr>
-      <w:r>
-        <w:rPr>
-          <w:rFonts w:ascii="Courier New" w:hAnsi="Courier New" w:cs="Courier New"/>
-        </w:rPr>
-        <w:t>syncSend &lt;- not syncSend</w:t>
-      </w:r>
-    </w:p>
-    <w:p>
-      <w:pPr>
-        <w:rPr>
-          <w:rFonts w:ascii="Courier New" w:hAnsi="Courier New" w:cs="Courier New"/>
-        </w:rPr>
-      </w:pPr>
-      <w:r>
-        <w:rPr>
-          <w:rFonts w:ascii="Courier New" w:hAnsi="Courier New" w:cs="Courier New"/>
-        </w:rPr>
-        <w:tab/>
-      </w:r>
-      <w:r>
-        <w:rPr>
-          <w:rFonts w:ascii="Courier New" w:hAnsi="Courier New" w:cs="Courier New"/>
-        </w:rPr>
-        <w:tab/>
-        <w:t>Packet &lt;- packet + syncSend</w:t>
-      </w:r>
+      <w:proofErr w:type="spellStart"/>
+      <w:proofErr w:type="gramStart"/>
+      <w:r>
+        <w:rPr>
+          <w:rFonts w:ascii="Courier New" w:hAnsi="Courier New" w:cs="Courier New"/>
+        </w:rPr>
+        <w:t>syncSend</w:t>
+      </w:r>
+      <w:proofErr w:type="spellEnd"/>
+      <w:proofErr w:type="gramEnd"/>
+      <w:r>
+        <w:rPr>
+          <w:rFonts w:ascii="Courier New" w:hAnsi="Courier New" w:cs="Courier New"/>
+        </w:rPr>
+        <w:t xml:space="preserve"> &lt;- not </w:t>
+      </w:r>
+      <w:proofErr w:type="spellStart"/>
+      <w:r>
+        <w:rPr>
+          <w:rFonts w:ascii="Courier New" w:hAnsi="Courier New" w:cs="Courier New"/>
+        </w:rPr>
+        <w:t>syncSend</w:t>
+      </w:r>
+      <w:proofErr w:type="spellEnd"/>
+    </w:p>
+    <w:p>
+      <w:pPr>
+        <w:rPr>
+          <w:rFonts w:ascii="Courier New" w:hAnsi="Courier New" w:cs="Courier New"/>
+        </w:rPr>
+      </w:pPr>
+      <w:r>
+        <w:rPr>
+          <w:rFonts w:ascii="Courier New" w:hAnsi="Courier New" w:cs="Courier New"/>
+        </w:rPr>
+        <w:tab/>
+      </w:r>
+      <w:r>
+        <w:rPr>
+          <w:rFonts w:ascii="Courier New" w:hAnsi="Courier New" w:cs="Courier New"/>
+        </w:rPr>
+        <w:tab/>
+        <w:t xml:space="preserve">Packet &lt;- packet + </w:t>
+      </w:r>
+      <w:proofErr w:type="spellStart"/>
+      <w:r>
+        <w:rPr>
+          <w:rFonts w:ascii="Courier New" w:hAnsi="Courier New" w:cs="Courier New"/>
+        </w:rPr>
+        <w:t>syncSend</w:t>
+      </w:r>
+      <w:proofErr w:type="spellEnd"/>
     </w:p>
     <w:p>
       <w:pPr>
@@ -2994,7 +4030,21 @@
           <w:rFonts w:ascii="Courier New" w:hAnsi="Courier New" w:cs="Courier New"/>
         </w:rPr>
         <w:tab/>
-        <w:t>Packet &lt;- packet + buffer[i]</w:t>
+        <w:t>Packet &lt;- packet + buffer[</w:t>
+      </w:r>
+      <w:proofErr w:type="spellStart"/>
+      <w:r>
+        <w:rPr>
+          <w:rFonts w:ascii="Courier New" w:hAnsi="Courier New" w:cs="Courier New"/>
+        </w:rPr>
+        <w:t>i</w:t>
+      </w:r>
+      <w:proofErr w:type="spellEnd"/>
+      <w:r>
+        <w:rPr>
+          <w:rFonts w:ascii="Courier New" w:hAnsi="Courier New" w:cs="Courier New"/>
+        </w:rPr>
+        <w:t>]</w:t>
       </w:r>
     </w:p>
     <w:p>
@@ -3095,11 +4145,27 @@
         </w:rPr>
         <w:tab/>
       </w:r>
-      <w:r>
-        <w:rPr>
-          <w:rFonts w:ascii="Courier New" w:hAnsi="Courier New" w:cs="Courier New"/>
-        </w:rPr>
-        <w:t>setCRC( packet )</w:t>
+      <w:proofErr w:type="spellStart"/>
+      <w:proofErr w:type="gramStart"/>
+      <w:r>
+        <w:rPr>
+          <w:rFonts w:ascii="Courier New" w:hAnsi="Courier New" w:cs="Courier New"/>
+        </w:rPr>
+        <w:t>setCRC</w:t>
+      </w:r>
+      <w:proofErr w:type="spellEnd"/>
+      <w:r>
+        <w:rPr>
+          <w:rFonts w:ascii="Courier New" w:hAnsi="Courier New" w:cs="Courier New"/>
+        </w:rPr>
+        <w:t>(</w:t>
+      </w:r>
+      <w:proofErr w:type="gramEnd"/>
+      <w:r>
+        <w:rPr>
+          <w:rFonts w:ascii="Courier New" w:hAnsi="Courier New" w:cs="Courier New"/>
+        </w:rPr>
+        <w:t xml:space="preserve"> packet )</w:t>
       </w:r>
     </w:p>
     <w:p>
@@ -3133,26 +4199,56 @@
           <w:rFonts w:ascii="Courier New" w:hAnsi="Courier New" w:cs="Courier New"/>
         </w:rPr>
         <w:lastRenderedPageBreak/>
-        <w:t>Function setCRC( packet ) {</w:t>
-      </w:r>
-    </w:p>
-    <w:p>
-      <w:pPr>
-        <w:rPr>
-          <w:rFonts w:ascii="Courier New" w:hAnsi="Courier New" w:cs="Courier New"/>
-        </w:rPr>
-      </w:pPr>
-      <w:r>
-        <w:rPr>
-          <w:rFonts w:ascii="Courier New" w:hAnsi="Courier New" w:cs="Courier New"/>
-        </w:rPr>
-        <w:tab/>
-      </w:r>
-      <w:r>
-        <w:rPr>
-          <w:rFonts w:ascii="Courier New" w:hAnsi="Courier New" w:cs="Courier New"/>
-        </w:rPr>
-        <w:t xml:space="preserve">Crc &lt;- Create CRC with dividend </w:t>
+        <w:t xml:space="preserve">Function </w:t>
+      </w:r>
+      <w:proofErr w:type="spellStart"/>
+      <w:proofErr w:type="gramStart"/>
+      <w:r>
+        <w:rPr>
+          <w:rFonts w:ascii="Courier New" w:hAnsi="Courier New" w:cs="Courier New"/>
+        </w:rPr>
+        <w:t>setCRC</w:t>
+      </w:r>
+      <w:proofErr w:type="spellEnd"/>
+      <w:r>
+        <w:rPr>
+          <w:rFonts w:ascii="Courier New" w:hAnsi="Courier New" w:cs="Courier New"/>
+        </w:rPr>
+        <w:t>(</w:t>
+      </w:r>
+      <w:proofErr w:type="gramEnd"/>
+      <w:r>
+        <w:rPr>
+          <w:rFonts w:ascii="Courier New" w:hAnsi="Courier New" w:cs="Courier New"/>
+        </w:rPr>
+        <w:t xml:space="preserve"> packet ) {</w:t>
+      </w:r>
+    </w:p>
+    <w:p>
+      <w:pPr>
+        <w:rPr>
+          <w:rFonts w:ascii="Courier New" w:hAnsi="Courier New" w:cs="Courier New"/>
+        </w:rPr>
+      </w:pPr>
+      <w:r>
+        <w:rPr>
+          <w:rFonts w:ascii="Courier New" w:hAnsi="Courier New" w:cs="Courier New"/>
+        </w:rPr>
+        <w:tab/>
+      </w:r>
+      <w:proofErr w:type="spellStart"/>
+      <w:r>
+        <w:rPr>
+          <w:rFonts w:ascii="Courier New" w:hAnsi="Courier New" w:cs="Courier New"/>
+        </w:rPr>
+        <w:t>Crc</w:t>
+      </w:r>
+      <w:proofErr w:type="spellEnd"/>
+      <w:r>
+        <w:rPr>
+          <w:rFonts w:ascii="Courier New" w:hAnsi="Courier New" w:cs="Courier New"/>
+        </w:rPr>
+        <w:t xml:space="preserve"> &lt;- Create CRC with dividend </w:t>
       </w:r>
       <w:r>
         <w:rPr>
@@ -3172,8 +4268,16 @@
           <w:rFonts w:ascii="Courier New" w:hAnsi="Courier New" w:cs="Courier New"/>
         </w:rPr>
         <w:tab/>
-        <w:t>Packet &lt;- packet + crc</w:t>
-      </w:r>
+        <w:t xml:space="preserve">Packet &lt;- packet + </w:t>
+      </w:r>
+      <w:proofErr w:type="spellStart"/>
+      <w:r>
+        <w:rPr>
+          <w:rFonts w:ascii="Courier New" w:hAnsi="Courier New" w:cs="Courier New"/>
+        </w:rPr>
+        <w:t>crc</w:t>
+      </w:r>
+      <w:proofErr w:type="spellEnd"/>
     </w:p>
     <w:p>
       <w:pPr>
@@ -4653,7 +5757,7 @@
 </file>
 
 <file path=customXml/itemProps1.xml><?xml version="1.0" encoding="utf-8"?>
-<ds:datastoreItem xmlns:ds="http://schemas.openxmlformats.org/officeDocument/2006/customXml" ds:itemID="{168EB4F2-3580-421D-85B9-0F1008D60990}">
+<ds:datastoreItem xmlns:ds="http://schemas.openxmlformats.org/officeDocument/2006/customXml" ds:itemID="{C60416E6-BD07-4563-A77A-431DE2A658DF}">
   <ds:schemaRefs>
     <ds:schemaRef ds:uri="http://schemas.openxmlformats.org/officeDocument/2006/bibliography"/>
   </ds:schemaRefs>

</xml_diff>

<commit_message>
Updated timeline and work breakdown
</commit_message>
<xml_diff>
--- a/Design & Documents/Design Document.docx
+++ b/Design & Documents/Design Document.docx
@@ -92,12 +92,7 @@
         <w:t xml:space="preserve"> – </w:t>
       </w:r>
       <w:r>
-        <w:t>A0086099</w:t>
-      </w:r>
-      <w:bookmarkStart w:id="7" w:name="_GoBack"/>
-      <w:bookmarkEnd w:id="7"/>
-      <w:r>
-        <w:t xml:space="preserve">4 </w:t>
+        <w:t xml:space="preserve">A00860994 </w:t>
       </w:r>
       <w:r>
         <w:t>– Set 3O</w:t>
@@ -111,7 +106,7 @@
         <w:pStyle w:val="Heading1"/>
         <w:jc w:val="center"/>
       </w:pPr>
-      <w:bookmarkStart w:id="8" w:name="_Toc403716933"/>
+      <w:bookmarkStart w:id="7" w:name="_Toc403716933"/>
       <w:r>
         <w:t xml:space="preserve">Thomas </w:t>
       </w:r>
@@ -123,7 +118,7 @@
       <w:r>
         <w:t xml:space="preserve"> – A00000000 – Set 3O</w:t>
       </w:r>
-      <w:bookmarkEnd w:id="8"/>
+      <w:bookmarkEnd w:id="7"/>
     </w:p>
     <w:sdt>
       <w:sdtPr>
@@ -764,12 +759,12 @@
       <w:pPr>
         <w:pStyle w:val="Heading1"/>
       </w:pPr>
-      <w:bookmarkStart w:id="9" w:name="_Toc403716934"/>
+      <w:bookmarkStart w:id="8" w:name="_Toc403716934"/>
       <w:r>
         <w:lastRenderedPageBreak/>
         <w:t>State Flow Diagram</w:t>
       </w:r>
-      <w:bookmarkEnd w:id="9"/>
+      <w:bookmarkEnd w:id="8"/>
     </w:p>
     <w:p>
       <w:pPr>
@@ -783,23 +778,219 @@
       <w:r>
         <w:br w:type="page"/>
       </w:r>
-      <w:bookmarkStart w:id="10" w:name="_Toc403716935"/>
+      <w:bookmarkStart w:id="9" w:name="_Toc403716935"/>
       <w:r>
         <w:lastRenderedPageBreak/>
         <w:t>Pseudo Code</w:t>
       </w:r>
+      <w:bookmarkEnd w:id="9"/>
+    </w:p>
+    <w:p/>
+    <w:p>
+      <w:pPr>
+        <w:pStyle w:val="Heading2"/>
+      </w:pPr>
+      <w:bookmarkStart w:id="10" w:name="_Toc403716936"/>
+      <w:r>
+        <w:t>Setup</w:t>
+      </w:r>
       <w:bookmarkEnd w:id="10"/>
     </w:p>
     <w:p/>
     <w:p>
       <w:pPr>
+        <w:rPr>
+          <w:rFonts w:ascii="Courier New" w:hAnsi="Courier New" w:cs="Courier New"/>
+        </w:rPr>
+      </w:pPr>
+      <w:r>
+        <w:rPr>
+          <w:rFonts w:ascii="Courier New" w:hAnsi="Courier New" w:cs="Courier New"/>
+        </w:rPr>
+        <w:t xml:space="preserve">Function </w:t>
+      </w:r>
+      <w:proofErr w:type="spellStart"/>
+      <w:proofErr w:type="gramStart"/>
+      <w:r>
+        <w:rPr>
+          <w:rFonts w:ascii="Courier New" w:hAnsi="Courier New" w:cs="Courier New"/>
+        </w:rPr>
+        <w:t>setupComm</w:t>
+      </w:r>
+      <w:proofErr w:type="spellEnd"/>
+      <w:r>
+        <w:rPr>
+          <w:rFonts w:ascii="Courier New" w:hAnsi="Courier New" w:cs="Courier New"/>
+        </w:rPr>
+        <w:t>(</w:t>
+      </w:r>
+      <w:proofErr w:type="gramEnd"/>
+      <w:r>
+        <w:rPr>
+          <w:rFonts w:ascii="Courier New" w:hAnsi="Courier New" w:cs="Courier New"/>
+        </w:rPr>
+        <w:t>) {</w:t>
+      </w:r>
+    </w:p>
+    <w:p>
+      <w:pPr>
+        <w:rPr>
+          <w:rFonts w:ascii="Courier New" w:hAnsi="Courier New" w:cs="Courier New"/>
+        </w:rPr>
+      </w:pPr>
+      <w:r>
+        <w:rPr>
+          <w:rFonts w:ascii="Courier New" w:hAnsi="Courier New" w:cs="Courier New"/>
+        </w:rPr>
+        <w:tab/>
+        <w:t xml:space="preserve">Open the </w:t>
+      </w:r>
+      <w:proofErr w:type="spellStart"/>
+      <w:r>
+        <w:rPr>
+          <w:rFonts w:ascii="Courier New" w:hAnsi="Courier New" w:cs="Courier New"/>
+        </w:rPr>
+        <w:t>Comm</w:t>
+      </w:r>
+      <w:proofErr w:type="spellEnd"/>
+      <w:r>
+        <w:rPr>
+          <w:rFonts w:ascii="Courier New" w:hAnsi="Courier New" w:cs="Courier New"/>
+        </w:rPr>
+        <w:t xml:space="preserve"> Port with pre-defined settings</w:t>
+      </w:r>
+    </w:p>
+    <w:p>
+      <w:pPr>
+        <w:rPr>
+          <w:rFonts w:ascii="Courier New" w:hAnsi="Courier New" w:cs="Courier New"/>
+        </w:rPr>
+      </w:pPr>
+      <w:r>
+        <w:rPr>
+          <w:rFonts w:ascii="Courier New" w:hAnsi="Courier New" w:cs="Courier New"/>
+        </w:rPr>
+        <w:tab/>
+        <w:t xml:space="preserve">If </w:t>
+      </w:r>
+      <w:proofErr w:type="spellStart"/>
+      <w:r>
+        <w:rPr>
+          <w:rFonts w:ascii="Courier New" w:hAnsi="Courier New" w:cs="Courier New"/>
+        </w:rPr>
+        <w:t>Comm</w:t>
+      </w:r>
+      <w:proofErr w:type="spellEnd"/>
+      <w:r>
+        <w:rPr>
+          <w:rFonts w:ascii="Courier New" w:hAnsi="Courier New" w:cs="Courier New"/>
+        </w:rPr>
+        <w:t xml:space="preserve"> Port is not open</w:t>
+      </w:r>
+    </w:p>
+    <w:p>
+      <w:pPr>
+        <w:rPr>
+          <w:rFonts w:ascii="Courier New" w:hAnsi="Courier New" w:cs="Courier New"/>
+        </w:rPr>
+      </w:pPr>
+      <w:r>
+        <w:rPr>
+          <w:rFonts w:ascii="Courier New" w:hAnsi="Courier New" w:cs="Courier New"/>
+        </w:rPr>
+        <w:tab/>
+      </w:r>
+      <w:r>
+        <w:rPr>
+          <w:rFonts w:ascii="Courier New" w:hAnsi="Courier New" w:cs="Courier New"/>
+        </w:rPr>
+        <w:tab/>
+        <w:t>Display an error message</w:t>
+      </w:r>
+    </w:p>
+    <w:p>
+      <w:pPr>
+        <w:rPr>
+          <w:rFonts w:ascii="Courier New" w:hAnsi="Courier New" w:cs="Courier New"/>
+        </w:rPr>
+      </w:pPr>
+      <w:r>
+        <w:rPr>
+          <w:rFonts w:ascii="Courier New" w:hAnsi="Courier New" w:cs="Courier New"/>
+        </w:rPr>
+        <w:tab/>
+      </w:r>
+      <w:r>
+        <w:rPr>
+          <w:rFonts w:ascii="Courier New" w:hAnsi="Courier New" w:cs="Courier New"/>
+        </w:rPr>
+        <w:tab/>
+        <w:t>Terminate progr</w:t>
+      </w:r>
+      <w:bookmarkStart w:id="11" w:name="_GoBack"/>
+      <w:bookmarkEnd w:id="11"/>
+      <w:r>
+        <w:rPr>
+          <w:rFonts w:ascii="Courier New" w:hAnsi="Courier New" w:cs="Courier New"/>
+        </w:rPr>
+        <w:t>am</w:t>
+      </w:r>
+    </w:p>
+    <w:p>
+      <w:pPr>
+        <w:rPr>
+          <w:rFonts w:ascii="Courier New" w:hAnsi="Courier New" w:cs="Courier New"/>
+        </w:rPr>
+      </w:pPr>
+      <w:r>
+        <w:rPr>
+          <w:rFonts w:ascii="Courier New" w:hAnsi="Courier New" w:cs="Courier New"/>
+        </w:rPr>
+        <w:tab/>
+        <w:t>Create a</w:t>
+      </w:r>
+      <w:r>
+        <w:rPr>
+          <w:rFonts w:ascii="Courier New" w:hAnsi="Courier New" w:cs="Courier New"/>
+        </w:rPr>
+        <w:t xml:space="preserve"> Communications</w:t>
+      </w:r>
+      <w:r>
+        <w:rPr>
+          <w:rFonts w:ascii="Courier New" w:hAnsi="Courier New" w:cs="Courier New"/>
+        </w:rPr>
+        <w:t xml:space="preserve"> thread</w:t>
+      </w:r>
+    </w:p>
+    <w:p>
+      <w:pPr>
+        <w:rPr>
+          <w:rFonts w:ascii="Courier New" w:hAnsi="Courier New" w:cs="Courier New"/>
+        </w:rPr>
+      </w:pPr>
+      <w:r>
+        <w:rPr>
+          <w:rFonts w:ascii="Courier New" w:hAnsi="Courier New" w:cs="Courier New"/>
+        </w:rPr>
+        <w:t>}</w:t>
+      </w:r>
+    </w:p>
+    <w:p>
+      <w:pPr>
+        <w:rPr>
+          <w:rFonts w:ascii="Courier New" w:hAnsi="Courier New" w:cs="Courier New"/>
+        </w:rPr>
+      </w:pPr>
+    </w:p>
+    <w:p>
+      <w:pPr>
         <w:pStyle w:val="Heading2"/>
       </w:pPr>
-      <w:bookmarkStart w:id="11" w:name="_Toc403716936"/>
-      <w:r>
-        <w:t>Setup</w:t>
-      </w:r>
-      <w:bookmarkEnd w:id="11"/>
+      <w:bookmarkStart w:id="12" w:name="_Toc403716937"/>
+      <w:r>
+        <w:t>Idle</w:t>
+      </w:r>
+      <w:bookmarkEnd w:id="12"/>
     </w:p>
     <w:p/>
     <w:p>
@@ -814,13 +1005,244 @@
         </w:rPr>
         <w:t xml:space="preserve">Function </w:t>
       </w:r>
-      <w:proofErr w:type="spellStart"/>
       <w:proofErr w:type="gramStart"/>
       <w:r>
         <w:rPr>
           <w:rFonts w:ascii="Courier New" w:hAnsi="Courier New" w:cs="Courier New"/>
         </w:rPr>
-        <w:t>setupComm</w:t>
+        <w:t>idle(</w:t>
+      </w:r>
+      <w:proofErr w:type="gramEnd"/>
+      <w:r>
+        <w:rPr>
+          <w:rFonts w:ascii="Courier New" w:hAnsi="Courier New" w:cs="Courier New"/>
+        </w:rPr>
+        <w:t>) {</w:t>
+      </w:r>
+    </w:p>
+    <w:p>
+      <w:pPr>
+        <w:rPr>
+          <w:rFonts w:ascii="Courier New" w:hAnsi="Courier New" w:cs="Courier New"/>
+        </w:rPr>
+      </w:pPr>
+      <w:r>
+        <w:rPr>
+          <w:rFonts w:ascii="Courier New" w:hAnsi="Courier New" w:cs="Courier New"/>
+        </w:rPr>
+        <w:tab/>
+        <w:t>Create a Receiving thread</w:t>
+      </w:r>
+    </w:p>
+    <w:p>
+      <w:pPr>
+        <w:rPr>
+          <w:rFonts w:ascii="Courier New" w:hAnsi="Courier New" w:cs="Courier New"/>
+        </w:rPr>
+      </w:pPr>
+    </w:p>
+    <w:p>
+      <w:pPr>
+        <w:rPr>
+          <w:rFonts w:ascii="Courier New" w:hAnsi="Courier New" w:cs="Courier New"/>
+        </w:rPr>
+      </w:pPr>
+      <w:r>
+        <w:rPr>
+          <w:rFonts w:ascii="Courier New" w:hAnsi="Courier New" w:cs="Courier New"/>
+        </w:rPr>
+        <w:tab/>
+      </w:r>
+      <w:r>
+        <w:rPr>
+          <w:rFonts w:ascii="Courier New" w:hAnsi="Courier New" w:cs="Courier New"/>
+        </w:rPr>
+        <w:t>While true</w:t>
+      </w:r>
+    </w:p>
+    <w:p>
+      <w:pPr>
+        <w:rPr>
+          <w:rFonts w:ascii="Courier New" w:hAnsi="Courier New" w:cs="Courier New"/>
+        </w:rPr>
+      </w:pPr>
+      <w:r>
+        <w:rPr>
+          <w:rFonts w:ascii="Courier New" w:hAnsi="Courier New" w:cs="Courier New"/>
+        </w:rPr>
+        <w:tab/>
+      </w:r>
+      <w:r>
+        <w:rPr>
+          <w:rFonts w:ascii="Courier New" w:hAnsi="Courier New" w:cs="Courier New"/>
+        </w:rPr>
+        <w:tab/>
+        <w:t>If not receiving</w:t>
+      </w:r>
+    </w:p>
+    <w:p>
+      <w:pPr>
+        <w:rPr>
+          <w:rFonts w:ascii="Courier New" w:hAnsi="Courier New" w:cs="Courier New"/>
+        </w:rPr>
+      </w:pPr>
+      <w:r>
+        <w:rPr>
+          <w:rFonts w:ascii="Courier New" w:hAnsi="Courier New" w:cs="Courier New"/>
+        </w:rPr>
+        <w:tab/>
+      </w:r>
+      <w:r>
+        <w:rPr>
+          <w:rFonts w:ascii="Courier New" w:hAnsi="Courier New" w:cs="Courier New"/>
+        </w:rPr>
+        <w:tab/>
+      </w:r>
+      <w:r>
+        <w:rPr>
+          <w:rFonts w:ascii="Courier New" w:hAnsi="Courier New" w:cs="Courier New"/>
+        </w:rPr>
+        <w:tab/>
+        <w:t xml:space="preserve">If buffer &gt; 0 and </w:t>
+      </w:r>
+      <w:proofErr w:type="spellStart"/>
+      <w:r>
+        <w:rPr>
+          <w:rFonts w:ascii="Courier New" w:hAnsi="Courier New" w:cs="Courier New"/>
+        </w:rPr>
+        <w:t>resetTimer</w:t>
+      </w:r>
+      <w:proofErr w:type="spellEnd"/>
+      <w:r>
+        <w:rPr>
+          <w:rFonts w:ascii="Courier New" w:hAnsi="Courier New" w:cs="Courier New"/>
+        </w:rPr>
+        <w:t xml:space="preserve"> = 0</w:t>
+      </w:r>
+    </w:p>
+    <w:p>
+      <w:pPr>
+        <w:rPr>
+          <w:rFonts w:ascii="Courier New" w:hAnsi="Courier New" w:cs="Courier New"/>
+        </w:rPr>
+      </w:pPr>
+      <w:r>
+        <w:rPr>
+          <w:rFonts w:ascii="Courier New" w:hAnsi="Courier New" w:cs="Courier New"/>
+        </w:rPr>
+        <w:tab/>
+      </w:r>
+      <w:r>
+        <w:rPr>
+          <w:rFonts w:ascii="Courier New" w:hAnsi="Courier New" w:cs="Courier New"/>
+        </w:rPr>
+        <w:tab/>
+      </w:r>
+      <w:r>
+        <w:rPr>
+          <w:rFonts w:ascii="Courier New" w:hAnsi="Courier New" w:cs="Courier New"/>
+        </w:rPr>
+        <w:tab/>
+      </w:r>
+      <w:r>
+        <w:rPr>
+          <w:rFonts w:ascii="Courier New" w:hAnsi="Courier New" w:cs="Courier New"/>
+        </w:rPr>
+        <w:tab/>
+        <w:t>Sending &lt;- true</w:t>
+      </w:r>
+    </w:p>
+    <w:p>
+      <w:pPr>
+        <w:rPr>
+          <w:rFonts w:ascii="Courier New" w:hAnsi="Courier New" w:cs="Courier New"/>
+        </w:rPr>
+      </w:pPr>
+      <w:r>
+        <w:rPr>
+          <w:rFonts w:ascii="Courier New" w:hAnsi="Courier New" w:cs="Courier New"/>
+        </w:rPr>
+        <w:tab/>
+      </w:r>
+      <w:r>
+        <w:rPr>
+          <w:rFonts w:ascii="Courier New" w:hAnsi="Courier New" w:cs="Courier New"/>
+        </w:rPr>
+        <w:tab/>
+      </w:r>
+      <w:r>
+        <w:rPr>
+          <w:rFonts w:ascii="Courier New" w:hAnsi="Courier New" w:cs="Courier New"/>
+        </w:rPr>
+        <w:tab/>
+      </w:r>
+      <w:r>
+        <w:rPr>
+          <w:rFonts w:ascii="Courier New" w:hAnsi="Courier New" w:cs="Courier New"/>
+        </w:rPr>
+        <w:tab/>
+      </w:r>
+      <w:proofErr w:type="spellStart"/>
+      <w:proofErr w:type="gramStart"/>
+      <w:r>
+        <w:rPr>
+          <w:rFonts w:ascii="Courier New" w:hAnsi="Courier New" w:cs="Courier New"/>
+        </w:rPr>
+        <w:t>sendSync</w:t>
+      </w:r>
+      <w:proofErr w:type="spellEnd"/>
+      <w:proofErr w:type="gramEnd"/>
+      <w:r>
+        <w:rPr>
+          <w:rFonts w:ascii="Courier New" w:hAnsi="Courier New" w:cs="Courier New"/>
+        </w:rPr>
+        <w:t xml:space="preserve"> &lt;- SYN1</w:t>
+      </w:r>
+    </w:p>
+    <w:p>
+      <w:pPr>
+        <w:rPr>
+          <w:rFonts w:ascii="Courier New" w:hAnsi="Courier New" w:cs="Courier New"/>
+        </w:rPr>
+      </w:pPr>
+    </w:p>
+    <w:p>
+      <w:pPr>
+        <w:rPr>
+          <w:rFonts w:ascii="Courier New" w:hAnsi="Courier New" w:cs="Courier New"/>
+        </w:rPr>
+      </w:pPr>
+      <w:r>
+        <w:rPr>
+          <w:rFonts w:ascii="Courier New" w:hAnsi="Courier New" w:cs="Courier New"/>
+        </w:rPr>
+        <w:tab/>
+      </w:r>
+      <w:r>
+        <w:rPr>
+          <w:rFonts w:ascii="Courier New" w:hAnsi="Courier New" w:cs="Courier New"/>
+        </w:rPr>
+        <w:tab/>
+      </w:r>
+      <w:r>
+        <w:rPr>
+          <w:rFonts w:ascii="Courier New" w:hAnsi="Courier New" w:cs="Courier New"/>
+        </w:rPr>
+        <w:tab/>
+      </w:r>
+      <w:r>
+        <w:rPr>
+          <w:rFonts w:ascii="Courier New" w:hAnsi="Courier New" w:cs="Courier New"/>
+        </w:rPr>
+        <w:tab/>
+      </w:r>
+      <w:proofErr w:type="spellStart"/>
+      <w:proofErr w:type="gramStart"/>
+      <w:r>
+        <w:rPr>
+          <w:rFonts w:ascii="Courier New" w:hAnsi="Courier New" w:cs="Courier New"/>
+        </w:rPr>
+        <w:t>sendControlCharacter</w:t>
       </w:r>
       <w:proofErr w:type="spellEnd"/>
       <w:r>
@@ -834,6 +1256,126 @@
         <w:rPr>
           <w:rFonts w:ascii="Courier New" w:hAnsi="Courier New" w:cs="Courier New"/>
         </w:rPr>
+        <w:t xml:space="preserve"> ENQ )</w:t>
+      </w:r>
+    </w:p>
+    <w:p>
+      <w:pPr>
+        <w:rPr>
+          <w:rFonts w:ascii="Courier New" w:hAnsi="Courier New" w:cs="Courier New"/>
+        </w:rPr>
+      </w:pPr>
+      <w:r>
+        <w:rPr>
+          <w:rFonts w:ascii="Courier New" w:hAnsi="Courier New" w:cs="Courier New"/>
+        </w:rPr>
+        <w:tab/>
+      </w:r>
+      <w:r>
+        <w:rPr>
+          <w:rFonts w:ascii="Courier New" w:hAnsi="Courier New" w:cs="Courier New"/>
+        </w:rPr>
+        <w:tab/>
+      </w:r>
+      <w:r>
+        <w:rPr>
+          <w:rFonts w:ascii="Courier New" w:hAnsi="Courier New" w:cs="Courier New"/>
+        </w:rPr>
+        <w:tab/>
+      </w:r>
+      <w:r>
+        <w:rPr>
+          <w:rFonts w:ascii="Courier New" w:hAnsi="Courier New" w:cs="Courier New"/>
+        </w:rPr>
+        <w:tab/>
+      </w:r>
+      <w:proofErr w:type="spellStart"/>
+      <w:proofErr w:type="gramStart"/>
+      <w:r>
+        <w:rPr>
+          <w:rFonts w:ascii="Courier New" w:hAnsi="Courier New" w:cs="Courier New"/>
+        </w:rPr>
+        <w:t>waitForEnqResponse</w:t>
+      </w:r>
+      <w:proofErr w:type="spellEnd"/>
+      <w:r>
+        <w:rPr>
+          <w:rFonts w:ascii="Courier New" w:hAnsi="Courier New" w:cs="Courier New"/>
+        </w:rPr>
+        <w:t>()</w:t>
+      </w:r>
+      <w:proofErr w:type="gramEnd"/>
+    </w:p>
+    <w:p>
+      <w:pPr>
+        <w:rPr>
+          <w:rFonts w:ascii="Courier New" w:hAnsi="Courier New" w:cs="Courier New"/>
+        </w:rPr>
+      </w:pPr>
+    </w:p>
+    <w:p>
+      <w:pPr>
+        <w:rPr>
+          <w:rFonts w:ascii="Courier New" w:hAnsi="Courier New" w:cs="Courier New"/>
+        </w:rPr>
+      </w:pPr>
+      <w:r>
+        <w:rPr>
+          <w:rFonts w:ascii="Courier New" w:hAnsi="Courier New" w:cs="Courier New"/>
+        </w:rPr>
+        <w:t>}</w:t>
+      </w:r>
+    </w:p>
+    <w:p>
+      <w:pPr>
+        <w:rPr>
+          <w:rFonts w:ascii="Courier New" w:hAnsi="Courier New" w:cs="Courier New"/>
+        </w:rPr>
+      </w:pPr>
+    </w:p>
+    <w:p>
+      <w:pPr>
+        <w:pStyle w:val="Heading2"/>
+      </w:pPr>
+      <w:bookmarkStart w:id="13" w:name="_Toc403716938"/>
+      <w:r>
+        <w:t>Receive Start</w:t>
+      </w:r>
+      <w:bookmarkEnd w:id="13"/>
+    </w:p>
+    <w:p/>
+    <w:p>
+      <w:pPr>
+        <w:rPr>
+          <w:rFonts w:ascii="Courier New" w:hAnsi="Courier New" w:cs="Courier New"/>
+        </w:rPr>
+      </w:pPr>
+      <w:r>
+        <w:rPr>
+          <w:rFonts w:ascii="Courier New" w:hAnsi="Courier New" w:cs="Courier New"/>
+        </w:rPr>
+        <w:t xml:space="preserve">Function </w:t>
+      </w:r>
+      <w:proofErr w:type="spellStart"/>
+      <w:proofErr w:type="gramStart"/>
+      <w:r>
+        <w:rPr>
+          <w:rFonts w:ascii="Courier New" w:hAnsi="Courier New" w:cs="Courier New"/>
+        </w:rPr>
+        <w:t>waitForEnquiry</w:t>
+      </w:r>
+      <w:proofErr w:type="spellEnd"/>
+      <w:r>
+        <w:rPr>
+          <w:rFonts w:ascii="Courier New" w:hAnsi="Courier New" w:cs="Courier New"/>
+        </w:rPr>
+        <w:t>(</w:t>
+      </w:r>
+      <w:proofErr w:type="gramEnd"/>
+      <w:r>
+        <w:rPr>
+          <w:rFonts w:ascii="Courier New" w:hAnsi="Courier New" w:cs="Courier New"/>
+        </w:rPr>
         <w:t>) {</w:t>
       </w:r>
     </w:p>
@@ -848,29 +1390,89 @@
           <w:rFonts w:ascii="Courier New" w:hAnsi="Courier New" w:cs="Courier New"/>
         </w:rPr>
         <w:tab/>
-        <w:t xml:space="preserve">Open the </w:t>
-      </w:r>
-      <w:proofErr w:type="spellStart"/>
-      <w:r>
-        <w:rPr>
-          <w:rFonts w:ascii="Courier New" w:hAnsi="Courier New" w:cs="Courier New"/>
-        </w:rPr>
-        <w:t>Comm</w:t>
-      </w:r>
-      <w:proofErr w:type="spellEnd"/>
-      <w:r>
-        <w:rPr>
-          <w:rFonts w:ascii="Courier New" w:hAnsi="Courier New" w:cs="Courier New"/>
-        </w:rPr>
-        <w:t xml:space="preserve"> Port with pre-defined settings</w:t>
-      </w:r>
-    </w:p>
-    <w:p>
-      <w:pPr>
-        <w:rPr>
-          <w:rFonts w:ascii="Courier New" w:hAnsi="Courier New" w:cs="Courier New"/>
-        </w:rPr>
-      </w:pPr>
+      </w:r>
+      <w:r>
+        <w:rPr>
+          <w:rFonts w:ascii="Courier New" w:hAnsi="Courier New" w:cs="Courier New"/>
+        </w:rPr>
+        <w:t>While true</w:t>
+      </w:r>
+    </w:p>
+    <w:p>
+      <w:pPr>
+        <w:rPr>
+          <w:rFonts w:ascii="Courier New" w:hAnsi="Courier New" w:cs="Courier New"/>
+        </w:rPr>
+      </w:pPr>
+      <w:r>
+        <w:rPr>
+          <w:rFonts w:ascii="Courier New" w:hAnsi="Courier New" w:cs="Courier New"/>
+        </w:rPr>
+        <w:tab/>
+      </w:r>
+      <w:r>
+        <w:rPr>
+          <w:rFonts w:ascii="Courier New" w:hAnsi="Courier New" w:cs="Courier New"/>
+        </w:rPr>
+        <w:tab/>
+      </w:r>
+      <w:r>
+        <w:rPr>
+          <w:rFonts w:ascii="Courier New" w:hAnsi="Courier New" w:cs="Courier New"/>
+        </w:rPr>
+        <w:t>If not sending</w:t>
+      </w:r>
+    </w:p>
+    <w:p>
+      <w:pPr>
+        <w:rPr>
+          <w:rFonts w:ascii="Courier New" w:hAnsi="Courier New" w:cs="Courier New"/>
+        </w:rPr>
+      </w:pPr>
+      <w:r>
+        <w:rPr>
+          <w:rFonts w:ascii="Courier New" w:hAnsi="Courier New" w:cs="Courier New"/>
+        </w:rPr>
+        <w:lastRenderedPageBreak/>
+        <w:tab/>
+      </w:r>
+      <w:r>
+        <w:rPr>
+          <w:rFonts w:ascii="Courier New" w:hAnsi="Courier New" w:cs="Courier New"/>
+        </w:rPr>
+        <w:tab/>
+      </w:r>
+      <w:r>
+        <w:rPr>
+          <w:rFonts w:ascii="Courier New" w:hAnsi="Courier New" w:cs="Courier New"/>
+        </w:rPr>
+        <w:tab/>
+      </w:r>
+      <w:r>
+        <w:rPr>
+          <w:rFonts w:ascii="Courier New" w:hAnsi="Courier New" w:cs="Courier New"/>
+        </w:rPr>
+        <w:t>Wait infinitely for ENQ</w:t>
+      </w:r>
+    </w:p>
+    <w:p>
+      <w:pPr>
+        <w:rPr>
+          <w:rFonts w:ascii="Courier New" w:hAnsi="Courier New" w:cs="Courier New"/>
+        </w:rPr>
+      </w:pPr>
+      <w:r>
+        <w:rPr>
+          <w:rFonts w:ascii="Courier New" w:hAnsi="Courier New" w:cs="Courier New"/>
+        </w:rPr>
+        <w:tab/>
+      </w:r>
+      <w:r>
+        <w:rPr>
+          <w:rFonts w:ascii="Courier New" w:hAnsi="Courier New" w:cs="Courier New"/>
+        </w:rPr>
+        <w:tab/>
+      </w:r>
       <w:r>
         <w:rPr>
           <w:rFonts w:ascii="Courier New" w:hAnsi="Courier New" w:cs="Courier New"/>
@@ -878,275 +1480,51 @@
         <w:tab/>
         <w:t xml:space="preserve">If </w:t>
       </w:r>
-      <w:proofErr w:type="spellStart"/>
-      <w:r>
-        <w:rPr>
-          <w:rFonts w:ascii="Courier New" w:hAnsi="Courier New" w:cs="Courier New"/>
-        </w:rPr>
-        <w:t>Comm</w:t>
-      </w:r>
-      <w:proofErr w:type="spellEnd"/>
-      <w:r>
-        <w:rPr>
-          <w:rFonts w:ascii="Courier New" w:hAnsi="Courier New" w:cs="Courier New"/>
-        </w:rPr>
-        <w:t xml:space="preserve"> Port is not open</w:t>
-      </w:r>
-    </w:p>
-    <w:p>
-      <w:pPr>
-        <w:rPr>
-          <w:rFonts w:ascii="Courier New" w:hAnsi="Courier New" w:cs="Courier New"/>
-        </w:rPr>
-      </w:pPr>
-      <w:r>
-        <w:rPr>
-          <w:rFonts w:ascii="Courier New" w:hAnsi="Courier New" w:cs="Courier New"/>
-        </w:rPr>
-        <w:tab/>
-      </w:r>
-      <w:r>
-        <w:rPr>
-          <w:rFonts w:ascii="Courier New" w:hAnsi="Courier New" w:cs="Courier New"/>
-        </w:rPr>
-        <w:tab/>
-        <w:t>Display an error message</w:t>
-      </w:r>
-    </w:p>
-    <w:p>
-      <w:pPr>
-        <w:rPr>
-          <w:rFonts w:ascii="Courier New" w:hAnsi="Courier New" w:cs="Courier New"/>
-        </w:rPr>
-      </w:pPr>
-      <w:r>
-        <w:rPr>
-          <w:rFonts w:ascii="Courier New" w:hAnsi="Courier New" w:cs="Courier New"/>
-        </w:rPr>
-        <w:tab/>
-      </w:r>
-      <w:r>
-        <w:rPr>
-          <w:rFonts w:ascii="Courier New" w:hAnsi="Courier New" w:cs="Courier New"/>
-        </w:rPr>
-        <w:tab/>
-        <w:t>Terminate program</w:t>
-      </w:r>
-    </w:p>
-    <w:p>
-      <w:pPr>
-        <w:rPr>
-          <w:rFonts w:ascii="Courier New" w:hAnsi="Courier New" w:cs="Courier New"/>
-        </w:rPr>
-      </w:pPr>
-      <w:r>
-        <w:rPr>
-          <w:rFonts w:ascii="Courier New" w:hAnsi="Courier New" w:cs="Courier New"/>
-        </w:rPr>
-        <w:tab/>
-        <w:t>Create a</w:t>
-      </w:r>
-      <w:r>
-        <w:rPr>
-          <w:rFonts w:ascii="Courier New" w:hAnsi="Courier New" w:cs="Courier New"/>
-        </w:rPr>
-        <w:t xml:space="preserve"> Communications</w:t>
-      </w:r>
-      <w:r>
-        <w:rPr>
-          <w:rFonts w:ascii="Courier New" w:hAnsi="Courier New" w:cs="Courier New"/>
-        </w:rPr>
-        <w:t xml:space="preserve"> thread</w:t>
-      </w:r>
-    </w:p>
-    <w:p>
-      <w:pPr>
-        <w:rPr>
-          <w:rFonts w:ascii="Courier New" w:hAnsi="Courier New" w:cs="Courier New"/>
-        </w:rPr>
-      </w:pPr>
-      <w:r>
-        <w:rPr>
-          <w:rFonts w:ascii="Courier New" w:hAnsi="Courier New" w:cs="Courier New"/>
-        </w:rPr>
-        <w:t>}</w:t>
-      </w:r>
-    </w:p>
-    <w:p>
-      <w:pPr>
-        <w:rPr>
-          <w:rFonts w:ascii="Courier New" w:hAnsi="Courier New" w:cs="Courier New"/>
-        </w:rPr>
-      </w:pPr>
-    </w:p>
-    <w:p>
-      <w:pPr>
-        <w:pStyle w:val="Heading2"/>
-      </w:pPr>
-      <w:bookmarkStart w:id="12" w:name="_Toc403716937"/>
-      <w:r>
-        <w:t>Idle</w:t>
-      </w:r>
-      <w:bookmarkEnd w:id="12"/>
-    </w:p>
-    <w:p/>
-    <w:p>
-      <w:pPr>
-        <w:rPr>
-          <w:rFonts w:ascii="Courier New" w:hAnsi="Courier New" w:cs="Courier New"/>
-        </w:rPr>
-      </w:pPr>
-      <w:r>
-        <w:rPr>
-          <w:rFonts w:ascii="Courier New" w:hAnsi="Courier New" w:cs="Courier New"/>
-        </w:rPr>
-        <w:t xml:space="preserve">Function </w:t>
-      </w:r>
       <w:proofErr w:type="gramStart"/>
       <w:r>
         <w:rPr>
           <w:rFonts w:ascii="Courier New" w:hAnsi="Courier New" w:cs="Courier New"/>
         </w:rPr>
-        <w:t>idle(</w:t>
+        <w:t>( ENQ</w:t>
       </w:r>
       <w:proofErr w:type="gramEnd"/>
       <w:r>
         <w:rPr>
           <w:rFonts w:ascii="Courier New" w:hAnsi="Courier New" w:cs="Courier New"/>
         </w:rPr>
-        <w:t>) {</w:t>
-      </w:r>
-    </w:p>
-    <w:p>
-      <w:pPr>
-        <w:rPr>
-          <w:rFonts w:ascii="Courier New" w:hAnsi="Courier New" w:cs="Courier New"/>
-        </w:rPr>
-      </w:pPr>
-      <w:r>
-        <w:rPr>
-          <w:rFonts w:ascii="Courier New" w:hAnsi="Courier New" w:cs="Courier New"/>
-        </w:rPr>
-        <w:tab/>
-        <w:t>Create a Receiving thread</w:t>
-      </w:r>
-    </w:p>
-    <w:p>
-      <w:pPr>
-        <w:rPr>
-          <w:rFonts w:ascii="Courier New" w:hAnsi="Courier New" w:cs="Courier New"/>
-        </w:rPr>
-      </w:pPr>
-    </w:p>
-    <w:p>
-      <w:pPr>
-        <w:rPr>
-          <w:rFonts w:ascii="Courier New" w:hAnsi="Courier New" w:cs="Courier New"/>
-        </w:rPr>
-      </w:pPr>
-      <w:r>
-        <w:rPr>
-          <w:rFonts w:ascii="Courier New" w:hAnsi="Courier New" w:cs="Courier New"/>
-        </w:rPr>
-        <w:tab/>
-      </w:r>
-      <w:r>
-        <w:rPr>
-          <w:rFonts w:ascii="Courier New" w:hAnsi="Courier New" w:cs="Courier New"/>
-        </w:rPr>
-        <w:t>While true</w:t>
-      </w:r>
-    </w:p>
-    <w:p>
-      <w:pPr>
-        <w:rPr>
-          <w:rFonts w:ascii="Courier New" w:hAnsi="Courier New" w:cs="Courier New"/>
-        </w:rPr>
-      </w:pPr>
-      <w:r>
-        <w:rPr>
-          <w:rFonts w:ascii="Courier New" w:hAnsi="Courier New" w:cs="Courier New"/>
-        </w:rPr>
-        <w:tab/>
-      </w:r>
-      <w:r>
-        <w:rPr>
-          <w:rFonts w:ascii="Courier New" w:hAnsi="Courier New" w:cs="Courier New"/>
-        </w:rPr>
-        <w:tab/>
-        <w:t>If not receiving</w:t>
-      </w:r>
-    </w:p>
-    <w:p>
-      <w:pPr>
-        <w:rPr>
-          <w:rFonts w:ascii="Courier New" w:hAnsi="Courier New" w:cs="Courier New"/>
-        </w:rPr>
-      </w:pPr>
-      <w:r>
-        <w:rPr>
-          <w:rFonts w:ascii="Courier New" w:hAnsi="Courier New" w:cs="Courier New"/>
-        </w:rPr>
-        <w:tab/>
-      </w:r>
-      <w:r>
-        <w:rPr>
-          <w:rFonts w:ascii="Courier New" w:hAnsi="Courier New" w:cs="Courier New"/>
-        </w:rPr>
-        <w:tab/>
-      </w:r>
-      <w:r>
-        <w:rPr>
-          <w:rFonts w:ascii="Courier New" w:hAnsi="Courier New" w:cs="Courier New"/>
-        </w:rPr>
-        <w:tab/>
-        <w:t xml:space="preserve">If buffer &gt; 0 and </w:t>
-      </w:r>
-      <w:proofErr w:type="spellStart"/>
-      <w:r>
-        <w:rPr>
-          <w:rFonts w:ascii="Courier New" w:hAnsi="Courier New" w:cs="Courier New"/>
-        </w:rPr>
-        <w:t>resetTimer</w:t>
-      </w:r>
-      <w:proofErr w:type="spellEnd"/>
-      <w:r>
-        <w:rPr>
-          <w:rFonts w:ascii="Courier New" w:hAnsi="Courier New" w:cs="Courier New"/>
-        </w:rPr>
-        <w:t xml:space="preserve"> = 0</w:t>
-      </w:r>
-    </w:p>
-    <w:p>
-      <w:pPr>
-        <w:rPr>
-          <w:rFonts w:ascii="Courier New" w:hAnsi="Courier New" w:cs="Courier New"/>
-        </w:rPr>
-      </w:pPr>
-      <w:r>
-        <w:rPr>
-          <w:rFonts w:ascii="Courier New" w:hAnsi="Courier New" w:cs="Courier New"/>
-        </w:rPr>
-        <w:tab/>
-      </w:r>
-      <w:r>
-        <w:rPr>
-          <w:rFonts w:ascii="Courier New" w:hAnsi="Courier New" w:cs="Courier New"/>
-        </w:rPr>
-        <w:tab/>
-      </w:r>
-      <w:r>
-        <w:rPr>
-          <w:rFonts w:ascii="Courier New" w:hAnsi="Courier New" w:cs="Courier New"/>
-        </w:rPr>
-        <w:tab/>
-      </w:r>
-      <w:r>
-        <w:rPr>
-          <w:rFonts w:ascii="Courier New" w:hAnsi="Courier New" w:cs="Courier New"/>
-        </w:rPr>
-        <w:tab/>
-        <w:t>Sending &lt;- true</w:t>
+        <w:t xml:space="preserve"> received )</w:t>
+      </w:r>
+    </w:p>
+    <w:p>
+      <w:pPr>
+        <w:rPr>
+          <w:rFonts w:ascii="Courier New" w:hAnsi="Courier New" w:cs="Courier New"/>
+        </w:rPr>
+      </w:pPr>
+      <w:r>
+        <w:rPr>
+          <w:rFonts w:ascii="Courier New" w:hAnsi="Courier New" w:cs="Courier New"/>
+        </w:rPr>
+        <w:tab/>
+      </w:r>
+      <w:r>
+        <w:rPr>
+          <w:rFonts w:ascii="Courier New" w:hAnsi="Courier New" w:cs="Courier New"/>
+        </w:rPr>
+        <w:tab/>
+      </w:r>
+      <w:r>
+        <w:rPr>
+          <w:rFonts w:ascii="Courier New" w:hAnsi="Courier New" w:cs="Courier New"/>
+        </w:rPr>
+        <w:tab/>
+      </w:r>
+      <w:r>
+        <w:rPr>
+          <w:rFonts w:ascii="Courier New" w:hAnsi="Courier New" w:cs="Courier New"/>
+        </w:rPr>
+        <w:tab/>
+        <w:t>Receiving &lt;- true</w:t>
       </w:r>
     </w:p>
     <w:p>
@@ -1185,7 +1563,7 @@
         <w:rPr>
           <w:rFonts w:ascii="Courier New" w:hAnsi="Courier New" w:cs="Courier New"/>
         </w:rPr>
-        <w:t>sendSync</w:t>
+        <w:t>receiveSync</w:t>
       </w:r>
       <w:proofErr w:type="spellEnd"/>
       <w:proofErr w:type="gramEnd"/>
@@ -1193,382 +1571,7 @@
         <w:rPr>
           <w:rFonts w:ascii="Courier New" w:hAnsi="Courier New" w:cs="Courier New"/>
         </w:rPr>
-        <w:t xml:space="preserve"> &lt;- 0</w:t>
-      </w:r>
-    </w:p>
-    <w:p>
-      <w:pPr>
-        <w:rPr>
-          <w:rFonts w:ascii="Courier New" w:hAnsi="Courier New" w:cs="Courier New"/>
-        </w:rPr>
-      </w:pPr>
-    </w:p>
-    <w:p>
-      <w:pPr>
-        <w:rPr>
-          <w:rFonts w:ascii="Courier New" w:hAnsi="Courier New" w:cs="Courier New"/>
-        </w:rPr>
-      </w:pPr>
-      <w:r>
-        <w:rPr>
-          <w:rFonts w:ascii="Courier New" w:hAnsi="Courier New" w:cs="Courier New"/>
-        </w:rPr>
-        <w:tab/>
-      </w:r>
-      <w:r>
-        <w:rPr>
-          <w:rFonts w:ascii="Courier New" w:hAnsi="Courier New" w:cs="Courier New"/>
-        </w:rPr>
-        <w:tab/>
-      </w:r>
-      <w:r>
-        <w:rPr>
-          <w:rFonts w:ascii="Courier New" w:hAnsi="Courier New" w:cs="Courier New"/>
-        </w:rPr>
-        <w:tab/>
-      </w:r>
-      <w:r>
-        <w:rPr>
-          <w:rFonts w:ascii="Courier New" w:hAnsi="Courier New" w:cs="Courier New"/>
-        </w:rPr>
-        <w:tab/>
-      </w:r>
-      <w:proofErr w:type="spellStart"/>
-      <w:proofErr w:type="gramStart"/>
-      <w:r>
-        <w:rPr>
-          <w:rFonts w:ascii="Courier New" w:hAnsi="Courier New" w:cs="Courier New"/>
-        </w:rPr>
-        <w:t>sendControlCharacter</w:t>
-      </w:r>
-      <w:proofErr w:type="spellEnd"/>
-      <w:r>
-        <w:rPr>
-          <w:rFonts w:ascii="Courier New" w:hAnsi="Courier New" w:cs="Courier New"/>
-        </w:rPr>
-        <w:t>(</w:t>
-      </w:r>
-      <w:proofErr w:type="gramEnd"/>
-      <w:r>
-        <w:rPr>
-          <w:rFonts w:ascii="Courier New" w:hAnsi="Courier New" w:cs="Courier New"/>
-        </w:rPr>
-        <w:t xml:space="preserve"> ENQ )</w:t>
-      </w:r>
-    </w:p>
-    <w:p>
-      <w:pPr>
-        <w:rPr>
-          <w:rFonts w:ascii="Courier New" w:hAnsi="Courier New" w:cs="Courier New"/>
-        </w:rPr>
-      </w:pPr>
-      <w:r>
-        <w:rPr>
-          <w:rFonts w:ascii="Courier New" w:hAnsi="Courier New" w:cs="Courier New"/>
-        </w:rPr>
-        <w:tab/>
-      </w:r>
-      <w:r>
-        <w:rPr>
-          <w:rFonts w:ascii="Courier New" w:hAnsi="Courier New" w:cs="Courier New"/>
-        </w:rPr>
-        <w:tab/>
-      </w:r>
-      <w:r>
-        <w:rPr>
-          <w:rFonts w:ascii="Courier New" w:hAnsi="Courier New" w:cs="Courier New"/>
-        </w:rPr>
-        <w:tab/>
-      </w:r>
-      <w:r>
-        <w:rPr>
-          <w:rFonts w:ascii="Courier New" w:hAnsi="Courier New" w:cs="Courier New"/>
-        </w:rPr>
-        <w:tab/>
-      </w:r>
-      <w:proofErr w:type="spellStart"/>
-      <w:proofErr w:type="gramStart"/>
-      <w:r>
-        <w:rPr>
-          <w:rFonts w:ascii="Courier New" w:hAnsi="Courier New" w:cs="Courier New"/>
-        </w:rPr>
-        <w:t>waitForEnqResponse</w:t>
-      </w:r>
-      <w:proofErr w:type="spellEnd"/>
-      <w:r>
-        <w:rPr>
-          <w:rFonts w:ascii="Courier New" w:hAnsi="Courier New" w:cs="Courier New"/>
-        </w:rPr>
-        <w:t>()</w:t>
-      </w:r>
-      <w:proofErr w:type="gramEnd"/>
-    </w:p>
-    <w:p>
-      <w:pPr>
-        <w:rPr>
-          <w:rFonts w:ascii="Courier New" w:hAnsi="Courier New" w:cs="Courier New"/>
-        </w:rPr>
-      </w:pPr>
-    </w:p>
-    <w:p>
-      <w:pPr>
-        <w:rPr>
-          <w:rFonts w:ascii="Courier New" w:hAnsi="Courier New" w:cs="Courier New"/>
-        </w:rPr>
-      </w:pPr>
-      <w:r>
-        <w:rPr>
-          <w:rFonts w:ascii="Courier New" w:hAnsi="Courier New" w:cs="Courier New"/>
-        </w:rPr>
-        <w:t>}</w:t>
-      </w:r>
-    </w:p>
-    <w:p>
-      <w:pPr>
-        <w:rPr>
-          <w:rFonts w:ascii="Courier New" w:hAnsi="Courier New" w:cs="Courier New"/>
-        </w:rPr>
-      </w:pPr>
-    </w:p>
-    <w:p>
-      <w:pPr>
-        <w:pStyle w:val="Heading2"/>
-      </w:pPr>
-      <w:bookmarkStart w:id="13" w:name="_Toc403716938"/>
-      <w:r>
-        <w:t>Receive Start</w:t>
-      </w:r>
-      <w:bookmarkEnd w:id="13"/>
-    </w:p>
-    <w:p/>
-    <w:p>
-      <w:pPr>
-        <w:rPr>
-          <w:rFonts w:ascii="Courier New" w:hAnsi="Courier New" w:cs="Courier New"/>
-        </w:rPr>
-      </w:pPr>
-      <w:r>
-        <w:rPr>
-          <w:rFonts w:ascii="Courier New" w:hAnsi="Courier New" w:cs="Courier New"/>
-        </w:rPr>
-        <w:t xml:space="preserve">Function </w:t>
-      </w:r>
-      <w:proofErr w:type="spellStart"/>
-      <w:proofErr w:type="gramStart"/>
-      <w:r>
-        <w:rPr>
-          <w:rFonts w:ascii="Courier New" w:hAnsi="Courier New" w:cs="Courier New"/>
-        </w:rPr>
-        <w:t>waitForEnquiry</w:t>
-      </w:r>
-      <w:proofErr w:type="spellEnd"/>
-      <w:r>
-        <w:rPr>
-          <w:rFonts w:ascii="Courier New" w:hAnsi="Courier New" w:cs="Courier New"/>
-        </w:rPr>
-        <w:t>(</w:t>
-      </w:r>
-      <w:proofErr w:type="gramEnd"/>
-      <w:r>
-        <w:rPr>
-          <w:rFonts w:ascii="Courier New" w:hAnsi="Courier New" w:cs="Courier New"/>
-        </w:rPr>
-        <w:t>) {</w:t>
-      </w:r>
-    </w:p>
-    <w:p>
-      <w:pPr>
-        <w:rPr>
-          <w:rFonts w:ascii="Courier New" w:hAnsi="Courier New" w:cs="Courier New"/>
-        </w:rPr>
-      </w:pPr>
-      <w:r>
-        <w:rPr>
-          <w:rFonts w:ascii="Courier New" w:hAnsi="Courier New" w:cs="Courier New"/>
-        </w:rPr>
-        <w:tab/>
-      </w:r>
-      <w:r>
-        <w:rPr>
-          <w:rFonts w:ascii="Courier New" w:hAnsi="Courier New" w:cs="Courier New"/>
-        </w:rPr>
-        <w:t>While true</w:t>
-      </w:r>
-    </w:p>
-    <w:p>
-      <w:pPr>
-        <w:rPr>
-          <w:rFonts w:ascii="Courier New" w:hAnsi="Courier New" w:cs="Courier New"/>
-        </w:rPr>
-      </w:pPr>
-      <w:r>
-        <w:rPr>
-          <w:rFonts w:ascii="Courier New" w:hAnsi="Courier New" w:cs="Courier New"/>
-        </w:rPr>
-        <w:tab/>
-      </w:r>
-      <w:r>
-        <w:rPr>
-          <w:rFonts w:ascii="Courier New" w:hAnsi="Courier New" w:cs="Courier New"/>
-        </w:rPr>
-        <w:tab/>
-      </w:r>
-      <w:r>
-        <w:rPr>
-          <w:rFonts w:ascii="Courier New" w:hAnsi="Courier New" w:cs="Courier New"/>
-        </w:rPr>
-        <w:t>If not sending</w:t>
-      </w:r>
-    </w:p>
-    <w:p>
-      <w:pPr>
-        <w:rPr>
-          <w:rFonts w:ascii="Courier New" w:hAnsi="Courier New" w:cs="Courier New"/>
-        </w:rPr>
-      </w:pPr>
-      <w:r>
-        <w:rPr>
-          <w:rFonts w:ascii="Courier New" w:hAnsi="Courier New" w:cs="Courier New"/>
-        </w:rPr>
-        <w:lastRenderedPageBreak/>
-        <w:tab/>
-      </w:r>
-      <w:r>
-        <w:rPr>
-          <w:rFonts w:ascii="Courier New" w:hAnsi="Courier New" w:cs="Courier New"/>
-        </w:rPr>
-        <w:tab/>
-      </w:r>
-      <w:r>
-        <w:rPr>
-          <w:rFonts w:ascii="Courier New" w:hAnsi="Courier New" w:cs="Courier New"/>
-        </w:rPr>
-        <w:tab/>
-      </w:r>
-      <w:r>
-        <w:rPr>
-          <w:rFonts w:ascii="Courier New" w:hAnsi="Courier New" w:cs="Courier New"/>
-        </w:rPr>
-        <w:t>Wait infinitely for ENQ</w:t>
-      </w:r>
-    </w:p>
-    <w:p>
-      <w:pPr>
-        <w:rPr>
-          <w:rFonts w:ascii="Courier New" w:hAnsi="Courier New" w:cs="Courier New"/>
-        </w:rPr>
-      </w:pPr>
-      <w:r>
-        <w:rPr>
-          <w:rFonts w:ascii="Courier New" w:hAnsi="Courier New" w:cs="Courier New"/>
-        </w:rPr>
-        <w:tab/>
-      </w:r>
-      <w:r>
-        <w:rPr>
-          <w:rFonts w:ascii="Courier New" w:hAnsi="Courier New" w:cs="Courier New"/>
-        </w:rPr>
-        <w:tab/>
-      </w:r>
-      <w:r>
-        <w:rPr>
-          <w:rFonts w:ascii="Courier New" w:hAnsi="Courier New" w:cs="Courier New"/>
-        </w:rPr>
-        <w:tab/>
-        <w:t xml:space="preserve">If </w:t>
-      </w:r>
-      <w:proofErr w:type="gramStart"/>
-      <w:r>
-        <w:rPr>
-          <w:rFonts w:ascii="Courier New" w:hAnsi="Courier New" w:cs="Courier New"/>
-        </w:rPr>
-        <w:t>( ENQ</w:t>
-      </w:r>
-      <w:proofErr w:type="gramEnd"/>
-      <w:r>
-        <w:rPr>
-          <w:rFonts w:ascii="Courier New" w:hAnsi="Courier New" w:cs="Courier New"/>
-        </w:rPr>
-        <w:t xml:space="preserve"> received )</w:t>
-      </w:r>
-    </w:p>
-    <w:p>
-      <w:pPr>
-        <w:rPr>
-          <w:rFonts w:ascii="Courier New" w:hAnsi="Courier New" w:cs="Courier New"/>
-        </w:rPr>
-      </w:pPr>
-      <w:r>
-        <w:rPr>
-          <w:rFonts w:ascii="Courier New" w:hAnsi="Courier New" w:cs="Courier New"/>
-        </w:rPr>
-        <w:tab/>
-      </w:r>
-      <w:r>
-        <w:rPr>
-          <w:rFonts w:ascii="Courier New" w:hAnsi="Courier New" w:cs="Courier New"/>
-        </w:rPr>
-        <w:tab/>
-      </w:r>
-      <w:r>
-        <w:rPr>
-          <w:rFonts w:ascii="Courier New" w:hAnsi="Courier New" w:cs="Courier New"/>
-        </w:rPr>
-        <w:tab/>
-      </w:r>
-      <w:r>
-        <w:rPr>
-          <w:rFonts w:ascii="Courier New" w:hAnsi="Courier New" w:cs="Courier New"/>
-        </w:rPr>
-        <w:tab/>
-        <w:t>Receiving &lt;- true</w:t>
-      </w:r>
-    </w:p>
-    <w:p>
-      <w:pPr>
-        <w:rPr>
-          <w:rFonts w:ascii="Courier New" w:hAnsi="Courier New" w:cs="Courier New"/>
-        </w:rPr>
-      </w:pPr>
-      <w:r>
-        <w:rPr>
-          <w:rFonts w:ascii="Courier New" w:hAnsi="Courier New" w:cs="Courier New"/>
-        </w:rPr>
-        <w:tab/>
-      </w:r>
-      <w:r>
-        <w:rPr>
-          <w:rFonts w:ascii="Courier New" w:hAnsi="Courier New" w:cs="Courier New"/>
-        </w:rPr>
-        <w:tab/>
-      </w:r>
-      <w:r>
-        <w:rPr>
-          <w:rFonts w:ascii="Courier New" w:hAnsi="Courier New" w:cs="Courier New"/>
-        </w:rPr>
-        <w:tab/>
-      </w:r>
-      <w:r>
-        <w:rPr>
-          <w:rFonts w:ascii="Courier New" w:hAnsi="Courier New" w:cs="Courier New"/>
-        </w:rPr>
-        <w:tab/>
-      </w:r>
-      <w:proofErr w:type="spellStart"/>
-      <w:proofErr w:type="gramStart"/>
-      <w:r>
-        <w:rPr>
-          <w:rFonts w:ascii="Courier New" w:hAnsi="Courier New" w:cs="Courier New"/>
-        </w:rPr>
-        <w:t>receiveSync</w:t>
-      </w:r>
-      <w:proofErr w:type="spellEnd"/>
-      <w:proofErr w:type="gramEnd"/>
-      <w:r>
-        <w:rPr>
-          <w:rFonts w:ascii="Courier New" w:hAnsi="Courier New" w:cs="Courier New"/>
-        </w:rPr>
-        <w:t xml:space="preserve"> &lt;- 0</w:t>
+        <w:t xml:space="preserve"> &lt;- SYN1</w:t>
       </w:r>
     </w:p>
     <w:p>
@@ -5757,7 +5760,7 @@
 </file>
 
 <file path=customXml/itemProps1.xml><?xml version="1.0" encoding="utf-8"?>
-<ds:datastoreItem xmlns:ds="http://schemas.openxmlformats.org/officeDocument/2006/customXml" ds:itemID="{C60416E6-BD07-4563-A77A-431DE2A658DF}">
+<ds:datastoreItem xmlns:ds="http://schemas.openxmlformats.org/officeDocument/2006/customXml" ds:itemID="{CD08274E-0A03-4094-BEFF-6D0BC8689C7D}">
   <ds:schemaRefs>
     <ds:schemaRef ds:uri="http://schemas.openxmlformats.org/officeDocument/2006/bibliography"/>
   </ds:schemaRefs>

</xml_diff>

<commit_message>
Updated state diagrams Added my student number where needed - Thomas
</commit_message>
<xml_diff>
--- a/Design & Documents/Design Document.docx
+++ b/Design & Documents/Design Document.docx
@@ -38,6 +38,7 @@
         <w:jc w:val="center"/>
       </w:pPr>
       <w:bookmarkStart w:id="0" w:name="_Toc403716930"/>
+      <w:bookmarkStart w:id="1" w:name="_Toc403917484"/>
       <w:r>
         <w:t>Lewis Scott – A0</w:t>
       </w:r>
@@ -48,35 +49,47 @@
         <w:t xml:space="preserve"> – Set 3O</w:t>
       </w:r>
       <w:bookmarkEnd w:id="0"/>
+      <w:bookmarkEnd w:id="1"/>
     </w:p>
     <w:p>
       <w:pPr>
         <w:pStyle w:val="Heading1"/>
         <w:jc w:val="center"/>
       </w:pPr>
-      <w:bookmarkStart w:id="1" w:name="_Toc400292400"/>
-      <w:bookmarkStart w:id="2" w:name="_Toc400706064"/>
-      <w:bookmarkStart w:id="3" w:name="_Toc403716931"/>
+      <w:bookmarkStart w:id="2" w:name="_Toc400292400"/>
+      <w:bookmarkStart w:id="3" w:name="_Toc400706064"/>
+      <w:bookmarkStart w:id="4" w:name="_Toc403716931"/>
+      <w:bookmarkStart w:id="5" w:name="_Toc403917485"/>
       <w:proofErr w:type="spellStart"/>
       <w:r>
         <w:t>Christofer</w:t>
       </w:r>
       <w:proofErr w:type="spellEnd"/>
       <w:r>
-        <w:t xml:space="preserve"> Klassen – A00879060 – Set 3O</w:t>
-      </w:r>
-      <w:bookmarkEnd w:id="1"/>
+        <w:t xml:space="preserve"> </w:t>
+      </w:r>
+      <w:proofErr w:type="spellStart"/>
+      <w:r>
+        <w:t>Klassen</w:t>
+      </w:r>
+      <w:proofErr w:type="spellEnd"/>
+      <w:r>
+        <w:t xml:space="preserve"> – A00879060 – Set 3O</w:t>
+      </w:r>
       <w:bookmarkEnd w:id="2"/>
       <w:bookmarkEnd w:id="3"/>
+      <w:bookmarkEnd w:id="4"/>
+      <w:bookmarkEnd w:id="5"/>
     </w:p>
     <w:p>
       <w:pPr>
         <w:pStyle w:val="Heading1"/>
         <w:jc w:val="center"/>
       </w:pPr>
-      <w:bookmarkStart w:id="4" w:name="_Toc400292401"/>
-      <w:bookmarkStart w:id="5" w:name="_Toc400706065"/>
-      <w:bookmarkStart w:id="6" w:name="_Toc403716932"/>
+      <w:bookmarkStart w:id="6" w:name="_Toc400292401"/>
+      <w:bookmarkStart w:id="7" w:name="_Toc400706065"/>
+      <w:bookmarkStart w:id="8" w:name="_Toc403716932"/>
+      <w:bookmarkStart w:id="9" w:name="_Toc403917486"/>
       <w:r>
         <w:t xml:space="preserve">Jeff </w:t>
       </w:r>
@@ -95,30 +108,36 @@
         <w:t xml:space="preserve">A00860994 </w:t>
       </w:r>
       <w:r>
-        <w:t>– Set 3O</w:t>
-      </w:r>
-      <w:bookmarkEnd w:id="4"/>
-      <w:bookmarkEnd w:id="5"/>
+        <w:t>– Set 3</w:t>
+      </w:r>
+      <w:bookmarkStart w:id="10" w:name="_GoBack"/>
+      <w:bookmarkEnd w:id="10"/>
+      <w:r>
+        <w:t>O</w:t>
+      </w:r>
       <w:bookmarkEnd w:id="6"/>
+      <w:bookmarkEnd w:id="7"/>
+      <w:bookmarkEnd w:id="8"/>
+      <w:bookmarkEnd w:id="9"/>
     </w:p>
     <w:p>
       <w:pPr>
         <w:pStyle w:val="Heading1"/>
         <w:jc w:val="center"/>
       </w:pPr>
-      <w:bookmarkStart w:id="7" w:name="_Toc403716933"/>
-      <w:r>
-        <w:t xml:space="preserve">Thomas </w:t>
-      </w:r>
-      <w:proofErr w:type="spellStart"/>
-      <w:r>
-        <w:t>Tallentire</w:t>
-      </w:r>
-      <w:proofErr w:type="spellEnd"/>
-      <w:r>
-        <w:t xml:space="preserve"> – A00000000 – Set 3O</w:t>
-      </w:r>
-      <w:bookmarkEnd w:id="7"/>
+      <w:bookmarkStart w:id="11" w:name="_Toc403716933"/>
+      <w:bookmarkStart w:id="12" w:name="_Toc403917487"/>
+      <w:r>
+        <w:t>Thomas Tallentire – A00</w:t>
+      </w:r>
+      <w:r>
+        <w:t>882367</w:t>
+      </w:r>
+      <w:r>
+        <w:t xml:space="preserve"> – Set 3O</w:t>
+      </w:r>
+      <w:bookmarkEnd w:id="11"/>
+      <w:bookmarkEnd w:id="12"/>
     </w:p>
     <w:sdt>
       <w:sdtPr>
@@ -175,7 +194,7 @@
           <w:r>
             <w:fldChar w:fldCharType="separate"/>
           </w:r>
-          <w:hyperlink w:anchor="_Toc403716934" w:history="1">
+          <w:hyperlink w:anchor="_Toc403917488" w:history="1">
             <w:r>
               <w:rPr>
                 <w:rStyle w:val="Hyperlink"/>
@@ -202,7 +221,7 @@
                 <w:noProof/>
                 <w:webHidden/>
               </w:rPr>
-              <w:instrText xml:space="preserve"> PAGEREF _Toc403716934 \h </w:instrText>
+              <w:instrText xml:space="preserve"> PAGEREF _Toc403917488 \h </w:instrText>
             </w:r>
             <w:r>
               <w:rPr>
@@ -223,6 +242,148 @@
                 <w:webHidden/>
               </w:rPr>
               <w:t>2</w:t>
+            </w:r>
+            <w:r>
+              <w:rPr>
+                <w:noProof/>
+                <w:webHidden/>
+              </w:rPr>
+              <w:fldChar w:fldCharType="end"/>
+            </w:r>
+          </w:hyperlink>
+        </w:p>
+        <w:p>
+          <w:pPr>
+            <w:pStyle w:val="TOC2"/>
+            <w:tabs>
+              <w:tab w:val="right" w:leader="dot" w:pos="9350"/>
+            </w:tabs>
+            <w:rPr>
+              <w:noProof/>
+              <w:sz w:val="22"/>
+              <w:szCs w:val="22"/>
+              <w:lang w:eastAsia="en-CA"/>
+            </w:rPr>
+          </w:pPr>
+          <w:hyperlink w:anchor="_Toc403917489" w:history="1">
+            <w:r>
+              <w:rPr>
+                <w:rStyle w:val="Hyperlink"/>
+                <w:noProof/>
+              </w:rPr>
+              <w:t>Program Start</w:t>
+            </w:r>
+            <w:r>
+              <w:rPr>
+                <w:noProof/>
+                <w:webHidden/>
+              </w:rPr>
+              <w:tab/>
+            </w:r>
+            <w:r>
+              <w:rPr>
+                <w:noProof/>
+                <w:webHidden/>
+              </w:rPr>
+              <w:fldChar w:fldCharType="begin"/>
+            </w:r>
+            <w:r>
+              <w:rPr>
+                <w:noProof/>
+                <w:webHidden/>
+              </w:rPr>
+              <w:instrText xml:space="preserve"> PAGEREF _Toc403917489 \h </w:instrText>
+            </w:r>
+            <w:r>
+              <w:rPr>
+                <w:noProof/>
+                <w:webHidden/>
+              </w:rPr>
+            </w:r>
+            <w:r>
+              <w:rPr>
+                <w:noProof/>
+                <w:webHidden/>
+              </w:rPr>
+              <w:fldChar w:fldCharType="separate"/>
+            </w:r>
+            <w:r>
+              <w:rPr>
+                <w:noProof/>
+                <w:webHidden/>
+              </w:rPr>
+              <w:t>2</w:t>
+            </w:r>
+            <w:r>
+              <w:rPr>
+                <w:noProof/>
+                <w:webHidden/>
+              </w:rPr>
+              <w:fldChar w:fldCharType="end"/>
+            </w:r>
+          </w:hyperlink>
+        </w:p>
+        <w:p>
+          <w:pPr>
+            <w:pStyle w:val="TOC2"/>
+            <w:tabs>
+              <w:tab w:val="right" w:leader="dot" w:pos="9350"/>
+            </w:tabs>
+            <w:rPr>
+              <w:noProof/>
+              <w:sz w:val="22"/>
+              <w:szCs w:val="22"/>
+              <w:lang w:eastAsia="en-CA"/>
+            </w:rPr>
+          </w:pPr>
+          <w:hyperlink w:anchor="_Toc403917490" w:history="1">
+            <w:r>
+              <w:rPr>
+                <w:rStyle w:val="Hyperlink"/>
+                <w:noProof/>
+              </w:rPr>
+              <w:t>Communication Protocol Start</w:t>
+            </w:r>
+            <w:r>
+              <w:rPr>
+                <w:noProof/>
+                <w:webHidden/>
+              </w:rPr>
+              <w:tab/>
+            </w:r>
+            <w:r>
+              <w:rPr>
+                <w:noProof/>
+                <w:webHidden/>
+              </w:rPr>
+              <w:fldChar w:fldCharType="begin"/>
+            </w:r>
+            <w:r>
+              <w:rPr>
+                <w:noProof/>
+                <w:webHidden/>
+              </w:rPr>
+              <w:instrText xml:space="preserve"> PAGEREF _Toc403917490 \h </w:instrText>
+            </w:r>
+            <w:r>
+              <w:rPr>
+                <w:noProof/>
+                <w:webHidden/>
+              </w:rPr>
+            </w:r>
+            <w:r>
+              <w:rPr>
+                <w:noProof/>
+                <w:webHidden/>
+              </w:rPr>
+              <w:fldChar w:fldCharType="separate"/>
+            </w:r>
+            <w:r>
+              <w:rPr>
+                <w:noProof/>
+                <w:webHidden/>
+              </w:rPr>
+              <w:t>3</w:t>
             </w:r>
             <w:r>
               <w:rPr>
@@ -246,7 +407,7 @@
               <w:lang w:eastAsia="en-CA"/>
             </w:rPr>
           </w:pPr>
-          <w:hyperlink w:anchor="_Toc403716935" w:history="1">
+          <w:hyperlink w:anchor="_Toc403917491" w:history="1">
             <w:r>
               <w:rPr>
                 <w:rStyle w:val="Hyperlink"/>
@@ -273,7 +434,7 @@
                 <w:noProof/>
                 <w:webHidden/>
               </w:rPr>
-              <w:instrText xml:space="preserve"> PAGEREF _Toc403716935 \h </w:instrText>
+              <w:instrText xml:space="preserve"> PAGEREF _Toc403917491 \h </w:instrText>
             </w:r>
             <w:r>
               <w:rPr>
@@ -293,7 +454,7 @@
                 <w:noProof/>
                 <w:webHidden/>
               </w:rPr>
-              <w:t>3</w:t>
+              <w:t>4</w:t>
             </w:r>
             <w:r>
               <w:rPr>
@@ -317,7 +478,7 @@
               <w:lang w:eastAsia="en-CA"/>
             </w:rPr>
           </w:pPr>
-          <w:hyperlink w:anchor="_Toc403716936" w:history="1">
+          <w:hyperlink w:anchor="_Toc403917492" w:history="1">
             <w:r>
               <w:rPr>
                 <w:rStyle w:val="Hyperlink"/>
@@ -344,7 +505,7 @@
                 <w:noProof/>
                 <w:webHidden/>
               </w:rPr>
-              <w:instrText xml:space="preserve"> PAGEREF _Toc403716936 \h </w:instrText>
+              <w:instrText xml:space="preserve"> PAGEREF _Toc403917492 \h </w:instrText>
             </w:r>
             <w:r>
               <w:rPr>
@@ -364,7 +525,7 @@
                 <w:noProof/>
                 <w:webHidden/>
               </w:rPr>
-              <w:t>3</w:t>
+              <w:t>4</w:t>
             </w:r>
             <w:r>
               <w:rPr>
@@ -388,7 +549,7 @@
               <w:lang w:eastAsia="en-CA"/>
             </w:rPr>
           </w:pPr>
-          <w:hyperlink w:anchor="_Toc403716937" w:history="1">
+          <w:hyperlink w:anchor="_Toc403917493" w:history="1">
             <w:r>
               <w:rPr>
                 <w:rStyle w:val="Hyperlink"/>
@@ -415,7 +576,7 @@
                 <w:noProof/>
                 <w:webHidden/>
               </w:rPr>
-              <w:instrText xml:space="preserve"> PAGEREF _Toc403716937 \h </w:instrText>
+              <w:instrText xml:space="preserve"> PAGEREF _Toc403917493 \h </w:instrText>
             </w:r>
             <w:r>
               <w:rPr>
@@ -435,7 +596,7 @@
                 <w:noProof/>
                 <w:webHidden/>
               </w:rPr>
-              <w:t>3</w:t>
+              <w:t>4</w:t>
             </w:r>
             <w:r>
               <w:rPr>
@@ -459,7 +620,7 @@
               <w:lang w:eastAsia="en-CA"/>
             </w:rPr>
           </w:pPr>
-          <w:hyperlink w:anchor="_Toc403716938" w:history="1">
+          <w:hyperlink w:anchor="_Toc403917494" w:history="1">
             <w:r>
               <w:rPr>
                 <w:rStyle w:val="Hyperlink"/>
@@ -486,7 +647,7 @@
                 <w:noProof/>
                 <w:webHidden/>
               </w:rPr>
-              <w:instrText xml:space="preserve"> PAGEREF _Toc403716938 \h </w:instrText>
+              <w:instrText xml:space="preserve"> PAGEREF _Toc403917494 \h </w:instrText>
             </w:r>
             <w:r>
               <w:rPr>
@@ -506,7 +667,7 @@
                 <w:noProof/>
                 <w:webHidden/>
               </w:rPr>
-              <w:t>3</w:t>
+              <w:t>4</w:t>
             </w:r>
             <w:r>
               <w:rPr>
@@ -530,7 +691,7 @@
               <w:lang w:eastAsia="en-CA"/>
             </w:rPr>
           </w:pPr>
-          <w:hyperlink w:anchor="_Toc403716939" w:history="1">
+          <w:hyperlink w:anchor="_Toc403917495" w:history="1">
             <w:r>
               <w:rPr>
                 <w:rStyle w:val="Hyperlink"/>
@@ -557,7 +718,7 @@
                 <w:noProof/>
                 <w:webHidden/>
               </w:rPr>
-              <w:instrText xml:space="preserve"> PAGEREF _Toc403716939 \h </w:instrText>
+              <w:instrText xml:space="preserve"> PAGEREF _Toc403917495 \h </w:instrText>
             </w:r>
             <w:r>
               <w:rPr>
@@ -577,7 +738,7 @@
                 <w:noProof/>
                 <w:webHidden/>
               </w:rPr>
-              <w:t>4</w:t>
+              <w:t>5</w:t>
             </w:r>
             <w:r>
               <w:rPr>
@@ -601,7 +762,7 @@
               <w:lang w:eastAsia="en-CA"/>
             </w:rPr>
           </w:pPr>
-          <w:hyperlink w:anchor="_Toc403716940" w:history="1">
+          <w:hyperlink w:anchor="_Toc403917496" w:history="1">
             <w:r>
               <w:rPr>
                 <w:rStyle w:val="Hyperlink"/>
@@ -628,7 +789,7 @@
                 <w:noProof/>
                 <w:webHidden/>
               </w:rPr>
-              <w:instrText xml:space="preserve"> PAGEREF _Toc403716940 \h </w:instrText>
+              <w:instrText xml:space="preserve"> PAGEREF _Toc403917496 \h </w:instrText>
             </w:r>
             <w:r>
               <w:rPr>
@@ -648,7 +809,7 @@
                 <w:noProof/>
                 <w:webHidden/>
               </w:rPr>
-              <w:t>5</w:t>
+              <w:t>6</w:t>
             </w:r>
             <w:r>
               <w:rPr>
@@ -672,7 +833,7 @@
               <w:lang w:eastAsia="en-CA"/>
             </w:rPr>
           </w:pPr>
-          <w:hyperlink w:anchor="_Toc403716941" w:history="1">
+          <w:hyperlink w:anchor="_Toc403917497" w:history="1">
             <w:r>
               <w:rPr>
                 <w:rStyle w:val="Hyperlink"/>
@@ -699,7 +860,7 @@
                 <w:noProof/>
                 <w:webHidden/>
               </w:rPr>
-              <w:instrText xml:space="preserve"> PAGEREF _Toc403716941 \h </w:instrText>
+              <w:instrText xml:space="preserve"> PAGEREF _Toc403917497 \h </w:instrText>
             </w:r>
             <w:r>
               <w:rPr>
@@ -719,7 +880,7 @@
                 <w:noProof/>
                 <w:webHidden/>
               </w:rPr>
-              <w:t>5</w:t>
+              <w:t>6</w:t>
             </w:r>
             <w:r>
               <w:rPr>
@@ -759,17 +920,82 @@
       <w:pPr>
         <w:pStyle w:val="Heading1"/>
       </w:pPr>
-      <w:bookmarkStart w:id="8" w:name="_Toc403716934"/>
+      <w:bookmarkStart w:id="13" w:name="_Toc403917488"/>
       <w:r>
         <w:lastRenderedPageBreak/>
-        <w:t>State Flow Diagram</w:t>
-      </w:r>
-      <w:bookmarkEnd w:id="8"/>
-    </w:p>
-    <w:p>
-      <w:pPr>
-        <w:jc w:val="center"/>
-      </w:pPr>
+        <w:t xml:space="preserve">State Flow </w:t>
+      </w:r>
+      <w:r>
+        <w:t>Diagram</w:t>
+      </w:r>
+      <w:bookmarkEnd w:id="13"/>
+    </w:p>
+    <w:p>
+      <w:pPr>
+        <w:pStyle w:val="Heading2"/>
+      </w:pPr>
+      <w:bookmarkStart w:id="14" w:name="_Toc403917489"/>
+      <w:r>
+        <w:t>Program Start</w:t>
+      </w:r>
+      <w:bookmarkEnd w:id="14"/>
+    </w:p>
+    <w:p/>
+    <w:p>
+      <w:r>
+        <w:object w:dxaOrig="5250" w:dyaOrig="4846">
+          <v:shapetype id="_x0000_t75" coordsize="21600,21600" o:spt="75" o:preferrelative="t" path="m@4@5l@4@11@9@11@9@5xe" filled="f" stroked="f">
+            <v:stroke joinstyle="miter"/>
+            <v:formulas>
+              <v:f eqn="if lineDrawn pixelLineWidth 0"/>
+              <v:f eqn="sum @0 1 0"/>
+              <v:f eqn="sum 0 0 @1"/>
+              <v:f eqn="prod @2 1 2"/>
+              <v:f eqn="prod @3 21600 pixelWidth"/>
+              <v:f eqn="prod @3 21600 pixelHeight"/>
+              <v:f eqn="sum @0 0 1"/>
+              <v:f eqn="prod @6 1 2"/>
+              <v:f eqn="prod @7 21600 pixelWidth"/>
+              <v:f eqn="sum @8 21600 0"/>
+              <v:f eqn="prod @7 21600 pixelHeight"/>
+              <v:f eqn="sum @10 21600 0"/>
+            </v:formulas>
+            <v:path o:extrusionok="f" gradientshapeok="t" o:connecttype="rect"/>
+            <o:lock v:ext="edit" aspectratio="t"/>
+          </v:shapetype>
+          <v:shape id="_x0000_i1025" type="#_x0000_t75" style="width:262.5pt;height:242.25pt" o:ole="">
+            <v:imagedata r:id="rId6" o:title=""/>
+          </v:shape>
+          <o:OLEObject Type="Embed" ProgID="Visio.Drawing.15" ShapeID="_x0000_i1025" DrawAspect="Content" ObjectID="_1477659369" r:id="rId7"/>
+        </w:object>
+      </w:r>
+    </w:p>
+    <w:p>
+      <w:r>
+        <w:br w:type="page"/>
+      </w:r>
+    </w:p>
+    <w:p>
+      <w:pPr>
+        <w:pStyle w:val="Heading2"/>
+      </w:pPr>
+      <w:bookmarkStart w:id="15" w:name="_Toc403917490"/>
+      <w:r>
+        <w:lastRenderedPageBreak/>
+        <w:t>Communication Protocol Start</w:t>
+      </w:r>
+      <w:bookmarkEnd w:id="15"/>
+    </w:p>
+    <w:p/>
+    <w:p>
+      <w:r>
+        <w:object w:dxaOrig="8206" w:dyaOrig="9916">
+          <v:shape id="_x0000_i1026" type="#_x0000_t75" style="width:410.25pt;height:495.75pt" o:ole="">
+            <v:imagedata r:id="rId8" o:title=""/>
+          </v:shape>
+          <o:OLEObject Type="Embed" ProgID="Visio.Drawing.15" ShapeID="_x0000_i1026" DrawAspect="Content" ObjectID="_1477659370" r:id="rId9"/>
+        </w:object>
+      </w:r>
     </w:p>
     <w:p>
       <w:pPr>
@@ -778,23 +1004,23 @@
       <w:r>
         <w:br w:type="page"/>
       </w:r>
-      <w:bookmarkStart w:id="9" w:name="_Toc403716935"/>
+      <w:bookmarkStart w:id="16" w:name="_Toc403917491"/>
       <w:r>
         <w:lastRenderedPageBreak/>
         <w:t>Pseudo Code</w:t>
       </w:r>
-      <w:bookmarkEnd w:id="9"/>
+      <w:bookmarkEnd w:id="16"/>
     </w:p>
     <w:p/>
     <w:p>
       <w:pPr>
         <w:pStyle w:val="Heading2"/>
       </w:pPr>
-      <w:bookmarkStart w:id="10" w:name="_Toc403716936"/>
+      <w:bookmarkStart w:id="17" w:name="_Toc403917492"/>
       <w:r>
         <w:t>Setup</w:t>
       </w:r>
-      <w:bookmarkEnd w:id="10"/>
+      <w:bookmarkEnd w:id="17"/>
     </w:p>
     <w:p/>
     <w:p>
@@ -925,15 +1151,7 @@
           <w:rFonts w:ascii="Courier New" w:hAnsi="Courier New" w:cs="Courier New"/>
         </w:rPr>
         <w:tab/>
-        <w:t>Terminate progr</w:t>
-      </w:r>
-      <w:bookmarkStart w:id="11" w:name="_GoBack"/>
-      <w:bookmarkEnd w:id="11"/>
-      <w:r>
-        <w:rPr>
-          <w:rFonts w:ascii="Courier New" w:hAnsi="Courier New" w:cs="Courier New"/>
-        </w:rPr>
-        <w:t>am</w:t>
+        <w:t>Terminate program</w:t>
       </w:r>
     </w:p>
     <w:p>
@@ -986,11 +1204,11 @@
       <w:pPr>
         <w:pStyle w:val="Heading2"/>
       </w:pPr>
-      <w:bookmarkStart w:id="12" w:name="_Toc403716937"/>
+      <w:bookmarkStart w:id="18" w:name="_Toc403917493"/>
       <w:r>
         <w:t>Idle</w:t>
       </w:r>
-      <w:bookmarkEnd w:id="12"/>
+      <w:bookmarkEnd w:id="18"/>
     </w:p>
     <w:p/>
     <w:p>
@@ -1337,11 +1555,11 @@
       <w:pPr>
         <w:pStyle w:val="Heading2"/>
       </w:pPr>
-      <w:bookmarkStart w:id="13" w:name="_Toc403716938"/>
+      <w:bookmarkStart w:id="19" w:name="_Toc403917494"/>
       <w:r>
         <w:t>Receive Start</w:t>
       </w:r>
-      <w:bookmarkEnd w:id="13"/>
+      <w:bookmarkEnd w:id="19"/>
     </w:p>
     <w:p/>
     <w:p>
@@ -1433,38 +1651,38 @@
         <w:rPr>
           <w:rFonts w:ascii="Courier New" w:hAnsi="Courier New" w:cs="Courier New"/>
         </w:rPr>
+        <w:tab/>
+      </w:r>
+      <w:r>
+        <w:rPr>
+          <w:rFonts w:ascii="Courier New" w:hAnsi="Courier New" w:cs="Courier New"/>
+        </w:rPr>
+        <w:tab/>
+      </w:r>
+      <w:r>
+        <w:rPr>
+          <w:rFonts w:ascii="Courier New" w:hAnsi="Courier New" w:cs="Courier New"/>
+        </w:rPr>
+        <w:tab/>
+      </w:r>
+      <w:r>
+        <w:rPr>
+          <w:rFonts w:ascii="Courier New" w:hAnsi="Courier New" w:cs="Courier New"/>
+        </w:rPr>
+        <w:t>Wait infinitely for ENQ</w:t>
+      </w:r>
+    </w:p>
+    <w:p>
+      <w:pPr>
+        <w:rPr>
+          <w:rFonts w:ascii="Courier New" w:hAnsi="Courier New" w:cs="Courier New"/>
+        </w:rPr>
+      </w:pPr>
+      <w:r>
+        <w:rPr>
+          <w:rFonts w:ascii="Courier New" w:hAnsi="Courier New" w:cs="Courier New"/>
+        </w:rPr>
         <w:lastRenderedPageBreak/>
-        <w:tab/>
-      </w:r>
-      <w:r>
-        <w:rPr>
-          <w:rFonts w:ascii="Courier New" w:hAnsi="Courier New" w:cs="Courier New"/>
-        </w:rPr>
-        <w:tab/>
-      </w:r>
-      <w:r>
-        <w:rPr>
-          <w:rFonts w:ascii="Courier New" w:hAnsi="Courier New" w:cs="Courier New"/>
-        </w:rPr>
-        <w:tab/>
-      </w:r>
-      <w:r>
-        <w:rPr>
-          <w:rFonts w:ascii="Courier New" w:hAnsi="Courier New" w:cs="Courier New"/>
-        </w:rPr>
-        <w:t>Wait infinitely for ENQ</w:t>
-      </w:r>
-    </w:p>
-    <w:p>
-      <w:pPr>
-        <w:rPr>
-          <w:rFonts w:ascii="Courier New" w:hAnsi="Courier New" w:cs="Courier New"/>
-        </w:rPr>
-      </w:pPr>
-      <w:r>
-        <w:rPr>
-          <w:rFonts w:ascii="Courier New" w:hAnsi="Courier New" w:cs="Courier New"/>
-        </w:rPr>
         <w:tab/>
       </w:r>
       <w:r>
@@ -1717,11 +1935,11 @@
       <w:pPr>
         <w:pStyle w:val="Heading2"/>
       </w:pPr>
-      <w:bookmarkStart w:id="14" w:name="_Toc403716939"/>
+      <w:bookmarkStart w:id="20" w:name="_Toc403917495"/>
       <w:r>
         <w:t>Receive Start</w:t>
       </w:r>
-      <w:bookmarkEnd w:id="14"/>
+      <w:bookmarkEnd w:id="20"/>
     </w:p>
     <w:p/>
     <w:p>
@@ -2442,7 +2660,6 @@
         <w:rPr>
           <w:rFonts w:ascii="Courier New" w:hAnsi="Courier New" w:cs="Courier New"/>
         </w:rPr>
-        <w:lastRenderedPageBreak/>
         <w:tab/>
         <w:t xml:space="preserve">I </w:t>
       </w:r>
@@ -2731,11 +2948,11 @@
       <w:pPr>
         <w:pStyle w:val="Heading2"/>
       </w:pPr>
-      <w:bookmarkStart w:id="15" w:name="_Toc403716940"/>
+      <w:bookmarkStart w:id="21" w:name="_Toc403917496"/>
       <w:r>
         <w:t>Send Start</w:t>
       </w:r>
-      <w:bookmarkEnd w:id="15"/>
+      <w:bookmarkEnd w:id="21"/>
     </w:p>
     <w:p>
       <w:pPr>
@@ -2959,11 +3176,11 @@
       <w:pPr>
         <w:pStyle w:val="Heading2"/>
       </w:pPr>
-      <w:bookmarkStart w:id="16" w:name="_Toc403716941"/>
+      <w:bookmarkStart w:id="22" w:name="_Toc403917497"/>
       <w:r>
         <w:t>Send Data</w:t>
       </w:r>
-      <w:bookmarkEnd w:id="16"/>
+      <w:bookmarkEnd w:id="22"/>
     </w:p>
     <w:p>
       <w:pPr>
@@ -3280,7 +3497,6 @@
         <w:rPr>
           <w:rFonts w:ascii="Courier New" w:hAnsi="Courier New" w:cs="Courier New"/>
         </w:rPr>
-        <w:lastRenderedPageBreak/>
         <w:tab/>
       </w:r>
       <w:r>
@@ -3325,6 +3541,7 @@
         <w:rPr>
           <w:rFonts w:ascii="Courier New" w:hAnsi="Courier New" w:cs="Courier New"/>
         </w:rPr>
+        <w:lastRenderedPageBreak/>
         <w:tab/>
       </w:r>
     </w:p>
@@ -4201,7 +4418,6 @@
         <w:rPr>
           <w:rFonts w:ascii="Courier New" w:hAnsi="Courier New" w:cs="Courier New"/>
         </w:rPr>
-        <w:lastRenderedPageBreak/>
         <w:t xml:space="preserve">Function </w:t>
       </w:r>
       <w:proofErr w:type="spellStart"/>
@@ -4237,6 +4453,7 @@
         <w:rPr>
           <w:rFonts w:ascii="Courier New" w:hAnsi="Courier New" w:cs="Courier New"/>
         </w:rPr>
+        <w:lastRenderedPageBreak/>
         <w:tab/>
       </w:r>
       <w:proofErr w:type="spellStart"/>
@@ -5760,7 +5977,7 @@
 </file>
 
 <file path=customXml/itemProps1.xml><?xml version="1.0" encoding="utf-8"?>
-<ds:datastoreItem xmlns:ds="http://schemas.openxmlformats.org/officeDocument/2006/customXml" ds:itemID="{CD08274E-0A03-4094-BEFF-6D0BC8689C7D}">
+<ds:datastoreItem xmlns:ds="http://schemas.openxmlformats.org/officeDocument/2006/customXml" ds:itemID="{B75AC674-5128-4453-8839-3129813EC34A}">
   <ds:schemaRefs>
     <ds:schemaRef ds:uri="http://schemas.openxmlformats.org/officeDocument/2006/bibliography"/>
   </ds:schemaRefs>

</xml_diff>

<commit_message>
Updated documents to completion state (1/2)
</commit_message>
<xml_diff>
--- a/Design & Documents/Design Document.docx
+++ b/Design & Documents/Design Document.docx
@@ -2,128 +2,440 @@
 <file path=word/document.xml><?xml version="1.0" encoding="utf-8"?>
 <w:document xmlns:ve="http://schemas.openxmlformats.org/markup-compatibility/2006" xmlns:o="urn:schemas-microsoft-com:office:office" xmlns:r="http://schemas.openxmlformats.org/officeDocument/2006/relationships" xmlns:m="http://schemas.openxmlformats.org/officeDocument/2006/math" xmlns:v="urn:schemas-microsoft-com:vml" xmlns:wp="http://schemas.openxmlformats.org/drawingml/2006/wordprocessingDrawing" xmlns:w10="urn:schemas-microsoft-com:office:word" xmlns:w="http://schemas.openxmlformats.org/wordprocessingml/2006/main" xmlns:wne="http://schemas.microsoft.com/office/word/2006/wordml">
   <w:body>
-    <w:p>
-      <w:pPr>
-        <w:pStyle w:val="Title"/>
+    <w:tbl>
+      <w:tblPr>
+        <w:tblW w:w="5000" w:type="pct"/>
         <w:jc w:val="center"/>
-      </w:pPr>
-      <w:r>
-        <w:t>Data Communications</w:t>
-      </w:r>
-    </w:p>
-    <w:p>
-      <w:pPr>
-        <w:pStyle w:val="Title"/>
-        <w:jc w:val="center"/>
-      </w:pPr>
-      <w:r>
-        <w:t xml:space="preserve">Assignment </w:t>
-      </w:r>
-      <w:r>
-        <w:t>4</w:t>
-      </w:r>
-      <w:r>
-        <w:t>–</w:t>
-      </w:r>
-      <w:r>
-        <w:t xml:space="preserve"> Design</w:t>
-      </w:r>
-    </w:p>
-    <w:p>
-      <w:pPr>
-        <w:pStyle w:val="Heading1"/>
-        <w:jc w:val="center"/>
-      </w:pPr>
-      <w:bookmarkStart w:id="0" w:name="_Toc403716930"/>
-      <w:r>
-        <w:t>Lewis Scott – A0</w:t>
-      </w:r>
-      <w:r>
-        <w:t>0855385</w:t>
-      </w:r>
-      <w:r>
-        <w:t xml:space="preserve"> – Set 3O</w:t>
-      </w:r>
-      <w:bookmarkEnd w:id="0"/>
-    </w:p>
-    <w:p>
-      <w:pPr>
-        <w:pStyle w:val="Heading1"/>
-        <w:jc w:val="center"/>
-      </w:pPr>
-      <w:bookmarkStart w:id="1" w:name="_Toc400292400"/>
-      <w:bookmarkStart w:id="2" w:name="_Toc400706064"/>
-      <w:bookmarkStart w:id="3" w:name="_Toc403716931"/>
-      <w:proofErr w:type="spellStart"/>
-      <w:r>
-        <w:t>Christofer</w:t>
-      </w:r>
-      <w:proofErr w:type="spellEnd"/>
-      <w:r>
-        <w:t xml:space="preserve"> </w:t>
-      </w:r>
-      <w:proofErr w:type="spellStart"/>
-      <w:r>
-        <w:t>Klassen</w:t>
-      </w:r>
-      <w:proofErr w:type="spellEnd"/>
-      <w:r>
-        <w:t xml:space="preserve"> – A00879060 – Set 3O</w:t>
-      </w:r>
-      <w:bookmarkEnd w:id="1"/>
-      <w:bookmarkEnd w:id="2"/>
-      <w:bookmarkEnd w:id="3"/>
-    </w:p>
-    <w:p>
-      <w:pPr>
-        <w:pStyle w:val="Heading1"/>
-        <w:jc w:val="center"/>
-      </w:pPr>
-      <w:bookmarkStart w:id="4" w:name="_Toc400292401"/>
-      <w:bookmarkStart w:id="5" w:name="_Toc400706065"/>
-      <w:bookmarkStart w:id="6" w:name="_Toc403716932"/>
-      <w:r>
-        <w:t xml:space="preserve">Jeff </w:t>
-      </w:r>
-      <w:proofErr w:type="spellStart"/>
-      <w:r>
-        <w:t>Bayn</w:t>
-      </w:r>
-      <w:r>
-        <w:t>tun</w:t>
-      </w:r>
-      <w:proofErr w:type="spellEnd"/>
-      <w:r>
-        <w:t xml:space="preserve"> – </w:t>
-      </w:r>
-      <w:r>
-        <w:t xml:space="preserve">A00860994 </w:t>
-      </w:r>
-      <w:r>
-        <w:t>– Set 3O</w:t>
-      </w:r>
-      <w:bookmarkEnd w:id="4"/>
-      <w:bookmarkEnd w:id="5"/>
-      <w:bookmarkEnd w:id="6"/>
-    </w:p>
-    <w:p>
-      <w:pPr>
-        <w:pStyle w:val="Heading1"/>
-        <w:jc w:val="center"/>
-      </w:pPr>
-      <w:bookmarkStart w:id="7" w:name="_Toc403716933"/>
-      <w:r>
-        <w:t xml:space="preserve">Thomas </w:t>
-      </w:r>
-      <w:proofErr w:type="spellStart"/>
-      <w:r>
-        <w:t>Tallentire</w:t>
-      </w:r>
-      <w:proofErr w:type="spellEnd"/>
-      <w:r>
-        <w:t xml:space="preserve"> – A00000000 – Set 3O</w:t>
-      </w:r>
-      <w:bookmarkEnd w:id="7"/>
+        <w:tblLook w:val="04A0"/>
+      </w:tblPr>
+      <w:tblGrid>
+        <w:gridCol w:w="9576"/>
+      </w:tblGrid>
+      <w:tr>
+        <w:trPr>
+          <w:trHeight w:val="2880"/>
+          <w:jc w:val="center"/>
+        </w:trPr>
+        <w:sdt>
+          <w:sdtPr>
+            <w:rPr>
+              <w:rFonts w:asciiTheme="majorHAnsi" w:eastAsiaTheme="majorEastAsia" w:hAnsiTheme="majorHAnsi" w:cstheme="majorBidi"/>
+              <w:caps/>
+            </w:rPr>
+            <w:alias w:val="Company"/>
+            <w:id w:val="15524243"/>
+            <w:placeholder>
+              <w:docPart w:val="2B299F69AD2D49139B7496AC7D61FA22"/>
+            </w:placeholder>
+            <w:dataBinding w:prefixMappings="xmlns:ns0='http://schemas.openxmlformats.org/officeDocument/2006/extended-properties'" w:xpath="/ns0:Properties[1]/ns0:Company[1]" w:storeItemID="{6668398D-A668-4E3E-A5EB-62B293D839F1}"/>
+            <w:text/>
+          </w:sdtPr>
+          <w:sdtContent>
+            <w:tc>
+              <w:tcPr>
+                <w:tcW w:w="5000" w:type="pct"/>
+              </w:tcPr>
+              <w:p>
+                <w:pPr>
+                  <w:pStyle w:val="NoSpacing"/>
+                  <w:jc w:val="center"/>
+                  <w:rPr>
+                    <w:rFonts w:asciiTheme="majorHAnsi" w:eastAsiaTheme="majorEastAsia" w:hAnsiTheme="majorHAnsi" w:cstheme="majorBidi"/>
+                    <w:caps/>
+                  </w:rPr>
+                </w:pPr>
+                <w:r>
+                  <w:rPr>
+                    <w:rFonts w:asciiTheme="majorHAnsi" w:eastAsiaTheme="majorEastAsia" w:hAnsiTheme="majorHAnsi" w:cstheme="majorBidi"/>
+                    <w:caps/>
+                  </w:rPr>
+                  <w:t>COMP 3980</w:t>
+                </w:r>
+              </w:p>
+            </w:tc>
+          </w:sdtContent>
+        </w:sdt>
+      </w:tr>
+      <w:tr>
+        <w:trPr>
+          <w:trHeight w:val="1440"/>
+          <w:jc w:val="center"/>
+        </w:trPr>
+        <w:sdt>
+          <w:sdtPr>
+            <w:rPr>
+              <w:rFonts w:asciiTheme="majorHAnsi" w:eastAsiaTheme="majorEastAsia" w:hAnsiTheme="majorHAnsi" w:cstheme="majorBidi"/>
+              <w:sz w:val="80"/>
+              <w:szCs w:val="80"/>
+            </w:rPr>
+            <w:alias w:val="Title"/>
+            <w:id w:val="15524250"/>
+            <w:placeholder>
+              <w:docPart w:val="157C53CDB75F4223B2FC86BA07287C6E"/>
+            </w:placeholder>
+            <w:dataBinding w:prefixMappings="xmlns:ns0='http://schemas.openxmlformats.org/package/2006/metadata/core-properties' xmlns:ns1='http://purl.org/dc/elements/1.1/'" w:xpath="/ns0:coreProperties[1]/ns1:title[1]" w:storeItemID="{6C3C8BC8-F283-45AE-878A-BAB7291924A1}"/>
+            <w:text/>
+          </w:sdtPr>
+          <w:sdtContent>
+            <w:tc>
+              <w:tcPr>
+                <w:tcW w:w="5000" w:type="pct"/>
+                <w:tcBorders>
+                  <w:bottom w:val="single" w:sz="4" w:space="0" w:color="F07F09" w:themeColor="accent1"/>
+                </w:tcBorders>
+                <w:vAlign w:val="center"/>
+              </w:tcPr>
+              <w:p>
+                <w:pPr>
+                  <w:pStyle w:val="NoSpacing"/>
+                  <w:jc w:val="center"/>
+                  <w:rPr>
+                    <w:rFonts w:asciiTheme="majorHAnsi" w:eastAsiaTheme="majorEastAsia" w:hAnsiTheme="majorHAnsi" w:cstheme="majorBidi"/>
+                    <w:sz w:val="80"/>
+                    <w:szCs w:val="80"/>
+                  </w:rPr>
+                </w:pPr>
+                <w:r>
+                  <w:rPr>
+                    <w:rFonts w:asciiTheme="majorHAnsi" w:eastAsiaTheme="majorEastAsia" w:hAnsiTheme="majorHAnsi" w:cstheme="majorBidi"/>
+                    <w:sz w:val="80"/>
+                    <w:szCs w:val="80"/>
+                  </w:rPr>
+                  <w:t xml:space="preserve">Data </w:t>
+                </w:r>
+                <w:proofErr w:type="spellStart"/>
+                <w:r>
+                  <w:rPr>
+                    <w:rFonts w:asciiTheme="majorHAnsi" w:eastAsiaTheme="majorEastAsia" w:hAnsiTheme="majorHAnsi" w:cstheme="majorBidi"/>
+                    <w:sz w:val="80"/>
+                    <w:szCs w:val="80"/>
+                  </w:rPr>
+                  <w:t>Comm</w:t>
+                </w:r>
+                <w:proofErr w:type="spellEnd"/>
+                <w:r>
+                  <w:rPr>
+                    <w:rFonts w:asciiTheme="majorHAnsi" w:eastAsiaTheme="majorEastAsia" w:hAnsiTheme="majorHAnsi" w:cstheme="majorBidi"/>
+                    <w:sz w:val="80"/>
+                    <w:szCs w:val="80"/>
+                  </w:rPr>
+                  <w:t xml:space="preserve"> Assignment 4 Design Document</w:t>
+                </w:r>
+              </w:p>
+            </w:tc>
+          </w:sdtContent>
+        </w:sdt>
+      </w:tr>
+      <w:tr>
+        <w:trPr>
+          <w:trHeight w:val="720"/>
+          <w:jc w:val="center"/>
+        </w:trPr>
+        <w:sdt>
+          <w:sdtPr>
+            <w:rPr>
+              <w:rFonts w:asciiTheme="majorHAnsi" w:eastAsiaTheme="majorEastAsia" w:hAnsiTheme="majorHAnsi" w:cstheme="majorBidi"/>
+              <w:sz w:val="44"/>
+              <w:szCs w:val="44"/>
+            </w:rPr>
+            <w:alias w:val="Subtitle"/>
+            <w:id w:val="15524255"/>
+            <w:placeholder>
+              <w:docPart w:val="2A44FB82D66742DEB81BAB5EFC412D80"/>
+            </w:placeholder>
+            <w:dataBinding w:prefixMappings="xmlns:ns0='http://schemas.openxmlformats.org/package/2006/metadata/core-properties' xmlns:ns1='http://purl.org/dc/elements/1.1/'" w:xpath="/ns0:coreProperties[1]/ns1:subject[1]" w:storeItemID="{6C3C8BC8-F283-45AE-878A-BAB7291924A1}"/>
+            <w:text/>
+          </w:sdtPr>
+          <w:sdtContent>
+            <w:tc>
+              <w:tcPr>
+                <w:tcW w:w="5000" w:type="pct"/>
+                <w:tcBorders>
+                  <w:top w:val="single" w:sz="4" w:space="0" w:color="F07F09" w:themeColor="accent1"/>
+                </w:tcBorders>
+                <w:vAlign w:val="center"/>
+              </w:tcPr>
+              <w:p>
+                <w:pPr>
+                  <w:pStyle w:val="NoSpacing"/>
+                  <w:jc w:val="center"/>
+                  <w:rPr>
+                    <w:rFonts w:asciiTheme="majorHAnsi" w:eastAsiaTheme="majorEastAsia" w:hAnsiTheme="majorHAnsi" w:cstheme="majorBidi"/>
+                    <w:sz w:val="44"/>
+                    <w:szCs w:val="44"/>
+                  </w:rPr>
+                </w:pPr>
+                <w:r>
+                  <w:rPr>
+                    <w:rFonts w:asciiTheme="majorHAnsi" w:eastAsiaTheme="majorEastAsia" w:hAnsiTheme="majorHAnsi" w:cstheme="majorBidi"/>
+                    <w:sz w:val="44"/>
+                    <w:szCs w:val="44"/>
+                  </w:rPr>
+                  <w:t>An implementation of the Grapefruit Protocol</w:t>
+                </w:r>
+              </w:p>
+            </w:tc>
+          </w:sdtContent>
+        </w:sdt>
+      </w:tr>
+      <w:tr>
+        <w:trPr>
+          <w:trHeight w:val="360"/>
+          <w:jc w:val="center"/>
+        </w:trPr>
+        <w:tc>
+          <w:tcPr>
+            <w:tcW w:w="5000" w:type="pct"/>
+            <w:vAlign w:val="center"/>
+          </w:tcPr>
+          <w:p>
+            <w:pPr>
+              <w:pStyle w:val="NoSpacing"/>
+              <w:jc w:val="center"/>
+            </w:pPr>
+          </w:p>
+        </w:tc>
+      </w:tr>
+      <w:tr>
+        <w:trPr>
+          <w:trHeight w:val="360"/>
+          <w:jc w:val="center"/>
+        </w:trPr>
+        <w:tc>
+          <w:tcPr>
+            <w:tcW w:w="5000" w:type="pct"/>
+            <w:vAlign w:val="center"/>
+          </w:tcPr>
+          <w:p>
+            <w:pPr>
+              <w:pStyle w:val="NoSpacing"/>
+              <w:jc w:val="center"/>
+              <w:rPr>
+                <w:b/>
+                <w:bCs/>
+              </w:rPr>
+            </w:pPr>
+            <w:r>
+              <w:rPr>
+                <w:b/>
+                <w:bCs/>
+              </w:rPr>
+              <w:t>Lewis Scott - A00855385</w:t>
+            </w:r>
+          </w:p>
+        </w:tc>
+      </w:tr>
+      <w:tr>
+        <w:trPr>
+          <w:trHeight w:val="360"/>
+          <w:jc w:val="center"/>
+        </w:trPr>
+        <w:tc>
+          <w:tcPr>
+            <w:tcW w:w="5000" w:type="pct"/>
+            <w:vAlign w:val="center"/>
+          </w:tcPr>
+          <w:p>
+            <w:pPr>
+              <w:pStyle w:val="NoSpacing"/>
+              <w:jc w:val="center"/>
+              <w:rPr>
+                <w:b/>
+                <w:bCs/>
+              </w:rPr>
+            </w:pPr>
+            <w:proofErr w:type="spellStart"/>
+            <w:r>
+              <w:rPr>
+                <w:b/>
+                <w:bCs/>
+              </w:rPr>
+              <w:t>Christofer</w:t>
+            </w:r>
+            <w:proofErr w:type="spellEnd"/>
+            <w:r>
+              <w:rPr>
+                <w:b/>
+                <w:bCs/>
+              </w:rPr>
+              <w:t xml:space="preserve"> </w:t>
+            </w:r>
+            <w:proofErr w:type="spellStart"/>
+            <w:r>
+              <w:rPr>
+                <w:b/>
+                <w:bCs/>
+              </w:rPr>
+              <w:t>Klassen</w:t>
+            </w:r>
+            <w:proofErr w:type="spellEnd"/>
+            <w:r>
+              <w:rPr>
+                <w:b/>
+                <w:bCs/>
+              </w:rPr>
+              <w:t xml:space="preserve"> - A00879060</w:t>
+            </w:r>
+          </w:p>
+        </w:tc>
+      </w:tr>
+      <w:tr>
+        <w:trPr>
+          <w:trHeight w:val="360"/>
+          <w:jc w:val="center"/>
+        </w:trPr>
+        <w:tc>
+          <w:tcPr>
+            <w:tcW w:w="5000" w:type="pct"/>
+            <w:vAlign w:val="center"/>
+          </w:tcPr>
+          <w:p>
+            <w:pPr>
+              <w:pStyle w:val="NoSpacing"/>
+              <w:jc w:val="center"/>
+              <w:rPr>
+                <w:b/>
+                <w:bCs/>
+              </w:rPr>
+            </w:pPr>
+            <w:r>
+              <w:rPr>
+                <w:b/>
+                <w:bCs/>
+              </w:rPr>
+              <w:t xml:space="preserve">Jeff </w:t>
+            </w:r>
+            <w:proofErr w:type="spellStart"/>
+            <w:r>
+              <w:rPr>
+                <w:b/>
+                <w:bCs/>
+              </w:rPr>
+              <w:t>Bayntun</w:t>
+            </w:r>
+            <w:proofErr w:type="spellEnd"/>
+            <w:r>
+              <w:rPr>
+                <w:b/>
+                <w:bCs/>
+              </w:rPr>
+              <w:t xml:space="preserve"> - A00860994</w:t>
+            </w:r>
+          </w:p>
+        </w:tc>
+      </w:tr>
+      <w:tr>
+        <w:trPr>
+          <w:trHeight w:val="360"/>
+          <w:jc w:val="center"/>
+        </w:trPr>
+        <w:tc>
+          <w:tcPr>
+            <w:tcW w:w="5000" w:type="pct"/>
+            <w:vAlign w:val="center"/>
+          </w:tcPr>
+          <w:p>
+            <w:pPr>
+              <w:pStyle w:val="NoSpacing"/>
+              <w:jc w:val="center"/>
+              <w:rPr>
+                <w:b/>
+                <w:bCs/>
+              </w:rPr>
+            </w:pPr>
+            <w:r>
+              <w:rPr>
+                <w:b/>
+                <w:bCs/>
+              </w:rPr>
+              <w:t xml:space="preserve">Thomas </w:t>
+            </w:r>
+            <w:proofErr w:type="spellStart"/>
+            <w:r>
+              <w:rPr>
+                <w:b/>
+                <w:bCs/>
+              </w:rPr>
+              <w:t>Tallentire</w:t>
+            </w:r>
+            <w:proofErr w:type="spellEnd"/>
+            <w:r>
+              <w:rPr>
+                <w:b/>
+                <w:bCs/>
+              </w:rPr>
+              <w:t xml:space="preserve"> - </w:t>
+            </w:r>
+            <w:r>
+              <w:rPr>
+                <w:b/>
+                <w:bCs/>
+              </w:rPr>
+              <w:t>A00882367</w:t>
+            </w:r>
+          </w:p>
+        </w:tc>
+      </w:tr>
+      <w:tr>
+        <w:trPr>
+          <w:trHeight w:val="360"/>
+          <w:jc w:val="center"/>
+        </w:trPr>
+        <w:tc>
+          <w:tcPr>
+            <w:tcW w:w="5000" w:type="pct"/>
+            <w:vAlign w:val="center"/>
+          </w:tcPr>
+          <w:p>
+            <w:pPr>
+              <w:pStyle w:val="NoSpacing"/>
+              <w:jc w:val="center"/>
+              <w:rPr>
+                <w:b/>
+                <w:bCs/>
+              </w:rPr>
+            </w:pPr>
+          </w:p>
+        </w:tc>
+      </w:tr>
+    </w:tbl>
+    <w:p/>
+    <w:p/>
+    <w:tbl>
+      <w:tblPr>
+        <w:tblpPr w:leftFromText="187" w:rightFromText="187" w:horzAnchor="margin" w:tblpXSpec="center" w:tblpYSpec="bottom"/>
+        <w:tblW w:w="5000" w:type="pct"/>
+        <w:tblLook w:val="04A0"/>
+      </w:tblPr>
+      <w:tblGrid>
+        <w:gridCol w:w="9576"/>
+      </w:tblGrid>
+      <w:tr>
+        <w:tc>
+          <w:tcPr>
+            <w:tcW w:w="5000" w:type="pct"/>
+          </w:tcPr>
+          <w:p>
+            <w:pPr>
+              <w:pStyle w:val="NoSpacing"/>
+            </w:pPr>
+          </w:p>
+        </w:tc>
+      </w:tr>
+    </w:tbl>
+    <w:p>
+      <w:pPr>
+        <w:rPr>
+          <w:rFonts w:asciiTheme="majorHAnsi" w:eastAsiaTheme="majorEastAsia" w:hAnsiTheme="majorHAnsi" w:cstheme="majorBidi"/>
+          <w:color w:val="B35E06" w:themeColor="accent1" w:themeShade="BF"/>
+          <w:spacing w:val="-7"/>
+          <w:sz w:val="80"/>
+          <w:szCs w:val="80"/>
+        </w:rPr>
+      </w:pPr>
+      <w:r>
+        <w:br w:type="page"/>
+      </w:r>
     </w:p>
     <w:sdt>
       <w:sdtPr>
@@ -150,6 +462,7 @@
         <w:p>
           <w:pPr>
             <w:pStyle w:val="TOCHeading"/>
+            <w:jc w:val="center"/>
           </w:pPr>
           <w:r>
             <w:t xml:space="preserve">Table of </w:t>
@@ -157,6 +470,14 @@
           <w:r>
             <w:t>Contents</w:t>
           </w:r>
+        </w:p>
+        <w:p>
+          <w:pPr>
+            <w:pStyle w:val="TOC1"/>
+            <w:tabs>
+              <w:tab w:val="right" w:leader="dot" w:pos="9350"/>
+            </w:tabs>
+          </w:pPr>
         </w:p>
         <w:p>
           <w:pPr>
@@ -751,7 +1072,7 @@
       <w:pPr>
         <w:rPr>
           <w:rFonts w:asciiTheme="majorHAnsi" w:eastAsiaTheme="majorEastAsia" w:hAnsiTheme="majorHAnsi" w:cstheme="majorBidi"/>
-          <w:color w:val="729928" w:themeColor="accent1" w:themeShade="BF"/>
+          <w:color w:val="B35E06" w:themeColor="accent1" w:themeShade="BF"/>
           <w:sz w:val="36"/>
           <w:szCs w:val="36"/>
         </w:rPr>
@@ -763,43 +1084,41 @@
     <w:p>
       <w:pPr>
         <w:pStyle w:val="Heading1"/>
-      </w:pPr>
-      <w:bookmarkStart w:id="8" w:name="_Toc403716934"/>
+        <w:jc w:val="center"/>
+      </w:pPr>
+      <w:bookmarkStart w:id="0" w:name="_Toc403716934"/>
       <w:r>
         <w:lastRenderedPageBreak/>
         <w:t>State Flow Diagram</w:t>
       </w:r>
-      <w:bookmarkEnd w:id="8"/>
-    </w:p>
-    <w:p>
-      <w:pPr>
+      <w:bookmarkEnd w:id="0"/>
+    </w:p>
+    <w:p/>
+    <w:p>
+      <w:pPr>
+        <w:pStyle w:val="Heading1"/>
         <w:jc w:val="center"/>
       </w:pPr>
-    </w:p>
-    <w:p>
-      <w:pPr>
-        <w:pStyle w:val="Heading1"/>
-      </w:pPr>
       <w:r>
         <w:br w:type="page"/>
       </w:r>
-      <w:bookmarkStart w:id="9" w:name="_Toc403716935"/>
+      <w:bookmarkStart w:id="1" w:name="_Toc403716935"/>
       <w:r>
         <w:lastRenderedPageBreak/>
         <w:t>Pseudo Code</w:t>
       </w:r>
-      <w:bookmarkEnd w:id="9"/>
+      <w:bookmarkEnd w:id="1"/>
     </w:p>
     <w:p/>
     <w:p>
       <w:pPr>
         <w:pStyle w:val="Heading2"/>
       </w:pPr>
-      <w:bookmarkStart w:id="10" w:name="_Toc403716936"/>
+      <w:bookmarkStart w:id="2" w:name="_Toc403716936"/>
       <w:r>
         <w:t>Setup</w:t>
       </w:r>
-      <w:bookmarkEnd w:id="10"/>
+      <w:bookmarkEnd w:id="2"/>
     </w:p>
     <w:p/>
     <w:p>
@@ -924,8 +1243,8 @@
         <w:tab/>
         <w:t>Terminate progr</w:t>
       </w:r>
-      <w:bookmarkStart w:id="11" w:name="_GoBack"/>
-      <w:bookmarkEnd w:id="11"/>
+      <w:bookmarkStart w:id="3" w:name="_GoBack"/>
+      <w:bookmarkEnd w:id="3"/>
       <w:r>
         <w:rPr>
           <w:rFonts w:ascii="Courier New" w:hAnsi="Courier New" w:cs="Courier New"/>
@@ -983,11 +1302,11 @@
       <w:pPr>
         <w:pStyle w:val="Heading2"/>
       </w:pPr>
-      <w:bookmarkStart w:id="12" w:name="_Toc403716937"/>
+      <w:bookmarkStart w:id="4" w:name="_Toc403716937"/>
       <w:r>
         <w:t>Idle</w:t>
       </w:r>
-      <w:bookmarkEnd w:id="12"/>
+      <w:bookmarkEnd w:id="4"/>
     </w:p>
     <w:p/>
     <w:p>
@@ -1308,11 +1627,11 @@
       <w:pPr>
         <w:pStyle w:val="Heading2"/>
       </w:pPr>
-      <w:bookmarkStart w:id="13" w:name="_Toc403716938"/>
+      <w:bookmarkStart w:id="5" w:name="_Toc403716938"/>
       <w:r>
         <w:t>Receive Start</w:t>
       </w:r>
-      <w:bookmarkEnd w:id="13"/>
+      <w:bookmarkEnd w:id="5"/>
     </w:p>
     <w:p/>
     <w:p>
@@ -1738,11 +2057,14 @@
       <w:pPr>
         <w:pStyle w:val="Heading2"/>
       </w:pPr>
-      <w:bookmarkStart w:id="14" w:name="_Toc403716939"/>
-      <w:r>
-        <w:t>Receive Start</w:t>
-      </w:r>
-      <w:bookmarkEnd w:id="14"/>
+      <w:bookmarkStart w:id="6" w:name="_Toc403716939"/>
+      <w:r>
+        <w:t xml:space="preserve">Receive </w:t>
+      </w:r>
+      <w:bookmarkEnd w:id="6"/>
+      <w:r>
+        <w:t>Data</w:t>
+      </w:r>
     </w:p>
     <w:p/>
     <w:p>
@@ -2740,11 +3062,11 @@
       <w:pPr>
         <w:pStyle w:val="Heading2"/>
       </w:pPr>
-      <w:bookmarkStart w:id="15" w:name="_Toc403716940"/>
+      <w:bookmarkStart w:id="7" w:name="_Toc403716940"/>
       <w:r>
         <w:t>Send Start</w:t>
       </w:r>
-      <w:bookmarkEnd w:id="15"/>
+      <w:bookmarkEnd w:id="7"/>
     </w:p>
     <w:p>
       <w:pPr>
@@ -2928,11 +3250,11 @@
       <w:pPr>
         <w:pStyle w:val="Heading2"/>
       </w:pPr>
-      <w:bookmarkStart w:id="16" w:name="_Toc403716941"/>
+      <w:bookmarkStart w:id="8" w:name="_Toc403716941"/>
       <w:r>
         <w:t>Send Data</w:t>
       </w:r>
-      <w:bookmarkEnd w:id="16"/>
+      <w:bookmarkEnd w:id="8"/>
     </w:p>
     <w:p>
       <w:pPr>
@@ -4629,14 +4951,14 @@
       <w:keepNext/>
       <w:keepLines/>
       <w:pBdr>
-        <w:bottom w:val="single" w:sz="4" w:space="1" w:color="99CB38" w:themeColor="accent1"/>
+        <w:bottom w:val="single" w:sz="4" w:space="1" w:color="F07F09" w:themeColor="accent1"/>
       </w:pBdr>
       <w:spacing w:before="400" w:after="40" w:line="240" w:lineRule="auto"/>
       <w:outlineLvl w:val="0"/>
     </w:pPr>
     <w:rPr>
       <w:rFonts w:asciiTheme="majorHAnsi" w:eastAsiaTheme="majorEastAsia" w:hAnsiTheme="majorHAnsi" w:cstheme="majorBidi"/>
-      <w:color w:val="729928" w:themeColor="accent1" w:themeShade="BF"/>
+      <w:color w:val="B35E06" w:themeColor="accent1" w:themeShade="BF"/>
       <w:sz w:val="36"/>
       <w:szCs w:val="36"/>
     </w:rPr>
@@ -4658,7 +4980,7 @@
     </w:pPr>
     <w:rPr>
       <w:rFonts w:asciiTheme="majorHAnsi" w:eastAsiaTheme="majorEastAsia" w:hAnsiTheme="majorHAnsi" w:cstheme="majorBidi"/>
-      <w:color w:val="729928" w:themeColor="accent1" w:themeShade="BF"/>
+      <w:color w:val="B35E06" w:themeColor="accent1" w:themeShade="BF"/>
       <w:sz w:val="28"/>
       <w:szCs w:val="28"/>
     </w:rPr>
@@ -4858,7 +5180,7 @@
     <w:rsid w:val="00510687"/>
     <w:rPr>
       <w:rFonts w:asciiTheme="majorHAnsi" w:eastAsiaTheme="majorEastAsia" w:hAnsiTheme="majorHAnsi" w:cstheme="majorBidi"/>
-      <w:color w:val="729928" w:themeColor="accent1" w:themeShade="BF"/>
+      <w:color w:val="B35E06" w:themeColor="accent1" w:themeShade="BF"/>
       <w:sz w:val="36"/>
       <w:szCs w:val="36"/>
     </w:rPr>
@@ -4877,7 +5199,7 @@
     </w:pPr>
     <w:rPr>
       <w:rFonts w:asciiTheme="majorHAnsi" w:eastAsiaTheme="majorEastAsia" w:hAnsiTheme="majorHAnsi" w:cstheme="majorBidi"/>
-      <w:color w:val="729928" w:themeColor="accent1" w:themeShade="BF"/>
+      <w:color w:val="B35E06" w:themeColor="accent1" w:themeShade="BF"/>
       <w:spacing w:val="-7"/>
       <w:sz w:val="80"/>
       <w:szCs w:val="80"/>
@@ -4891,7 +5213,7 @@
     <w:rsid w:val="00510687"/>
     <w:rPr>
       <w:rFonts w:asciiTheme="majorHAnsi" w:eastAsiaTheme="majorEastAsia" w:hAnsiTheme="majorHAnsi" w:cstheme="majorBidi"/>
-      <w:color w:val="729928" w:themeColor="accent1" w:themeShade="BF"/>
+      <w:color w:val="B35E06" w:themeColor="accent1" w:themeShade="BF"/>
       <w:spacing w:val="-7"/>
       <w:sz w:val="80"/>
       <w:szCs w:val="80"/>
@@ -4905,7 +5227,7 @@
     <w:rsid w:val="00510687"/>
     <w:rPr>
       <w:rFonts w:asciiTheme="majorHAnsi" w:eastAsiaTheme="majorEastAsia" w:hAnsiTheme="majorHAnsi" w:cstheme="majorBidi"/>
-      <w:color w:val="729928" w:themeColor="accent1" w:themeShade="BF"/>
+      <w:color w:val="B35E06" w:themeColor="accent1" w:themeShade="BF"/>
       <w:sz w:val="28"/>
       <w:szCs w:val="28"/>
     </w:rPr>
@@ -5084,6 +5406,7 @@
   </w:style>
   <w:style w:type="paragraph" w:styleId="NoSpacing">
     <w:name w:val="No Spacing"/>
+    <w:link w:val="NoSpacingChar"/>
     <w:uiPriority w:val="1"/>
     <w:qFormat/>
     <w:rsid w:val="00510687"/>
@@ -5135,7 +5458,7 @@
     </w:pPr>
     <w:rPr>
       <w:rFonts w:asciiTheme="majorHAnsi" w:eastAsiaTheme="majorEastAsia" w:hAnsiTheme="majorHAnsi" w:cstheme="majorBidi"/>
-      <w:color w:val="99CB38" w:themeColor="accent1"/>
+      <w:color w:val="F07F09" w:themeColor="accent1"/>
       <w:sz w:val="28"/>
       <w:szCs w:val="28"/>
     </w:rPr>
@@ -5148,7 +5471,7 @@
     <w:rsid w:val="00510687"/>
     <w:rPr>
       <w:rFonts w:asciiTheme="majorHAnsi" w:eastAsiaTheme="majorEastAsia" w:hAnsiTheme="majorHAnsi" w:cstheme="majorBidi"/>
-      <w:color w:val="99CB38" w:themeColor="accent1"/>
+      <w:color w:val="F07F09" w:themeColor="accent1"/>
       <w:sz w:val="28"/>
       <w:szCs w:val="28"/>
     </w:rPr>
@@ -5258,7 +5581,7 @@
     <w:unhideWhenUsed/>
     <w:rsid w:val="00362B52"/>
     <w:rPr>
-      <w:color w:val="EE7B08" w:themeColor="hyperlink"/>
+      <w:color w:val="6B9F25" w:themeColor="hyperlink"/>
       <w:u w:val="single"/>
     </w:rPr>
   </w:style>
@@ -5292,13 +5615,413 @@
       <w:szCs w:val="16"/>
     </w:rPr>
   </w:style>
+  <w:style w:type="character" w:customStyle="1" w:styleId="NoSpacingChar">
+    <w:name w:val="No Spacing Char"/>
+    <w:basedOn w:val="DefaultParagraphFont"/>
+    <w:link w:val="NoSpacing"/>
+    <w:uiPriority w:val="1"/>
+    <w:rsid w:val="00A72B8F"/>
+  </w:style>
 </w:styles>
+</file>
+
+<file path=word/glossary/document.xml><?xml version="1.0" encoding="utf-8"?>
+<w:glossaryDocument xmlns:ve="http://schemas.openxmlformats.org/markup-compatibility/2006" xmlns:o="urn:schemas-microsoft-com:office:office" xmlns:r="http://schemas.openxmlformats.org/officeDocument/2006/relationships" xmlns:m="http://schemas.openxmlformats.org/officeDocument/2006/math" xmlns:v="urn:schemas-microsoft-com:vml" xmlns:wp="http://schemas.openxmlformats.org/drawingml/2006/wordprocessingDrawing" xmlns:w10="urn:schemas-microsoft-com:office:word" xmlns:w="http://schemas.openxmlformats.org/wordprocessingml/2006/main" xmlns:wne="http://schemas.microsoft.com/office/word/2006/wordml">
+  <w:docParts>
+    <w:docPart>
+      <w:docPartPr>
+        <w:name w:val="2B299F69AD2D49139B7496AC7D61FA22"/>
+        <w:category>
+          <w:name w:val="General"/>
+          <w:gallery w:val="placeholder"/>
+        </w:category>
+        <w:types>
+          <w:type w:val="bbPlcHdr"/>
+        </w:types>
+        <w:behaviors>
+          <w:behavior w:val="content"/>
+        </w:behaviors>
+        <w:guid w:val="{9E6510DF-F333-4EF3-9AB8-FBF3BFC44412}"/>
+      </w:docPartPr>
+      <w:docPartBody>
+        <w:p>
+          <w:pPr>
+            <w:pStyle w:val="2B299F69AD2D49139B7496AC7D61FA22"/>
+          </w:pPr>
+          <w:r>
+            <w:rPr>
+              <w:rFonts w:asciiTheme="majorHAnsi" w:eastAsiaTheme="majorEastAsia" w:hAnsiTheme="majorHAnsi" w:cstheme="majorBidi"/>
+              <w:caps/>
+            </w:rPr>
+            <w:t>[Type the company name]</w:t>
+          </w:r>
+        </w:p>
+      </w:docPartBody>
+    </w:docPart>
+    <w:docPart>
+      <w:docPartPr>
+        <w:name w:val="157C53CDB75F4223B2FC86BA07287C6E"/>
+        <w:category>
+          <w:name w:val="General"/>
+          <w:gallery w:val="placeholder"/>
+        </w:category>
+        <w:types>
+          <w:type w:val="bbPlcHdr"/>
+        </w:types>
+        <w:behaviors>
+          <w:behavior w:val="content"/>
+        </w:behaviors>
+        <w:guid w:val="{ADA256C8-8AB1-4B4D-B047-1F73F2AE3358}"/>
+      </w:docPartPr>
+      <w:docPartBody>
+        <w:p>
+          <w:pPr>
+            <w:pStyle w:val="157C53CDB75F4223B2FC86BA07287C6E"/>
+          </w:pPr>
+          <w:r>
+            <w:rPr>
+              <w:rFonts w:asciiTheme="majorHAnsi" w:eastAsiaTheme="majorEastAsia" w:hAnsiTheme="majorHAnsi" w:cstheme="majorBidi"/>
+              <w:sz w:val="80"/>
+              <w:szCs w:val="80"/>
+            </w:rPr>
+            <w:t>[Type the document title]</w:t>
+          </w:r>
+        </w:p>
+      </w:docPartBody>
+    </w:docPart>
+    <w:docPart>
+      <w:docPartPr>
+        <w:name w:val="2A44FB82D66742DEB81BAB5EFC412D80"/>
+        <w:category>
+          <w:name w:val="General"/>
+          <w:gallery w:val="placeholder"/>
+        </w:category>
+        <w:types>
+          <w:type w:val="bbPlcHdr"/>
+        </w:types>
+        <w:behaviors>
+          <w:behavior w:val="content"/>
+        </w:behaviors>
+        <w:guid w:val="{290E7F70-42E8-4E4A-AE12-69954CEC9CD0}"/>
+      </w:docPartPr>
+      <w:docPartBody>
+        <w:p>
+          <w:pPr>
+            <w:pStyle w:val="2A44FB82D66742DEB81BAB5EFC412D80"/>
+          </w:pPr>
+          <w:r>
+            <w:rPr>
+              <w:rFonts w:asciiTheme="majorHAnsi" w:eastAsiaTheme="majorEastAsia" w:hAnsiTheme="majorHAnsi" w:cstheme="majorBidi"/>
+              <w:sz w:val="44"/>
+              <w:szCs w:val="44"/>
+            </w:rPr>
+            <w:t>[Type the document subtitle]</w:t>
+          </w:r>
+        </w:p>
+      </w:docPartBody>
+    </w:docPart>
+  </w:docParts>
+</w:glossaryDocument>
+</file>
+
+<file path=word/glossary/fontTable.xml><?xml version="1.0" encoding="utf-8"?>
+<w:fonts xmlns:r="http://schemas.openxmlformats.org/officeDocument/2006/relationships" xmlns:w="http://schemas.openxmlformats.org/wordprocessingml/2006/main">
+  <w:font w:name="Trebuchet MS">
+    <w:panose1 w:val="020B0603020202020204"/>
+    <w:charset w:val="00"/>
+    <w:family w:val="swiss"/>
+    <w:pitch w:val="variable"/>
+    <w:sig w:usb0="00000287" w:usb1="00000003" w:usb2="00000000" w:usb3="00000000" w:csb0="0000009F" w:csb1="00000000"/>
+  </w:font>
+  <w:font w:name="Times New Roman">
+    <w:panose1 w:val="02020603050405020304"/>
+    <w:charset w:val="00"/>
+    <w:family w:val="roman"/>
+    <w:pitch w:val="variable"/>
+    <w:sig w:usb0="E0002EFF" w:usb1="C0007843" w:usb2="00000009" w:usb3="00000000" w:csb0="000001FF" w:csb1="00000000"/>
+  </w:font>
+  <w:font w:name="Tahoma">
+    <w:panose1 w:val="020B0604030504040204"/>
+    <w:charset w:val="00"/>
+    <w:family w:val="swiss"/>
+    <w:notTrueType/>
+    <w:pitch w:val="variable"/>
+    <w:sig w:usb0="00000003" w:usb1="00000000" w:usb2="00000000" w:usb3="00000000" w:csb0="00000001" w:csb1="00000000"/>
+  </w:font>
+  <w:font w:name="Courier New">
+    <w:panose1 w:val="02070309020205020404"/>
+    <w:charset w:val="00"/>
+    <w:family w:val="modern"/>
+    <w:pitch w:val="fixed"/>
+    <w:sig w:usb0="E0002AFF" w:usb1="C0007843" w:usb2="00000009" w:usb3="00000000" w:csb0="000001FF" w:csb1="00000000"/>
+  </w:font>
+  <w:font w:name="Calibri">
+    <w:panose1 w:val="020F0502020204030204"/>
+    <w:charset w:val="00"/>
+    <w:family w:val="swiss"/>
+    <w:pitch w:val="variable"/>
+    <w:sig w:usb0="E00002FF" w:usb1="4000ACFF" w:usb2="00000001" w:usb3="00000000" w:csb0="0000019F" w:csb1="00000000"/>
+  </w:font>
+  <w:font w:name="Cambria">
+    <w:panose1 w:val="02040503050406030204"/>
+    <w:charset w:val="00"/>
+    <w:family w:val="roman"/>
+    <w:pitch w:val="variable"/>
+    <w:sig w:usb0="E00002FF" w:usb1="400004FF" w:usb2="00000000" w:usb3="00000000" w:csb0="0000019F" w:csb1="00000000"/>
+  </w:font>
+</w:fonts>
+</file>
+
+<file path=word/glossary/settings.xml><?xml version="1.0" encoding="utf-8"?>
+<w:settings xmlns:o="urn:schemas-microsoft-com:office:office" xmlns:r="http://schemas.openxmlformats.org/officeDocument/2006/relationships" xmlns:m="http://schemas.openxmlformats.org/officeDocument/2006/math" xmlns:v="urn:schemas-microsoft-com:vml" xmlns:w10="urn:schemas-microsoft-com:office:word" xmlns:w="http://schemas.openxmlformats.org/wordprocessingml/2006/main" xmlns:sl="http://schemas.openxmlformats.org/schemaLibrary/2006/main">
+  <w:view w:val="normal"/>
+  <w:defaultTabStop w:val="720"/>
+  <w:characterSpacingControl w:val="doNotCompress"/>
+  <w:compat>
+    <w:useFELayout/>
+  </w:compat>
+  <w:rsids>
+    <w:rsidRoot w:val="00172828"/>
+    <w:rsid w:val="00172828"/>
+    <w:rsid w:val="003D207A"/>
+  </w:rsids>
+  <m:mathPr>
+    <m:mathFont m:val="Cambria Math"/>
+    <m:brkBin m:val="before"/>
+    <m:brkBinSub m:val="--"/>
+    <m:smallFrac m:val="off"/>
+    <m:dispDef/>
+    <m:lMargin m:val="0"/>
+    <m:rMargin m:val="0"/>
+    <m:defJc m:val="centerGroup"/>
+    <m:wrapIndent m:val="1440"/>
+    <m:intLim m:val="subSup"/>
+    <m:naryLim m:val="undOvr"/>
+  </m:mathPr>
+  <w:themeFontLang w:val="en-CA"/>
+  <w:clrSchemeMapping w:bg1="light1" w:t1="dark1" w:bg2="light2" w:t2="dark2" w:accent1="accent1" w:accent2="accent2" w:accent3="accent3" w:accent4="accent4" w:accent5="accent5" w:accent6="accent6" w:hyperlink="hyperlink" w:followedHyperlink="followedHyperlink"/>
+  <w:decimalSymbol w:val="."/>
+  <w:listSeparator w:val=","/>
+</w:settings>
+</file>
+
+<file path=word/glossary/styles.xml><?xml version="1.0" encoding="utf-8"?>
+<w:styles xmlns:r="http://schemas.openxmlformats.org/officeDocument/2006/relationships" xmlns:w="http://schemas.openxmlformats.org/wordprocessingml/2006/main">
+  <w:docDefaults>
+    <w:rPrDefault>
+      <w:rPr>
+        <w:rFonts w:asciiTheme="minorHAnsi" w:eastAsiaTheme="minorEastAsia" w:hAnsiTheme="minorHAnsi" w:cstheme="minorBidi"/>
+        <w:sz w:val="22"/>
+        <w:szCs w:val="22"/>
+        <w:lang w:val="en-CA" w:eastAsia="en-CA" w:bidi="ar-SA"/>
+      </w:rPr>
+    </w:rPrDefault>
+    <w:pPrDefault>
+      <w:pPr>
+        <w:spacing w:after="200" w:line="276" w:lineRule="auto"/>
+      </w:pPr>
+    </w:pPrDefault>
+  </w:docDefaults>
+  <w:latentStyles w:defLockedState="0" w:defUIPriority="99" w:defSemiHidden="1" w:defUnhideWhenUsed="1" w:defQFormat="0" w:count="267">
+    <w:lsdException w:name="Normal" w:semiHidden="0" w:uiPriority="0" w:unhideWhenUsed="0" w:qFormat="1"/>
+    <w:lsdException w:name="heading 1" w:semiHidden="0" w:uiPriority="9" w:unhideWhenUsed="0" w:qFormat="1"/>
+    <w:lsdException w:name="heading 2" w:uiPriority="9" w:qFormat="1"/>
+    <w:lsdException w:name="heading 3" w:uiPriority="9" w:qFormat="1"/>
+    <w:lsdException w:name="heading 4" w:uiPriority="9" w:qFormat="1"/>
+    <w:lsdException w:name="heading 5" w:uiPriority="9" w:qFormat="1"/>
+    <w:lsdException w:name="heading 6" w:uiPriority="9" w:qFormat="1"/>
+    <w:lsdException w:name="heading 7" w:uiPriority="9" w:qFormat="1"/>
+    <w:lsdException w:name="heading 8" w:uiPriority="9" w:qFormat="1"/>
+    <w:lsdException w:name="heading 9" w:uiPriority="9" w:qFormat="1"/>
+    <w:lsdException w:name="toc 1" w:uiPriority="39"/>
+    <w:lsdException w:name="toc 2" w:uiPriority="39"/>
+    <w:lsdException w:name="toc 3" w:uiPriority="39"/>
+    <w:lsdException w:name="toc 4" w:uiPriority="39"/>
+    <w:lsdException w:name="toc 5" w:uiPriority="39"/>
+    <w:lsdException w:name="toc 6" w:uiPriority="39"/>
+    <w:lsdException w:name="toc 7" w:uiPriority="39"/>
+    <w:lsdException w:name="toc 8" w:uiPriority="39"/>
+    <w:lsdException w:name="toc 9" w:uiPriority="39"/>
+    <w:lsdException w:name="caption" w:uiPriority="35" w:qFormat="1"/>
+    <w:lsdException w:name="Title" w:semiHidden="0" w:uiPriority="10" w:unhideWhenUsed="0" w:qFormat="1"/>
+    <w:lsdException w:name="Default Paragraph Font" w:uiPriority="1"/>
+    <w:lsdException w:name="Subtitle" w:semiHidden="0" w:uiPriority="11" w:unhideWhenUsed="0" w:qFormat="1"/>
+    <w:lsdException w:name="Strong" w:semiHidden="0" w:uiPriority="22" w:unhideWhenUsed="0" w:qFormat="1"/>
+    <w:lsdException w:name="Emphasis" w:semiHidden="0" w:uiPriority="20" w:unhideWhenUsed="0" w:qFormat="1"/>
+    <w:lsdException w:name="Table Grid" w:semiHidden="0" w:uiPriority="59" w:unhideWhenUsed="0"/>
+    <w:lsdException w:name="Placeholder Text" w:unhideWhenUsed="0"/>
+    <w:lsdException w:name="No Spacing" w:semiHidden="0" w:uiPriority="1" w:unhideWhenUsed="0" w:qFormat="1"/>
+    <w:lsdException w:name="Light Shading" w:semiHidden="0" w:uiPriority="60" w:unhideWhenUsed="0"/>
+    <w:lsdException w:name="Light List" w:semiHidden="0" w:uiPriority="61" w:unhideWhenUsed="0"/>
+    <w:lsdException w:name="Light Grid" w:semiHidden="0" w:uiPriority="62" w:unhideWhenUsed="0"/>
+    <w:lsdException w:name="Medium Shading 1" w:semiHidden="0" w:uiPriority="63" w:unhideWhenUsed="0"/>
+    <w:lsdException w:name="Medium Shading 2" w:semiHidden="0" w:uiPriority="64" w:unhideWhenUsed="0"/>
+    <w:lsdException w:name="Medium List 1" w:semiHidden="0" w:uiPriority="65" w:unhideWhenUsed="0"/>
+    <w:lsdException w:name="Medium List 2" w:semiHidden="0" w:uiPriority="66" w:unhideWhenUsed="0"/>
+    <w:lsdException w:name="Medium Grid 1" w:semiHidden="0" w:uiPriority="67" w:unhideWhenUsed="0"/>
+    <w:lsdException w:name="Medium Grid 2" w:semiHidden="0" w:uiPriority="68" w:unhideWhenUsed="0"/>
+    <w:lsdException w:name="Medium Grid 3" w:semiHidden="0" w:uiPriority="69" w:unhideWhenUsed="0"/>
+    <w:lsdException w:name="Dark List" w:semiHidden="0" w:uiPriority="70" w:unhideWhenUsed="0"/>
+    <w:lsdException w:name="Colorful Shading" w:semiHidden="0" w:uiPriority="71" w:unhideWhenUsed="0"/>
+    <w:lsdException w:name="Colorful List" w:semiHidden="0" w:uiPriority="72" w:unhideWhenUsed="0"/>
+    <w:lsdException w:name="Colorful Grid" w:semiHidden="0" w:uiPriority="73" w:unhideWhenUsed="0"/>
+    <w:lsdException w:name="Light Shading Accent 1" w:semiHidden="0" w:uiPriority="60" w:unhideWhenUsed="0"/>
+    <w:lsdException w:name="Light List Accent 1" w:semiHidden="0" w:uiPriority="61" w:unhideWhenUsed="0"/>
+    <w:lsdException w:name="Light Grid Accent 1" w:semiHidden="0" w:uiPriority="62" w:unhideWhenUsed="0"/>
+    <w:lsdException w:name="Medium Shading 1 Accent 1" w:semiHidden="0" w:uiPriority="63" w:unhideWhenUsed="0"/>
+    <w:lsdException w:name="Medium Shading 2 Accent 1" w:semiHidden="0" w:uiPriority="64" w:unhideWhenUsed="0"/>
+    <w:lsdException w:name="Medium List 1 Accent 1" w:semiHidden="0" w:uiPriority="65" w:unhideWhenUsed="0"/>
+    <w:lsdException w:name="Revision" w:unhideWhenUsed="0"/>
+    <w:lsdException w:name="List Paragraph" w:semiHidden="0" w:uiPriority="34" w:unhideWhenUsed="0" w:qFormat="1"/>
+    <w:lsdException w:name="Quote" w:semiHidden="0" w:uiPriority="29" w:unhideWhenUsed="0" w:qFormat="1"/>
+    <w:lsdException w:name="Intense Quote" w:semiHidden="0" w:uiPriority="30" w:unhideWhenUsed="0" w:qFormat="1"/>
+    <w:lsdException w:name="Medium List 2 Accent 1" w:semiHidden="0" w:uiPriority="66" w:unhideWhenUsed="0"/>
+    <w:lsdException w:name="Medium Grid 1 Accent 1" w:semiHidden="0" w:uiPriority="67" w:unhideWhenUsed="0"/>
+    <w:lsdException w:name="Medium Grid 2 Accent 1" w:semiHidden="0" w:uiPriority="68" w:unhideWhenUsed="0"/>
+    <w:lsdException w:name="Medium Grid 3 Accent 1" w:semiHidden="0" w:uiPriority="69" w:unhideWhenUsed="0"/>
+    <w:lsdException w:name="Dark List Accent 1" w:semiHidden="0" w:uiPriority="70" w:unhideWhenUsed="0"/>
+    <w:lsdException w:name="Colorful Shading Accent 1" w:semiHidden="0" w:uiPriority="71" w:unhideWhenUsed="0"/>
+    <w:lsdException w:name="Colorful List Accent 1" w:semiHidden="0" w:uiPriority="72" w:unhideWhenUsed="0"/>
+    <w:lsdException w:name="Colorful Grid Accent 1" w:semiHidden="0" w:uiPriority="73" w:unhideWhenUsed="0"/>
+    <w:lsdException w:name="Light Shading Accent 2" w:semiHidden="0" w:uiPriority="60" w:unhideWhenUsed="0"/>
+    <w:lsdException w:name="Light List Accent 2" w:semiHidden="0" w:uiPriority="61" w:unhideWhenUsed="0"/>
+    <w:lsdException w:name="Light Grid Accent 2" w:semiHidden="0" w:uiPriority="62" w:unhideWhenUsed="0"/>
+    <w:lsdException w:name="Medium Shading 1 Accent 2" w:semiHidden="0" w:uiPriority="63" w:unhideWhenUsed="0"/>
+    <w:lsdException w:name="Medium Shading 2 Accent 2" w:semiHidden="0" w:uiPriority="64" w:unhideWhenUsed="0"/>
+    <w:lsdException w:name="Medium List 1 Accent 2" w:semiHidden="0" w:uiPriority="65" w:unhideWhenUsed="0"/>
+    <w:lsdException w:name="Medium List 2 Accent 2" w:semiHidden="0" w:uiPriority="66" w:unhideWhenUsed="0"/>
+    <w:lsdException w:name="Medium Grid 1 Accent 2" w:semiHidden="0" w:uiPriority="67" w:unhideWhenUsed="0"/>
+    <w:lsdException w:name="Medium Grid 2 Accent 2" w:semiHidden="0" w:uiPriority="68" w:unhideWhenUsed="0"/>
+    <w:lsdException w:name="Medium Grid 3 Accent 2" w:semiHidden="0" w:uiPriority="69" w:unhideWhenUsed="0"/>
+    <w:lsdException w:name="Dark List Accent 2" w:semiHidden="0" w:uiPriority="70" w:unhideWhenUsed="0"/>
+    <w:lsdException w:name="Colorful Shading Accent 2" w:semiHidden="0" w:uiPriority="71" w:unhideWhenUsed="0"/>
+    <w:lsdException w:name="Colorful List Accent 2" w:semiHidden="0" w:uiPriority="72" w:unhideWhenUsed="0"/>
+    <w:lsdException w:name="Colorful Grid Accent 2" w:semiHidden="0" w:uiPriority="73" w:unhideWhenUsed="0"/>
+    <w:lsdException w:name="Light Shading Accent 3" w:semiHidden="0" w:uiPriority="60" w:unhideWhenUsed="0"/>
+    <w:lsdException w:name="Light List Accent 3" w:semiHidden="0" w:uiPriority="61" w:unhideWhenUsed="0"/>
+    <w:lsdException w:name="Light Grid Accent 3" w:semiHidden="0" w:uiPriority="62" w:unhideWhenUsed="0"/>
+    <w:lsdException w:name="Medium Shading 1 Accent 3" w:semiHidden="0" w:uiPriority="63" w:unhideWhenUsed="0"/>
+    <w:lsdException w:name="Medium Shading 2 Accent 3" w:semiHidden="0" w:uiPriority="64" w:unhideWhenUsed="0"/>
+    <w:lsdException w:name="Medium List 1 Accent 3" w:semiHidden="0" w:uiPriority="65" w:unhideWhenUsed="0"/>
+    <w:lsdException w:name="Medium List 2 Accent 3" w:semiHidden="0" w:uiPriority="66" w:unhideWhenUsed="0"/>
+    <w:lsdException w:name="Medium Grid 1 Accent 3" w:semiHidden="0" w:uiPriority="67" w:unhideWhenUsed="0"/>
+    <w:lsdException w:name="Medium Grid 2 Accent 3" w:semiHidden="0" w:uiPriority="68" w:unhideWhenUsed="0"/>
+    <w:lsdException w:name="Medium Grid 3 Accent 3" w:semiHidden="0" w:uiPriority="69" w:unhideWhenUsed="0"/>
+    <w:lsdException w:name="Dark List Accent 3" w:semiHidden="0" w:uiPriority="70" w:unhideWhenUsed="0"/>
+    <w:lsdException w:name="Colorful Shading Accent 3" w:semiHidden="0" w:uiPriority="71" w:unhideWhenUsed="0"/>
+    <w:lsdException w:name="Colorful List Accent 3" w:semiHidden="0" w:uiPriority="72" w:unhideWhenUsed="0"/>
+    <w:lsdException w:name="Colorful Grid Accent 3" w:semiHidden="0" w:uiPriority="73" w:unhideWhenUsed="0"/>
+    <w:lsdException w:name="Light Shading Accent 4" w:semiHidden="0" w:uiPriority="60" w:unhideWhenUsed="0"/>
+    <w:lsdException w:name="Light List Accent 4" w:semiHidden="0" w:uiPriority="61" w:unhideWhenUsed="0"/>
+    <w:lsdException w:name="Light Grid Accent 4" w:semiHidden="0" w:uiPriority="62" w:unhideWhenUsed="0"/>
+    <w:lsdException w:name="Medium Shading 1 Accent 4" w:semiHidden="0" w:uiPriority="63" w:unhideWhenUsed="0"/>
+    <w:lsdException w:name="Medium Shading 2 Accent 4" w:semiHidden="0" w:uiPriority="64" w:unhideWhenUsed="0"/>
+    <w:lsdException w:name="Medium List 1 Accent 4" w:semiHidden="0" w:uiPriority="65" w:unhideWhenUsed="0"/>
+    <w:lsdException w:name="Medium List 2 Accent 4" w:semiHidden="0" w:uiPriority="66" w:unhideWhenUsed="0"/>
+    <w:lsdException w:name="Medium Grid 1 Accent 4" w:semiHidden="0" w:uiPriority="67" w:unhideWhenUsed="0"/>
+    <w:lsdException w:name="Medium Grid 2 Accent 4" w:semiHidden="0" w:uiPriority="68" w:unhideWhenUsed="0"/>
+    <w:lsdException w:name="Medium Grid 3 Accent 4" w:semiHidden="0" w:uiPriority="69" w:unhideWhenUsed="0"/>
+    <w:lsdException w:name="Dark List Accent 4" w:semiHidden="0" w:uiPriority="70" w:unhideWhenUsed="0"/>
+    <w:lsdException w:name="Colorful Shading Accent 4" w:semiHidden="0" w:uiPriority="71" w:unhideWhenUsed="0"/>
+    <w:lsdException w:name="Colorful List Accent 4" w:semiHidden="0" w:uiPriority="72" w:unhideWhenUsed="0"/>
+    <w:lsdException w:name="Colorful Grid Accent 4" w:semiHidden="0" w:uiPriority="73" w:unhideWhenUsed="0"/>
+    <w:lsdException w:name="Light Shading Accent 5" w:semiHidden="0" w:uiPriority="60" w:unhideWhenUsed="0"/>
+    <w:lsdException w:name="Light List Accent 5" w:semiHidden="0" w:uiPriority="61" w:unhideWhenUsed="0"/>
+    <w:lsdException w:name="Light Grid Accent 5" w:semiHidden="0" w:uiPriority="62" w:unhideWhenUsed="0"/>
+    <w:lsdException w:name="Medium Shading 1 Accent 5" w:semiHidden="0" w:uiPriority="63" w:unhideWhenUsed="0"/>
+    <w:lsdException w:name="Medium Shading 2 Accent 5" w:semiHidden="0" w:uiPriority="64" w:unhideWhenUsed="0"/>
+    <w:lsdException w:name="Medium List 1 Accent 5" w:semiHidden="0" w:uiPriority="65" w:unhideWhenUsed="0"/>
+    <w:lsdException w:name="Medium List 2 Accent 5" w:semiHidden="0" w:uiPriority="66" w:unhideWhenUsed="0"/>
+    <w:lsdException w:name="Medium Grid 1 Accent 5" w:semiHidden="0" w:uiPriority="67" w:unhideWhenUsed="0"/>
+    <w:lsdException w:name="Medium Grid 2 Accent 5" w:semiHidden="0" w:uiPriority="68" w:unhideWhenUsed="0"/>
+    <w:lsdException w:name="Medium Grid 3 Accent 5" w:semiHidden="0" w:uiPriority="69" w:unhideWhenUsed="0"/>
+    <w:lsdException w:name="Dark List Accent 5" w:semiHidden="0" w:uiPriority="70" w:unhideWhenUsed="0"/>
+    <w:lsdException w:name="Colorful Shading Accent 5" w:semiHidden="0" w:uiPriority="71" w:unhideWhenUsed="0"/>
+    <w:lsdException w:name="Colorful List Accent 5" w:semiHidden="0" w:uiPriority="72" w:unhideWhenUsed="0"/>
+    <w:lsdException w:name="Colorful Grid Accent 5" w:semiHidden="0" w:uiPriority="73" w:unhideWhenUsed="0"/>
+    <w:lsdException w:name="Light Shading Accent 6" w:semiHidden="0" w:uiPriority="60" w:unhideWhenUsed="0"/>
+    <w:lsdException w:name="Light List Accent 6" w:semiHidden="0" w:uiPriority="61" w:unhideWhenUsed="0"/>
+    <w:lsdException w:name="Light Grid Accent 6" w:semiHidden="0" w:uiPriority="62" w:unhideWhenUsed="0"/>
+    <w:lsdException w:name="Medium Shading 1 Accent 6" w:semiHidden="0" w:uiPriority="63" w:unhideWhenUsed="0"/>
+    <w:lsdException w:name="Medium Shading 2 Accent 6" w:semiHidden="0" w:uiPriority="64" w:unhideWhenUsed="0"/>
+    <w:lsdException w:name="Medium List 1 Accent 6" w:semiHidden="0" w:uiPriority="65" w:unhideWhenUsed="0"/>
+    <w:lsdException w:name="Medium List 2 Accent 6" w:semiHidden="0" w:uiPriority="66" w:unhideWhenUsed="0"/>
+    <w:lsdException w:name="Medium Grid 1 Accent 6" w:semiHidden="0" w:uiPriority="67" w:unhideWhenUsed="0"/>
+    <w:lsdException w:name="Medium Grid 2 Accent 6" w:semiHidden="0" w:uiPriority="68" w:unhideWhenUsed="0"/>
+    <w:lsdException w:name="Medium Grid 3 Accent 6" w:semiHidden="0" w:uiPriority="69" w:unhideWhenUsed="0"/>
+    <w:lsdException w:name="Dark List Accent 6" w:semiHidden="0" w:uiPriority="70" w:unhideWhenUsed="0"/>
+    <w:lsdException w:name="Colorful Shading Accent 6" w:semiHidden="0" w:uiPriority="71" w:unhideWhenUsed="0"/>
+    <w:lsdException w:name="Colorful List Accent 6" w:semiHidden="0" w:uiPriority="72" w:unhideWhenUsed="0"/>
+    <w:lsdException w:name="Colorful Grid Accent 6" w:semiHidden="0" w:uiPriority="73" w:unhideWhenUsed="0"/>
+    <w:lsdException w:name="Subtle Emphasis" w:semiHidden="0" w:uiPriority="19" w:unhideWhenUsed="0" w:qFormat="1"/>
+    <w:lsdException w:name="Intense Emphasis" w:semiHidden="0" w:uiPriority="21" w:unhideWhenUsed="0" w:qFormat="1"/>
+    <w:lsdException w:name="Subtle Reference" w:semiHidden="0" w:uiPriority="31" w:unhideWhenUsed="0" w:qFormat="1"/>
+    <w:lsdException w:name="Intense Reference" w:semiHidden="0" w:uiPriority="32" w:unhideWhenUsed="0" w:qFormat="1"/>
+    <w:lsdException w:name="Book Title" w:semiHidden="0" w:uiPriority="33" w:unhideWhenUsed="0" w:qFormat="1"/>
+    <w:lsdException w:name="Bibliography" w:uiPriority="37"/>
+    <w:lsdException w:name="TOC Heading" w:uiPriority="39" w:qFormat="1"/>
+  </w:latentStyles>
+  <w:style w:type="paragraph" w:default="1" w:styleId="Normal">
+    <w:name w:val="Normal"/>
+    <w:qFormat/>
+  </w:style>
+  <w:style w:type="character" w:default="1" w:styleId="DefaultParagraphFont">
+    <w:name w:val="Default Paragraph Font"/>
+    <w:uiPriority w:val="1"/>
+    <w:semiHidden/>
+    <w:unhideWhenUsed/>
+  </w:style>
+  <w:style w:type="table" w:default="1" w:styleId="TableNormal">
+    <w:name w:val="Normal Table"/>
+    <w:uiPriority w:val="99"/>
+    <w:semiHidden/>
+    <w:unhideWhenUsed/>
+    <w:qFormat/>
+    <w:tblPr>
+      <w:tblInd w:w="0" w:type="dxa"/>
+      <w:tblCellMar>
+        <w:top w:w="0" w:type="dxa"/>
+        <w:left w:w="108" w:type="dxa"/>
+        <w:bottom w:w="0" w:type="dxa"/>
+        <w:right w:w="108" w:type="dxa"/>
+      </w:tblCellMar>
+    </w:tblPr>
+  </w:style>
+  <w:style w:type="numbering" w:default="1" w:styleId="NoList">
+    <w:name w:val="No List"/>
+    <w:uiPriority w:val="99"/>
+    <w:semiHidden/>
+    <w:unhideWhenUsed/>
+  </w:style>
+  <w:style w:type="paragraph" w:customStyle="1" w:styleId="2B299F69AD2D49139B7496AC7D61FA22">
+    <w:name w:val="2B299F69AD2D49139B7496AC7D61FA22"/>
+    <w:rsid w:val="00172828"/>
+  </w:style>
+  <w:style w:type="paragraph" w:customStyle="1" w:styleId="157C53CDB75F4223B2FC86BA07287C6E">
+    <w:name w:val="157C53CDB75F4223B2FC86BA07287C6E"/>
+    <w:rsid w:val="00172828"/>
+  </w:style>
+  <w:style w:type="paragraph" w:customStyle="1" w:styleId="2A44FB82D66742DEB81BAB5EFC412D80">
+    <w:name w:val="2A44FB82D66742DEB81BAB5EFC412D80"/>
+    <w:rsid w:val="00172828"/>
+  </w:style>
+  <w:style w:type="paragraph" w:customStyle="1" w:styleId="391734F7BAFE46FFB8E926F5F212E761">
+    <w:name w:val="391734F7BAFE46FFB8E926F5F212E761"/>
+    <w:rsid w:val="00172828"/>
+  </w:style>
+</w:styles>
+</file>
+
+<file path=word/glossary/webSettings.xml><?xml version="1.0" encoding="utf-8"?>
+<w:webSettings xmlns:r="http://schemas.openxmlformats.org/officeDocument/2006/relationships" xmlns:w="http://schemas.openxmlformats.org/wordprocessingml/2006/main">
+  <w:optimizeForBrowser/>
+</w:webSettings>
 </file>
 
 <file path=word/theme/theme1.xml><?xml version="1.0" encoding="utf-8"?>
 <a:theme xmlns:a="http://schemas.openxmlformats.org/drawingml/2006/main" name="Facet">
   <a:themeElements>
-    <a:clrScheme name="Green Yellow">
+    <a:clrScheme name="Aspect">
       <a:dk1>
         <a:sysClr val="windowText" lastClr="000000"/>
       </a:dk1>
@@ -5306,34 +6029,34 @@
         <a:sysClr val="window" lastClr="FFFFFF"/>
       </a:lt1>
       <a:dk2>
-        <a:srgbClr val="455F51"/>
+        <a:srgbClr val="323232"/>
       </a:dk2>
       <a:lt2>
-        <a:srgbClr val="E2DFCC"/>
+        <a:srgbClr val="E3DED1"/>
       </a:lt2>
       <a:accent1>
-        <a:srgbClr val="99CB38"/>
+        <a:srgbClr val="F07F09"/>
       </a:accent1>
       <a:accent2>
-        <a:srgbClr val="63A537"/>
+        <a:srgbClr val="9F2936"/>
       </a:accent2>
       <a:accent3>
-        <a:srgbClr val="37A76F"/>
+        <a:srgbClr val="1B587C"/>
       </a:accent3>
       <a:accent4>
-        <a:srgbClr val="44C1A3"/>
+        <a:srgbClr val="4E8542"/>
       </a:accent4>
       <a:accent5>
-        <a:srgbClr val="4EB3CF"/>
+        <a:srgbClr val="604878"/>
       </a:accent5>
       <a:accent6>
-        <a:srgbClr val="51C3F9"/>
+        <a:srgbClr val="C19859"/>
       </a:accent6>
       <a:hlink>
-        <a:srgbClr val="EE7B08"/>
+        <a:srgbClr val="6B9F25"/>
       </a:hlink>
       <a:folHlink>
-        <a:srgbClr val="977B2D"/>
+        <a:srgbClr val="B26B02"/>
       </a:folHlink>
     </a:clrScheme>
     <a:fontScheme name="Facet">
@@ -5546,7 +6269,7 @@
   <a:extraClrSchemeLst/>
   <a:extLst>
     <a:ext uri="{05A4C25C-085E-4340-85A3-A5531E510DB2}">
-      <thm15:themeFamily xmlns:thm15="http://schemas.microsoft.com/office/thememl/2012/main" xmlns="" name="Facet" id="{C0C680CD-088A-49FC-A102-D699147F32B2}" vid="{CFBC31BA-B70F-4F30-BCAA-4F3011E16C4D}"/>
+      <thm15:themeFamily xmlns="" xmlns:thm15="http://schemas.microsoft.com/office/thememl/2012/main" name="Facet" id="{C0C680CD-088A-49FC-A102-D699147F32B2}" vid="{CFBC31BA-B70F-4F30-BCAA-4F3011E16C4D}"/>
     </a:ext>
   </a:extLst>
 </a:theme>
@@ -5557,7 +6280,7 @@
 </file>
 
 <file path=customXml/itemProps1.xml><?xml version="1.0" encoding="utf-8"?>
-<ds:datastoreItem xmlns:ds="http://schemas.openxmlformats.org/officeDocument/2006/customXml" ds:itemID="{CD08274E-0A03-4094-BEFF-6D0BC8689C7D}">
+<ds:datastoreItem xmlns:ds="http://schemas.openxmlformats.org/officeDocument/2006/customXml" ds:itemID="{F646EC2B-815A-4AEB-A88F-5107B9EB2B35}">
   <ds:schemaRefs>
     <ds:schemaRef ds:uri="http://schemas.openxmlformats.org/officeDocument/2006/bibliography"/>
   </ds:schemaRefs>

</xml_diff>